<commit_message>
up to july 2
</commit_message>
<xml_diff>
--- a/EOD update daily.docx
+++ b/EOD update daily.docx
@@ -13123,13 +13123,7 @@
         <w:rPr>
           <w:rFonts w:eastAsia="Times New Roman"/>
         </w:rPr>
-        <w:t>Was on Leave</w:t>
-      </w:r>
-      <w:r>
-        <w:rPr>
-          <w:rFonts w:eastAsia="Times New Roman"/>
-        </w:rPr>
-        <w:t xml:space="preserve"> </w:t>
+        <w:t xml:space="preserve">Was on Leave </w:t>
       </w:r>
     </w:p>
     <w:p>
@@ -13233,6 +13227,498 @@
       </w:pPr>
       <w:r>
         <w:t>Code pushed. Senior review needed.</w:t>
+      </w:r>
+    </w:p>
+    <w:p>
+      <w:pPr>
+        <w:rPr>
+          <w:b/>
+          <w:bCs/>
+        </w:rPr>
+      </w:pPr>
+      <w:r>
+        <w:rPr>
+          <w:b/>
+          <w:bCs/>
+        </w:rPr>
+        <w:t>Webbing Plex</w:t>
+      </w:r>
+      <w:r>
+        <w:rPr>
+          <w:b/>
+          <w:bCs/>
+        </w:rPr>
+        <w:t>:</w:t>
+      </w:r>
+    </w:p>
+    <w:p>
+      <w:pPr>
+        <w:pStyle w:val="ListParagraph"/>
+        <w:numPr>
+          <w:ilvl w:val="0"/>
+          <w:numId w:val="84"/>
+        </w:numPr>
+      </w:pPr>
+      <w:r>
+        <w:t>Responsiveness checks and code structure review and plan</w:t>
+      </w:r>
+    </w:p>
+    <w:p>
+      <w:r>
+        <w:br w:type="page"/>
+      </w:r>
+    </w:p>
+    <w:p>
+      <w:pPr>
+        <w:pStyle w:val="Heading1"/>
+      </w:pPr>
+      <w:r>
+        <w:rPr>
+          <w:highlight w:val="yellow"/>
+        </w:rPr>
+        <w:lastRenderedPageBreak/>
+        <w:t xml:space="preserve">June 26 2026 Friday Login: 9:02 AM </w:t>
+      </w:r>
+      <w:proofErr w:type="gramStart"/>
+      <w:r>
+        <w:rPr>
+          <w:highlight w:val="yellow"/>
+        </w:rPr>
+        <w:t>Logout:</w:t>
+      </w:r>
+      <w:r>
+        <w:t>5:00</w:t>
+      </w:r>
+      <w:proofErr w:type="gramEnd"/>
+      <w:r>
+        <w:t xml:space="preserve"> PM</w:t>
+      </w:r>
+    </w:p>
+    <w:p>
+      <w:pPr>
+        <w:rPr>
+          <w:b/>
+          <w:bCs/>
+        </w:rPr>
+      </w:pPr>
+      <w:r>
+        <w:rPr>
+          <w:b/>
+          <w:bCs/>
+        </w:rPr>
+        <w:t>Mac store:</w:t>
+      </w:r>
+    </w:p>
+    <w:p>
+      <w:pPr>
+        <w:pStyle w:val="ListParagraph"/>
+        <w:numPr>
+          <w:ilvl w:val="0"/>
+          <w:numId w:val="84"/>
+        </w:numPr>
+      </w:pPr>
+      <w:r>
+        <w:t xml:space="preserve">Refactored some parts of the navigation. </w:t>
+      </w:r>
+    </w:p>
+    <w:p>
+      <w:pPr>
+        <w:pStyle w:val="ListParagraph"/>
+        <w:numPr>
+          <w:ilvl w:val="0"/>
+          <w:numId w:val="84"/>
+        </w:numPr>
+      </w:pPr>
+      <w:r>
+        <w:t xml:space="preserve">Identified the </w:t>
+      </w:r>
+      <w:r>
+        <w:rPr>
+          <w:b/>
+          <w:bCs/>
+        </w:rPr>
+        <w:t>New Arrival</w:t>
+      </w:r>
+      <w:r>
+        <w:t xml:space="preserve"> section in the codebase. </w:t>
+      </w:r>
+    </w:p>
+    <w:p>
+      <w:pPr>
+        <w:pStyle w:val="ListParagraph"/>
+        <w:numPr>
+          <w:ilvl w:val="0"/>
+          <w:numId w:val="84"/>
+        </w:numPr>
+      </w:pPr>
+      <w:r>
+        <w:t xml:space="preserve">Tested the API for the </w:t>
+      </w:r>
+      <w:r>
+        <w:rPr>
+          <w:b/>
+          <w:bCs/>
+        </w:rPr>
+        <w:t>New Arrival</w:t>
+      </w:r>
+      <w:r>
+        <w:t xml:space="preserve"> section. The API is returning data that differs from the admin panel, so this needs to be discussed with the senior developer. </w:t>
+      </w:r>
+    </w:p>
+    <w:p>
+      <w:pPr>
+        <w:pStyle w:val="ListParagraph"/>
+        <w:numPr>
+          <w:ilvl w:val="0"/>
+          <w:numId w:val="84"/>
+        </w:numPr>
+      </w:pPr>
+      <w:r>
+        <w:t xml:space="preserve">Explained the category fetch flow to the founder. </w:t>
+      </w:r>
+    </w:p>
+    <w:p>
+      <w:pPr>
+        <w:pStyle w:val="ListParagraph"/>
+        <w:numPr>
+          <w:ilvl w:val="0"/>
+          <w:numId w:val="84"/>
+        </w:numPr>
+      </w:pPr>
+      <w:r>
+        <w:t xml:space="preserve">Listed the issues and pending updates after verification </w:t>
+      </w:r>
+      <w:r>
+        <w:t>This</w:t>
+      </w:r>
+      <w:r>
+        <w:t xml:space="preserve"> will be addressed with the senior developer.</w:t>
+      </w:r>
+    </w:p>
+    <w:p>
+      <w:r>
+        <w:t xml:space="preserve">Identify some issue in </w:t>
+      </w:r>
+      <w:proofErr w:type="spellStart"/>
+      <w:r>
+        <w:t>webbingPlex</w:t>
+      </w:r>
+      <w:proofErr w:type="spellEnd"/>
+      <w:r>
+        <w:t xml:space="preserve"> that is listed out.</w:t>
+      </w:r>
+    </w:p>
+    <w:p>
+      <w:r>
+        <w:br w:type="page"/>
+      </w:r>
+    </w:p>
+    <w:p>
+      <w:pPr>
+        <w:pStyle w:val="Heading1"/>
+      </w:pPr>
+      <w:r>
+        <w:rPr>
+          <w:highlight w:val="yellow"/>
+        </w:rPr>
+        <w:lastRenderedPageBreak/>
+        <w:t>June 2</w:t>
+      </w:r>
+      <w:r>
+        <w:rPr>
+          <w:highlight w:val="yellow"/>
+        </w:rPr>
+        <w:t>8, 29, 30</w:t>
+      </w:r>
+      <w:r>
+        <w:rPr>
+          <w:highlight w:val="yellow"/>
+        </w:rPr>
+        <w:t xml:space="preserve"> </w:t>
+      </w:r>
+      <w:proofErr w:type="gramStart"/>
+      <w:r>
+        <w:rPr>
+          <w:highlight w:val="yellow"/>
+        </w:rPr>
+        <w:t>2026  (</w:t>
+      </w:r>
+      <w:proofErr w:type="gramEnd"/>
+      <w:r>
+        <w:rPr>
+          <w:highlight w:val="yellow"/>
+        </w:rPr>
+        <w:t>Sun Mon Tue) : was on leave</w:t>
+      </w:r>
+    </w:p>
+    <w:p/>
+    <w:p>
+      <w:r>
+        <w:br w:type="page"/>
+      </w:r>
+    </w:p>
+    <w:p>
+      <w:pPr>
+        <w:pStyle w:val="Heading1"/>
+      </w:pPr>
+      <w:r>
+        <w:rPr>
+          <w:highlight w:val="yellow"/>
+        </w:rPr>
+        <w:lastRenderedPageBreak/>
+        <w:t>Ju</w:t>
+      </w:r>
+      <w:r>
+        <w:rPr>
+          <w:highlight w:val="yellow"/>
+        </w:rPr>
+        <w:t>ly</w:t>
+      </w:r>
+      <w:r>
+        <w:rPr>
+          <w:highlight w:val="yellow"/>
+        </w:rPr>
+        <w:t xml:space="preserve"> </w:t>
+      </w:r>
+      <w:r>
+        <w:rPr>
+          <w:highlight w:val="yellow"/>
+        </w:rPr>
+        <w:t>01</w:t>
+      </w:r>
+      <w:r>
+        <w:rPr>
+          <w:highlight w:val="yellow"/>
+        </w:rPr>
+        <w:t xml:space="preserve"> 2026 </w:t>
+      </w:r>
+      <w:r>
+        <w:rPr>
+          <w:highlight w:val="yellow"/>
+        </w:rPr>
+        <w:t>Wednesday</w:t>
+      </w:r>
+      <w:r>
+        <w:rPr>
+          <w:highlight w:val="yellow"/>
+        </w:rPr>
+        <w:t xml:space="preserve"> Login: 9:</w:t>
+      </w:r>
+      <w:r>
+        <w:rPr>
+          <w:highlight w:val="yellow"/>
+        </w:rPr>
+        <w:t>23</w:t>
+      </w:r>
+      <w:r>
+        <w:rPr>
+          <w:highlight w:val="yellow"/>
+        </w:rPr>
+        <w:t xml:space="preserve"> AM </w:t>
+      </w:r>
+      <w:proofErr w:type="gramStart"/>
+      <w:r>
+        <w:rPr>
+          <w:highlight w:val="yellow"/>
+        </w:rPr>
+        <w:t>Logout:5:00</w:t>
+      </w:r>
+      <w:proofErr w:type="gramEnd"/>
+      <w:r>
+        <w:rPr>
+          <w:highlight w:val="yellow"/>
+        </w:rPr>
+        <w:t xml:space="preserve"> PM</w:t>
+      </w:r>
+    </w:p>
+    <w:p/>
+    <w:p>
+      <w:pPr>
+        <w:pStyle w:val="ListParagraph"/>
+        <w:numPr>
+          <w:ilvl w:val="0"/>
+          <w:numId w:val="84"/>
+        </w:numPr>
+      </w:pPr>
+      <w:r>
+        <w:t xml:space="preserve">Explained the category/collection navigation fixes and product listing changes, then pushed the code and got it merged into the main branch. </w:t>
+      </w:r>
+    </w:p>
+    <w:p>
+      <w:pPr>
+        <w:pStyle w:val="ListParagraph"/>
+        <w:numPr>
+          <w:ilvl w:val="0"/>
+          <w:numId w:val="84"/>
+        </w:numPr>
+      </w:pPr>
+      <w:r>
+        <w:t xml:space="preserve">Updated him on all codebase changes and development progress that happened during his one-week leave. </w:t>
+      </w:r>
+    </w:p>
+    <w:p>
+      <w:pPr>
+        <w:pStyle w:val="ListParagraph"/>
+        <w:numPr>
+          <w:ilvl w:val="0"/>
+          <w:numId w:val="84"/>
+        </w:numPr>
+      </w:pPr>
+      <w:r>
+        <w:t xml:space="preserve">Discussed the overall codebase, current system behavior, working and pending areas, and aligned on tomorrow's priorities. </w:t>
+      </w:r>
+    </w:p>
+    <w:p>
+      <w:pPr>
+        <w:pStyle w:val="ListParagraph"/>
+        <w:numPr>
+          <w:ilvl w:val="0"/>
+          <w:numId w:val="84"/>
+        </w:numPr>
+      </w:pPr>
+      <w:r>
+        <w:t xml:space="preserve">Had an initial discussion with the </w:t>
+      </w:r>
+      <w:r>
+        <w:t>senior</w:t>
+      </w:r>
+      <w:r>
+        <w:t xml:space="preserve"> regarding</w:t>
+      </w:r>
+      <w:r>
+        <w:t xml:space="preserve"> what is meta with developer</w:t>
+      </w:r>
+      <w:r>
+        <w:t xml:space="preserve"> and </w:t>
+      </w:r>
+      <w:r>
+        <w:t>study about it</w:t>
+      </w:r>
+      <w:r>
+        <w:t>.</w:t>
+      </w:r>
+    </w:p>
+    <w:p>
+      <w:pPr>
+        <w:pStyle w:val="ListParagraph"/>
+        <w:numPr>
+          <w:ilvl w:val="0"/>
+          <w:numId w:val="84"/>
+        </w:numPr>
+      </w:pPr>
+      <w:r>
+        <w:t>Show him the frontend of webbing plex and pages that got designed</w:t>
+      </w:r>
+      <w:r>
+        <w:t xml:space="preserve"> and the flow.</w:t>
+      </w:r>
+    </w:p>
+    <w:p>
+      <w:pPr>
+        <w:pStyle w:val="ListParagraph"/>
+        <w:numPr>
+          <w:ilvl w:val="0"/>
+          <w:numId w:val="84"/>
+        </w:numPr>
+      </w:pPr>
+      <w:r>
+        <w:t xml:space="preserve">Transfer the ownership of the project </w:t>
+      </w:r>
+      <w:proofErr w:type="spellStart"/>
+      <w:r>
+        <w:t>webbingplex</w:t>
+      </w:r>
+      <w:proofErr w:type="spellEnd"/>
+    </w:p>
+    <w:p>
+      <w:r>
+        <w:br w:type="page"/>
+      </w:r>
+    </w:p>
+    <w:p>
+      <w:pPr>
+        <w:pStyle w:val="Heading1"/>
+      </w:pPr>
+      <w:r>
+        <w:rPr>
+          <w:highlight w:val="yellow"/>
+        </w:rPr>
+        <w:lastRenderedPageBreak/>
+        <w:t>July 26 2026 Thursday Login: 9:29 AM Logout:</w:t>
+      </w:r>
+      <w:r>
+        <w:t xml:space="preserve"> </w:t>
+      </w:r>
+    </w:p>
+    <w:p>
+      <w:pPr>
+        <w:pStyle w:val="ListParagraph"/>
+        <w:numPr>
+          <w:ilvl w:val="0"/>
+          <w:numId w:val="84"/>
+        </w:numPr>
+      </w:pPr>
+      <w:r>
+        <w:t>Verified the admin panel new arrivals functionality after manual test.</w:t>
+      </w:r>
+    </w:p>
+    <w:p>
+      <w:pPr>
+        <w:pStyle w:val="ListParagraph"/>
+        <w:numPr>
+          <w:ilvl w:val="0"/>
+          <w:numId w:val="84"/>
+        </w:numPr>
+      </w:pPr>
+      <w:r>
+        <w:t xml:space="preserve">Analyzed the new arrival section and identified responsiveness and UI issues. Completed the basic fixes; the code will be pushed after the review. </w:t>
+      </w:r>
+    </w:p>
+    <w:p>
+      <w:pPr>
+        <w:pStyle w:val="ListParagraph"/>
+        <w:numPr>
+          <w:ilvl w:val="0"/>
+          <w:numId w:val="84"/>
+        </w:numPr>
+      </w:pPr>
+      <w:r>
+        <w:t xml:space="preserve">Set up PHP for the senior, completed the configuration, and pushed the builds. This took a significant amount of time due to configuration errors that required troubleshooting. </w:t>
+      </w:r>
+    </w:p>
+    <w:p>
+      <w:pPr>
+        <w:pStyle w:val="ListParagraph"/>
+        <w:numPr>
+          <w:ilvl w:val="0"/>
+          <w:numId w:val="84"/>
+        </w:numPr>
+      </w:pPr>
+      <w:r>
+        <w:t>Had discussions with the senior regarding ongoing tasks and implementation details</w:t>
+      </w:r>
+      <w:r>
+        <w:t xml:space="preserve"> of mac.</w:t>
+      </w:r>
+    </w:p>
+    <w:p>
+      <w:pPr>
+        <w:pStyle w:val="ListParagraph"/>
+        <w:numPr>
+          <w:ilvl w:val="0"/>
+          <w:numId w:val="84"/>
+        </w:numPr>
+      </w:pPr>
+      <w:r>
+        <w:t xml:space="preserve">Clone the repo of </w:t>
+      </w:r>
+      <w:proofErr w:type="spellStart"/>
+      <w:r>
+        <w:t>mayau</w:t>
+      </w:r>
+      <w:proofErr w:type="spellEnd"/>
+      <w:r>
+        <w:t xml:space="preserve"> tech for tomorrow priority </w:t>
       </w:r>
     </w:p>
     <w:sectPr>
@@ -17687,6 +18173,119 @@
     </w:lvl>
   </w:abstractNum>
   <w:abstractNum w:abstractNumId="31" w15:restartNumberingAfterBreak="0">
+    <w:nsid w:val="31B76C7C"/>
+    <w:multiLevelType w:val="hybridMultilevel"/>
+    <w:tmpl w:val="533CBDFC"/>
+    <w:lvl w:ilvl="0" w:tplc="04090001">
+      <w:start w:val="1"/>
+      <w:numFmt w:val="bullet"/>
+      <w:lvlText w:val=""/>
+      <w:lvlJc w:val="left"/>
+      <w:pPr>
+        <w:ind w:left="720" w:hanging="360"/>
+      </w:pPr>
+      <w:rPr>
+        <w:rFonts w:ascii="Symbol" w:hAnsi="Symbol" w:hint="default"/>
+      </w:rPr>
+    </w:lvl>
+    <w:lvl w:ilvl="1" w:tplc="04090003" w:tentative="1">
+      <w:start w:val="1"/>
+      <w:numFmt w:val="bullet"/>
+      <w:lvlText w:val="o"/>
+      <w:lvlJc w:val="left"/>
+      <w:pPr>
+        <w:ind w:left="1440" w:hanging="360"/>
+      </w:pPr>
+      <w:rPr>
+        <w:rFonts w:ascii="Courier New" w:hAnsi="Courier New" w:cs="Courier New" w:hint="default"/>
+      </w:rPr>
+    </w:lvl>
+    <w:lvl w:ilvl="2" w:tplc="04090005" w:tentative="1">
+      <w:start w:val="1"/>
+      <w:numFmt w:val="bullet"/>
+      <w:lvlText w:val=""/>
+      <w:lvlJc w:val="left"/>
+      <w:pPr>
+        <w:ind w:left="2160" w:hanging="360"/>
+      </w:pPr>
+      <w:rPr>
+        <w:rFonts w:ascii="Wingdings" w:hAnsi="Wingdings" w:hint="default"/>
+      </w:rPr>
+    </w:lvl>
+    <w:lvl w:ilvl="3" w:tplc="04090001" w:tentative="1">
+      <w:start w:val="1"/>
+      <w:numFmt w:val="bullet"/>
+      <w:lvlText w:val=""/>
+      <w:lvlJc w:val="left"/>
+      <w:pPr>
+        <w:ind w:left="2880" w:hanging="360"/>
+      </w:pPr>
+      <w:rPr>
+        <w:rFonts w:ascii="Symbol" w:hAnsi="Symbol" w:hint="default"/>
+      </w:rPr>
+    </w:lvl>
+    <w:lvl w:ilvl="4" w:tplc="04090003" w:tentative="1">
+      <w:start w:val="1"/>
+      <w:numFmt w:val="bullet"/>
+      <w:lvlText w:val="o"/>
+      <w:lvlJc w:val="left"/>
+      <w:pPr>
+        <w:ind w:left="3600" w:hanging="360"/>
+      </w:pPr>
+      <w:rPr>
+        <w:rFonts w:ascii="Courier New" w:hAnsi="Courier New" w:cs="Courier New" w:hint="default"/>
+      </w:rPr>
+    </w:lvl>
+    <w:lvl w:ilvl="5" w:tplc="04090005" w:tentative="1">
+      <w:start w:val="1"/>
+      <w:numFmt w:val="bullet"/>
+      <w:lvlText w:val=""/>
+      <w:lvlJc w:val="left"/>
+      <w:pPr>
+        <w:ind w:left="4320" w:hanging="360"/>
+      </w:pPr>
+      <w:rPr>
+        <w:rFonts w:ascii="Wingdings" w:hAnsi="Wingdings" w:hint="default"/>
+      </w:rPr>
+    </w:lvl>
+    <w:lvl w:ilvl="6" w:tplc="04090001" w:tentative="1">
+      <w:start w:val="1"/>
+      <w:numFmt w:val="bullet"/>
+      <w:lvlText w:val=""/>
+      <w:lvlJc w:val="left"/>
+      <w:pPr>
+        <w:ind w:left="5040" w:hanging="360"/>
+      </w:pPr>
+      <w:rPr>
+        <w:rFonts w:ascii="Symbol" w:hAnsi="Symbol" w:hint="default"/>
+      </w:rPr>
+    </w:lvl>
+    <w:lvl w:ilvl="7" w:tplc="04090003" w:tentative="1">
+      <w:start w:val="1"/>
+      <w:numFmt w:val="bullet"/>
+      <w:lvlText w:val="o"/>
+      <w:lvlJc w:val="left"/>
+      <w:pPr>
+        <w:ind w:left="5760" w:hanging="360"/>
+      </w:pPr>
+      <w:rPr>
+        <w:rFonts w:ascii="Courier New" w:hAnsi="Courier New" w:cs="Courier New" w:hint="default"/>
+      </w:rPr>
+    </w:lvl>
+    <w:lvl w:ilvl="8" w:tplc="04090005" w:tentative="1">
+      <w:start w:val="1"/>
+      <w:numFmt w:val="bullet"/>
+      <w:lvlText w:val=""/>
+      <w:lvlJc w:val="left"/>
+      <w:pPr>
+        <w:ind w:left="6480" w:hanging="360"/>
+      </w:pPr>
+      <w:rPr>
+        <w:rFonts w:ascii="Wingdings" w:hAnsi="Wingdings" w:hint="default"/>
+      </w:rPr>
+    </w:lvl>
+  </w:abstractNum>
+  <w:abstractNum w:abstractNumId="32" w15:restartNumberingAfterBreak="0">
     <w:nsid w:val="329A797C"/>
     <w:multiLevelType w:val="multilevel"/>
     <w:tmpl w:val="DA8EF3C0"/>
@@ -17835,7 +18434,7 @@
       </w:rPr>
     </w:lvl>
   </w:abstractNum>
-  <w:abstractNum w:abstractNumId="32" w15:restartNumberingAfterBreak="0">
+  <w:abstractNum w:abstractNumId="33" w15:restartNumberingAfterBreak="0">
     <w:nsid w:val="33FB5ACC"/>
     <w:multiLevelType w:val="multilevel"/>
     <w:tmpl w:val="1770922E"/>
@@ -17984,7 +18583,7 @@
       </w:rPr>
     </w:lvl>
   </w:abstractNum>
-  <w:abstractNum w:abstractNumId="33" w15:restartNumberingAfterBreak="0">
+  <w:abstractNum w:abstractNumId="34" w15:restartNumberingAfterBreak="0">
     <w:nsid w:val="34B53B68"/>
     <w:multiLevelType w:val="multilevel"/>
     <w:tmpl w:val="75F4A9D8"/>
@@ -18133,7 +18732,7 @@
       </w:rPr>
     </w:lvl>
   </w:abstractNum>
-  <w:abstractNum w:abstractNumId="34" w15:restartNumberingAfterBreak="0">
+  <w:abstractNum w:abstractNumId="35" w15:restartNumberingAfterBreak="0">
     <w:nsid w:val="35082C2D"/>
     <w:multiLevelType w:val="multilevel"/>
     <w:tmpl w:val="00C280E4"/>
@@ -18282,7 +18881,7 @@
       </w:rPr>
     </w:lvl>
   </w:abstractNum>
-  <w:abstractNum w:abstractNumId="35" w15:restartNumberingAfterBreak="0">
+  <w:abstractNum w:abstractNumId="36" w15:restartNumberingAfterBreak="0">
     <w:nsid w:val="351A58D3"/>
     <w:multiLevelType w:val="multilevel"/>
     <w:tmpl w:val="DDA83992"/>
@@ -18431,7 +19030,7 @@
       </w:rPr>
     </w:lvl>
   </w:abstractNum>
-  <w:abstractNum w:abstractNumId="36" w15:restartNumberingAfterBreak="0">
+  <w:abstractNum w:abstractNumId="37" w15:restartNumberingAfterBreak="0">
     <w:nsid w:val="3780706F"/>
     <w:multiLevelType w:val="multilevel"/>
     <w:tmpl w:val="381CDEA8"/>
@@ -18580,7 +19179,7 @@
       </w:rPr>
     </w:lvl>
   </w:abstractNum>
-  <w:abstractNum w:abstractNumId="37" w15:restartNumberingAfterBreak="0">
+  <w:abstractNum w:abstractNumId="38" w15:restartNumberingAfterBreak="0">
     <w:nsid w:val="38F414DA"/>
     <w:multiLevelType w:val="multilevel"/>
     <w:tmpl w:val="2DEAE2BC"/>
@@ -18729,7 +19328,7 @@
       </w:rPr>
     </w:lvl>
   </w:abstractNum>
-  <w:abstractNum w:abstractNumId="38" w15:restartNumberingAfterBreak="0">
+  <w:abstractNum w:abstractNumId="39" w15:restartNumberingAfterBreak="0">
     <w:nsid w:val="392457FE"/>
     <w:multiLevelType w:val="multilevel"/>
     <w:tmpl w:val="DB469F6C"/>
@@ -18878,7 +19477,7 @@
       </w:rPr>
     </w:lvl>
   </w:abstractNum>
-  <w:abstractNum w:abstractNumId="39" w15:restartNumberingAfterBreak="0">
+  <w:abstractNum w:abstractNumId="40" w15:restartNumberingAfterBreak="0">
     <w:nsid w:val="3A923EFF"/>
     <w:multiLevelType w:val="multilevel"/>
     <w:tmpl w:val="F4004242"/>
@@ -19027,7 +19626,7 @@
       </w:rPr>
     </w:lvl>
   </w:abstractNum>
-  <w:abstractNum w:abstractNumId="40" w15:restartNumberingAfterBreak="0">
+  <w:abstractNum w:abstractNumId="41" w15:restartNumberingAfterBreak="0">
     <w:nsid w:val="40460948"/>
     <w:multiLevelType w:val="multilevel"/>
     <w:tmpl w:val="62C49374"/>
@@ -19176,7 +19775,7 @@
       </w:rPr>
     </w:lvl>
   </w:abstractNum>
-  <w:abstractNum w:abstractNumId="41" w15:restartNumberingAfterBreak="0">
+  <w:abstractNum w:abstractNumId="42" w15:restartNumberingAfterBreak="0">
     <w:nsid w:val="413E1D27"/>
     <w:multiLevelType w:val="hybridMultilevel"/>
     <w:tmpl w:val="4F060846"/>
@@ -19289,7 +19888,7 @@
       </w:rPr>
     </w:lvl>
   </w:abstractNum>
-  <w:abstractNum w:abstractNumId="42" w15:restartNumberingAfterBreak="0">
+  <w:abstractNum w:abstractNumId="43" w15:restartNumberingAfterBreak="0">
     <w:nsid w:val="421C74CE"/>
     <w:multiLevelType w:val="multilevel"/>
     <w:tmpl w:val="A6045D7E"/>
@@ -19438,7 +20037,7 @@
       </w:rPr>
     </w:lvl>
   </w:abstractNum>
-  <w:abstractNum w:abstractNumId="43" w15:restartNumberingAfterBreak="0">
+  <w:abstractNum w:abstractNumId="44" w15:restartNumberingAfterBreak="0">
     <w:nsid w:val="42696F10"/>
     <w:multiLevelType w:val="multilevel"/>
     <w:tmpl w:val="27506A40"/>
@@ -19587,7 +20186,7 @@
       </w:rPr>
     </w:lvl>
   </w:abstractNum>
-  <w:abstractNum w:abstractNumId="44" w15:restartNumberingAfterBreak="0">
+  <w:abstractNum w:abstractNumId="45" w15:restartNumberingAfterBreak="0">
     <w:nsid w:val="42AB5966"/>
     <w:multiLevelType w:val="multilevel"/>
     <w:tmpl w:val="CE088554"/>
@@ -19736,7 +20335,7 @@
       </w:rPr>
     </w:lvl>
   </w:abstractNum>
-  <w:abstractNum w:abstractNumId="45" w15:restartNumberingAfterBreak="0">
+  <w:abstractNum w:abstractNumId="46" w15:restartNumberingAfterBreak="0">
     <w:nsid w:val="4529096C"/>
     <w:multiLevelType w:val="hybridMultilevel"/>
     <w:tmpl w:val="FFF85C74"/>
@@ -19848,7 +20447,7 @@
       </w:rPr>
     </w:lvl>
   </w:abstractNum>
-  <w:abstractNum w:abstractNumId="46" w15:restartNumberingAfterBreak="0">
+  <w:abstractNum w:abstractNumId="47" w15:restartNumberingAfterBreak="0">
     <w:nsid w:val="46236874"/>
     <w:multiLevelType w:val="hybridMultilevel"/>
     <w:tmpl w:val="CF56BA42"/>
@@ -19961,7 +20560,7 @@
       </w:rPr>
     </w:lvl>
   </w:abstractNum>
-  <w:abstractNum w:abstractNumId="47" w15:restartNumberingAfterBreak="0">
+  <w:abstractNum w:abstractNumId="48" w15:restartNumberingAfterBreak="0">
     <w:nsid w:val="470C52B7"/>
     <w:multiLevelType w:val="multilevel"/>
     <w:tmpl w:val="DDBACCE6"/>
@@ -20110,7 +20709,7 @@
       </w:rPr>
     </w:lvl>
   </w:abstractNum>
-  <w:abstractNum w:abstractNumId="48" w15:restartNumberingAfterBreak="0">
+  <w:abstractNum w:abstractNumId="49" w15:restartNumberingAfterBreak="0">
     <w:nsid w:val="471B09B3"/>
     <w:multiLevelType w:val="multilevel"/>
     <w:tmpl w:val="A1B2CB16"/>
@@ -20259,7 +20858,7 @@
       </w:rPr>
     </w:lvl>
   </w:abstractNum>
-  <w:abstractNum w:abstractNumId="49" w15:restartNumberingAfterBreak="0">
+  <w:abstractNum w:abstractNumId="50" w15:restartNumberingAfterBreak="0">
     <w:nsid w:val="486B038C"/>
     <w:multiLevelType w:val="hybridMultilevel"/>
     <w:tmpl w:val="8C4A79DA"/>
@@ -20372,7 +20971,7 @@
       </w:rPr>
     </w:lvl>
   </w:abstractNum>
-  <w:abstractNum w:abstractNumId="50" w15:restartNumberingAfterBreak="0">
+  <w:abstractNum w:abstractNumId="51" w15:restartNumberingAfterBreak="0">
     <w:nsid w:val="4888582A"/>
     <w:multiLevelType w:val="multilevel"/>
     <w:tmpl w:val="2A22B8AA"/>
@@ -20521,7 +21120,7 @@
       </w:rPr>
     </w:lvl>
   </w:abstractNum>
-  <w:abstractNum w:abstractNumId="51" w15:restartNumberingAfterBreak="0">
+  <w:abstractNum w:abstractNumId="52" w15:restartNumberingAfterBreak="0">
     <w:nsid w:val="48E0701C"/>
     <w:multiLevelType w:val="multilevel"/>
     <w:tmpl w:val="4FB6510C"/>
@@ -20670,7 +21269,7 @@
       </w:rPr>
     </w:lvl>
   </w:abstractNum>
-  <w:abstractNum w:abstractNumId="52" w15:restartNumberingAfterBreak="0">
+  <w:abstractNum w:abstractNumId="53" w15:restartNumberingAfterBreak="0">
     <w:nsid w:val="4A8D35E4"/>
     <w:multiLevelType w:val="hybridMultilevel"/>
     <w:tmpl w:val="35A2089C"/>
@@ -20783,7 +21382,7 @@
       </w:rPr>
     </w:lvl>
   </w:abstractNum>
-  <w:abstractNum w:abstractNumId="53" w15:restartNumberingAfterBreak="0">
+  <w:abstractNum w:abstractNumId="54" w15:restartNumberingAfterBreak="0">
     <w:nsid w:val="4B8865D9"/>
     <w:multiLevelType w:val="multilevel"/>
     <w:tmpl w:val="238E69C6"/>
@@ -20932,7 +21531,7 @@
       </w:rPr>
     </w:lvl>
   </w:abstractNum>
-  <w:abstractNum w:abstractNumId="54" w15:restartNumberingAfterBreak="0">
+  <w:abstractNum w:abstractNumId="55" w15:restartNumberingAfterBreak="0">
     <w:nsid w:val="4D161459"/>
     <w:multiLevelType w:val="multilevel"/>
     <w:tmpl w:val="C10436FE"/>
@@ -21081,7 +21680,7 @@
       </w:rPr>
     </w:lvl>
   </w:abstractNum>
-  <w:abstractNum w:abstractNumId="55" w15:restartNumberingAfterBreak="0">
+  <w:abstractNum w:abstractNumId="56" w15:restartNumberingAfterBreak="0">
     <w:nsid w:val="4DA44DE1"/>
     <w:multiLevelType w:val="multilevel"/>
     <w:tmpl w:val="EA649872"/>
@@ -21230,7 +21829,7 @@
       </w:rPr>
     </w:lvl>
   </w:abstractNum>
-  <w:abstractNum w:abstractNumId="56" w15:restartNumberingAfterBreak="0">
+  <w:abstractNum w:abstractNumId="57" w15:restartNumberingAfterBreak="0">
     <w:nsid w:val="507F6DDB"/>
     <w:multiLevelType w:val="multilevel"/>
     <w:tmpl w:val="644671D8"/>
@@ -21379,7 +21978,7 @@
       </w:rPr>
     </w:lvl>
   </w:abstractNum>
-  <w:abstractNum w:abstractNumId="57" w15:restartNumberingAfterBreak="0">
+  <w:abstractNum w:abstractNumId="58" w15:restartNumberingAfterBreak="0">
     <w:nsid w:val="5232184E"/>
     <w:multiLevelType w:val="multilevel"/>
     <w:tmpl w:val="16B80DA4"/>
@@ -21528,7 +22127,120 @@
       </w:rPr>
     </w:lvl>
   </w:abstractNum>
-  <w:abstractNum w:abstractNumId="58" w15:restartNumberingAfterBreak="0">
+  <w:abstractNum w:abstractNumId="59" w15:restartNumberingAfterBreak="0">
+    <w:nsid w:val="53C03E13"/>
+    <w:multiLevelType w:val="hybridMultilevel"/>
+    <w:tmpl w:val="83FCBC06"/>
+    <w:lvl w:ilvl="0" w:tplc="04090001">
+      <w:start w:val="1"/>
+      <w:numFmt w:val="bullet"/>
+      <w:lvlText w:val=""/>
+      <w:lvlJc w:val="left"/>
+      <w:pPr>
+        <w:ind w:left="720" w:hanging="360"/>
+      </w:pPr>
+      <w:rPr>
+        <w:rFonts w:ascii="Symbol" w:hAnsi="Symbol" w:hint="default"/>
+      </w:rPr>
+    </w:lvl>
+    <w:lvl w:ilvl="1" w:tplc="04090003" w:tentative="1">
+      <w:start w:val="1"/>
+      <w:numFmt w:val="bullet"/>
+      <w:lvlText w:val="o"/>
+      <w:lvlJc w:val="left"/>
+      <w:pPr>
+        <w:ind w:left="1440" w:hanging="360"/>
+      </w:pPr>
+      <w:rPr>
+        <w:rFonts w:ascii="Courier New" w:hAnsi="Courier New" w:cs="Courier New" w:hint="default"/>
+      </w:rPr>
+    </w:lvl>
+    <w:lvl w:ilvl="2" w:tplc="04090005" w:tentative="1">
+      <w:start w:val="1"/>
+      <w:numFmt w:val="bullet"/>
+      <w:lvlText w:val=""/>
+      <w:lvlJc w:val="left"/>
+      <w:pPr>
+        <w:ind w:left="2160" w:hanging="360"/>
+      </w:pPr>
+      <w:rPr>
+        <w:rFonts w:ascii="Wingdings" w:hAnsi="Wingdings" w:hint="default"/>
+      </w:rPr>
+    </w:lvl>
+    <w:lvl w:ilvl="3" w:tplc="04090001" w:tentative="1">
+      <w:start w:val="1"/>
+      <w:numFmt w:val="bullet"/>
+      <w:lvlText w:val=""/>
+      <w:lvlJc w:val="left"/>
+      <w:pPr>
+        <w:ind w:left="2880" w:hanging="360"/>
+      </w:pPr>
+      <w:rPr>
+        <w:rFonts w:ascii="Symbol" w:hAnsi="Symbol" w:hint="default"/>
+      </w:rPr>
+    </w:lvl>
+    <w:lvl w:ilvl="4" w:tplc="04090003" w:tentative="1">
+      <w:start w:val="1"/>
+      <w:numFmt w:val="bullet"/>
+      <w:lvlText w:val="o"/>
+      <w:lvlJc w:val="left"/>
+      <w:pPr>
+        <w:ind w:left="3600" w:hanging="360"/>
+      </w:pPr>
+      <w:rPr>
+        <w:rFonts w:ascii="Courier New" w:hAnsi="Courier New" w:cs="Courier New" w:hint="default"/>
+      </w:rPr>
+    </w:lvl>
+    <w:lvl w:ilvl="5" w:tplc="04090005" w:tentative="1">
+      <w:start w:val="1"/>
+      <w:numFmt w:val="bullet"/>
+      <w:lvlText w:val=""/>
+      <w:lvlJc w:val="left"/>
+      <w:pPr>
+        <w:ind w:left="4320" w:hanging="360"/>
+      </w:pPr>
+      <w:rPr>
+        <w:rFonts w:ascii="Wingdings" w:hAnsi="Wingdings" w:hint="default"/>
+      </w:rPr>
+    </w:lvl>
+    <w:lvl w:ilvl="6" w:tplc="04090001" w:tentative="1">
+      <w:start w:val="1"/>
+      <w:numFmt w:val="bullet"/>
+      <w:lvlText w:val=""/>
+      <w:lvlJc w:val="left"/>
+      <w:pPr>
+        <w:ind w:left="5040" w:hanging="360"/>
+      </w:pPr>
+      <w:rPr>
+        <w:rFonts w:ascii="Symbol" w:hAnsi="Symbol" w:hint="default"/>
+      </w:rPr>
+    </w:lvl>
+    <w:lvl w:ilvl="7" w:tplc="04090003" w:tentative="1">
+      <w:start w:val="1"/>
+      <w:numFmt w:val="bullet"/>
+      <w:lvlText w:val="o"/>
+      <w:lvlJc w:val="left"/>
+      <w:pPr>
+        <w:ind w:left="5760" w:hanging="360"/>
+      </w:pPr>
+      <w:rPr>
+        <w:rFonts w:ascii="Courier New" w:hAnsi="Courier New" w:cs="Courier New" w:hint="default"/>
+      </w:rPr>
+    </w:lvl>
+    <w:lvl w:ilvl="8" w:tplc="04090005" w:tentative="1">
+      <w:start w:val="1"/>
+      <w:numFmt w:val="bullet"/>
+      <w:lvlText w:val=""/>
+      <w:lvlJc w:val="left"/>
+      <w:pPr>
+        <w:ind w:left="6480" w:hanging="360"/>
+      </w:pPr>
+      <w:rPr>
+        <w:rFonts w:ascii="Wingdings" w:hAnsi="Wingdings" w:hint="default"/>
+      </w:rPr>
+    </w:lvl>
+  </w:abstractNum>
+  <w:abstractNum w:abstractNumId="60" w15:restartNumberingAfterBreak="0">
     <w:nsid w:val="5A897983"/>
     <w:multiLevelType w:val="multilevel"/>
     <w:tmpl w:val="F05C9280"/>
@@ -21677,7 +22389,7 @@
       </w:rPr>
     </w:lvl>
   </w:abstractNum>
-  <w:abstractNum w:abstractNumId="59" w15:restartNumberingAfterBreak="0">
+  <w:abstractNum w:abstractNumId="61" w15:restartNumberingAfterBreak="0">
     <w:nsid w:val="5DD73975"/>
     <w:multiLevelType w:val="hybridMultilevel"/>
     <w:tmpl w:val="F3C8F606"/>
@@ -21790,7 +22502,7 @@
       </w:rPr>
     </w:lvl>
   </w:abstractNum>
-  <w:abstractNum w:abstractNumId="60" w15:restartNumberingAfterBreak="0">
+  <w:abstractNum w:abstractNumId="62" w15:restartNumberingAfterBreak="0">
     <w:nsid w:val="628566FA"/>
     <w:multiLevelType w:val="multilevel"/>
     <w:tmpl w:val="C576D23C"/>
@@ -21939,7 +22651,7 @@
       </w:rPr>
     </w:lvl>
   </w:abstractNum>
-  <w:abstractNum w:abstractNumId="61" w15:restartNumberingAfterBreak="0">
+  <w:abstractNum w:abstractNumId="63" w15:restartNumberingAfterBreak="0">
     <w:nsid w:val="628F4BF2"/>
     <w:multiLevelType w:val="multilevel"/>
     <w:tmpl w:val="A680F95C"/>
@@ -22088,7 +22800,7 @@
       </w:rPr>
     </w:lvl>
   </w:abstractNum>
-  <w:abstractNum w:abstractNumId="62" w15:restartNumberingAfterBreak="0">
+  <w:abstractNum w:abstractNumId="64" w15:restartNumberingAfterBreak="0">
     <w:nsid w:val="65C91593"/>
     <w:multiLevelType w:val="multilevel"/>
     <w:tmpl w:val="B8C27B96"/>
@@ -22237,7 +22949,7 @@
       </w:rPr>
     </w:lvl>
   </w:abstractNum>
-  <w:abstractNum w:abstractNumId="63" w15:restartNumberingAfterBreak="0">
+  <w:abstractNum w:abstractNumId="65" w15:restartNumberingAfterBreak="0">
     <w:nsid w:val="667B593B"/>
     <w:multiLevelType w:val="multilevel"/>
     <w:tmpl w:val="CE58BC76"/>
@@ -22386,7 +23098,7 @@
       </w:rPr>
     </w:lvl>
   </w:abstractNum>
-  <w:abstractNum w:abstractNumId="64" w15:restartNumberingAfterBreak="0">
+  <w:abstractNum w:abstractNumId="66" w15:restartNumberingAfterBreak="0">
     <w:nsid w:val="69F3676B"/>
     <w:multiLevelType w:val="multilevel"/>
     <w:tmpl w:val="6F324960"/>
@@ -22535,7 +23247,7 @@
       </w:rPr>
     </w:lvl>
   </w:abstractNum>
-  <w:abstractNum w:abstractNumId="65" w15:restartNumberingAfterBreak="0">
+  <w:abstractNum w:abstractNumId="67" w15:restartNumberingAfterBreak="0">
     <w:nsid w:val="6EBE3AC0"/>
     <w:multiLevelType w:val="multilevel"/>
     <w:tmpl w:val="1FFA36AC"/>
@@ -22684,7 +23396,7 @@
       </w:rPr>
     </w:lvl>
   </w:abstractNum>
-  <w:abstractNum w:abstractNumId="66" w15:restartNumberingAfterBreak="0">
+  <w:abstractNum w:abstractNumId="68" w15:restartNumberingAfterBreak="0">
     <w:nsid w:val="6EFD3537"/>
     <w:multiLevelType w:val="multilevel"/>
     <w:tmpl w:val="97C84188"/>
@@ -22833,7 +23545,7 @@
       </w:rPr>
     </w:lvl>
   </w:abstractNum>
-  <w:abstractNum w:abstractNumId="67" w15:restartNumberingAfterBreak="0">
+  <w:abstractNum w:abstractNumId="69" w15:restartNumberingAfterBreak="0">
     <w:nsid w:val="6F322895"/>
     <w:multiLevelType w:val="hybridMultilevel"/>
     <w:tmpl w:val="0E2649FC"/>
@@ -22946,7 +23658,7 @@
       </w:rPr>
     </w:lvl>
   </w:abstractNum>
-  <w:abstractNum w:abstractNumId="68" w15:restartNumberingAfterBreak="0">
+  <w:abstractNum w:abstractNumId="70" w15:restartNumberingAfterBreak="0">
     <w:nsid w:val="6F4737A3"/>
     <w:multiLevelType w:val="multilevel"/>
     <w:tmpl w:val="6EC638F4"/>
@@ -23095,7 +23807,7 @@
       </w:rPr>
     </w:lvl>
   </w:abstractNum>
-  <w:abstractNum w:abstractNumId="69" w15:restartNumberingAfterBreak="0">
+  <w:abstractNum w:abstractNumId="71" w15:restartNumberingAfterBreak="0">
     <w:nsid w:val="71B866B8"/>
     <w:multiLevelType w:val="multilevel"/>
     <w:tmpl w:val="D6A61A68"/>
@@ -23244,7 +23956,7 @@
       </w:rPr>
     </w:lvl>
   </w:abstractNum>
-  <w:abstractNum w:abstractNumId="70" w15:restartNumberingAfterBreak="0">
+  <w:abstractNum w:abstractNumId="72" w15:restartNumberingAfterBreak="0">
     <w:nsid w:val="71FE7096"/>
     <w:multiLevelType w:val="multilevel"/>
     <w:tmpl w:val="DB9A52BE"/>
@@ -23393,7 +24105,120 @@
       </w:rPr>
     </w:lvl>
   </w:abstractNum>
-  <w:abstractNum w:abstractNumId="71" w15:restartNumberingAfterBreak="0">
+  <w:abstractNum w:abstractNumId="73" w15:restartNumberingAfterBreak="0">
+    <w:nsid w:val="72601284"/>
+    <w:multiLevelType w:val="hybridMultilevel"/>
+    <w:tmpl w:val="19AC3094"/>
+    <w:lvl w:ilvl="0" w:tplc="04090001">
+      <w:start w:val="1"/>
+      <w:numFmt w:val="bullet"/>
+      <w:lvlText w:val=""/>
+      <w:lvlJc w:val="left"/>
+      <w:pPr>
+        <w:ind w:left="720" w:hanging="360"/>
+      </w:pPr>
+      <w:rPr>
+        <w:rFonts w:ascii="Symbol" w:hAnsi="Symbol" w:hint="default"/>
+      </w:rPr>
+    </w:lvl>
+    <w:lvl w:ilvl="1" w:tplc="04090003" w:tentative="1">
+      <w:start w:val="1"/>
+      <w:numFmt w:val="bullet"/>
+      <w:lvlText w:val="o"/>
+      <w:lvlJc w:val="left"/>
+      <w:pPr>
+        <w:ind w:left="1440" w:hanging="360"/>
+      </w:pPr>
+      <w:rPr>
+        <w:rFonts w:ascii="Courier New" w:hAnsi="Courier New" w:cs="Courier New" w:hint="default"/>
+      </w:rPr>
+    </w:lvl>
+    <w:lvl w:ilvl="2" w:tplc="04090005" w:tentative="1">
+      <w:start w:val="1"/>
+      <w:numFmt w:val="bullet"/>
+      <w:lvlText w:val=""/>
+      <w:lvlJc w:val="left"/>
+      <w:pPr>
+        <w:ind w:left="2160" w:hanging="360"/>
+      </w:pPr>
+      <w:rPr>
+        <w:rFonts w:ascii="Wingdings" w:hAnsi="Wingdings" w:hint="default"/>
+      </w:rPr>
+    </w:lvl>
+    <w:lvl w:ilvl="3" w:tplc="04090001" w:tentative="1">
+      <w:start w:val="1"/>
+      <w:numFmt w:val="bullet"/>
+      <w:lvlText w:val=""/>
+      <w:lvlJc w:val="left"/>
+      <w:pPr>
+        <w:ind w:left="2880" w:hanging="360"/>
+      </w:pPr>
+      <w:rPr>
+        <w:rFonts w:ascii="Symbol" w:hAnsi="Symbol" w:hint="default"/>
+      </w:rPr>
+    </w:lvl>
+    <w:lvl w:ilvl="4" w:tplc="04090003" w:tentative="1">
+      <w:start w:val="1"/>
+      <w:numFmt w:val="bullet"/>
+      <w:lvlText w:val="o"/>
+      <w:lvlJc w:val="left"/>
+      <w:pPr>
+        <w:ind w:left="3600" w:hanging="360"/>
+      </w:pPr>
+      <w:rPr>
+        <w:rFonts w:ascii="Courier New" w:hAnsi="Courier New" w:cs="Courier New" w:hint="default"/>
+      </w:rPr>
+    </w:lvl>
+    <w:lvl w:ilvl="5" w:tplc="04090005" w:tentative="1">
+      <w:start w:val="1"/>
+      <w:numFmt w:val="bullet"/>
+      <w:lvlText w:val=""/>
+      <w:lvlJc w:val="left"/>
+      <w:pPr>
+        <w:ind w:left="4320" w:hanging="360"/>
+      </w:pPr>
+      <w:rPr>
+        <w:rFonts w:ascii="Wingdings" w:hAnsi="Wingdings" w:hint="default"/>
+      </w:rPr>
+    </w:lvl>
+    <w:lvl w:ilvl="6" w:tplc="04090001" w:tentative="1">
+      <w:start w:val="1"/>
+      <w:numFmt w:val="bullet"/>
+      <w:lvlText w:val=""/>
+      <w:lvlJc w:val="left"/>
+      <w:pPr>
+        <w:ind w:left="5040" w:hanging="360"/>
+      </w:pPr>
+      <w:rPr>
+        <w:rFonts w:ascii="Symbol" w:hAnsi="Symbol" w:hint="default"/>
+      </w:rPr>
+    </w:lvl>
+    <w:lvl w:ilvl="7" w:tplc="04090003" w:tentative="1">
+      <w:start w:val="1"/>
+      <w:numFmt w:val="bullet"/>
+      <w:lvlText w:val="o"/>
+      <w:lvlJc w:val="left"/>
+      <w:pPr>
+        <w:ind w:left="5760" w:hanging="360"/>
+      </w:pPr>
+      <w:rPr>
+        <w:rFonts w:ascii="Courier New" w:hAnsi="Courier New" w:cs="Courier New" w:hint="default"/>
+      </w:rPr>
+    </w:lvl>
+    <w:lvl w:ilvl="8" w:tplc="04090005" w:tentative="1">
+      <w:start w:val="1"/>
+      <w:numFmt w:val="bullet"/>
+      <w:lvlText w:val=""/>
+      <w:lvlJc w:val="left"/>
+      <w:pPr>
+        <w:ind w:left="6480" w:hanging="360"/>
+      </w:pPr>
+      <w:rPr>
+        <w:rFonts w:ascii="Wingdings" w:hAnsi="Wingdings" w:hint="default"/>
+      </w:rPr>
+    </w:lvl>
+  </w:abstractNum>
+  <w:abstractNum w:abstractNumId="74" w15:restartNumberingAfterBreak="0">
     <w:nsid w:val="74D4408F"/>
     <w:multiLevelType w:val="multilevel"/>
     <w:tmpl w:val="C854DE4A"/>
@@ -23542,7 +24367,7 @@
       </w:rPr>
     </w:lvl>
   </w:abstractNum>
-  <w:abstractNum w:abstractNumId="72" w15:restartNumberingAfterBreak="0">
+  <w:abstractNum w:abstractNumId="75" w15:restartNumberingAfterBreak="0">
     <w:nsid w:val="75854F38"/>
     <w:multiLevelType w:val="multilevel"/>
     <w:tmpl w:val="D5CED040"/>
@@ -23691,7 +24516,7 @@
       </w:rPr>
     </w:lvl>
   </w:abstractNum>
-  <w:abstractNum w:abstractNumId="73" w15:restartNumberingAfterBreak="0">
+  <w:abstractNum w:abstractNumId="76" w15:restartNumberingAfterBreak="0">
     <w:nsid w:val="761A133C"/>
     <w:multiLevelType w:val="multilevel"/>
     <w:tmpl w:val="0F382862"/>
@@ -23840,7 +24665,7 @@
       </w:rPr>
     </w:lvl>
   </w:abstractNum>
-  <w:abstractNum w:abstractNumId="74" w15:restartNumberingAfterBreak="0">
+  <w:abstractNum w:abstractNumId="77" w15:restartNumberingAfterBreak="0">
     <w:nsid w:val="76A27D4F"/>
     <w:multiLevelType w:val="multilevel"/>
     <w:tmpl w:val="1D745170"/>
@@ -23989,7 +24814,7 @@
       </w:rPr>
     </w:lvl>
   </w:abstractNum>
-  <w:abstractNum w:abstractNumId="75" w15:restartNumberingAfterBreak="0">
+  <w:abstractNum w:abstractNumId="78" w15:restartNumberingAfterBreak="0">
     <w:nsid w:val="796D1793"/>
     <w:multiLevelType w:val="hybridMultilevel"/>
     <w:tmpl w:val="2938CC24"/>
@@ -24102,7 +24927,7 @@
       </w:rPr>
     </w:lvl>
   </w:abstractNum>
-  <w:abstractNum w:abstractNumId="76" w15:restartNumberingAfterBreak="0">
+  <w:abstractNum w:abstractNumId="79" w15:restartNumberingAfterBreak="0">
     <w:nsid w:val="7A0A2BF8"/>
     <w:multiLevelType w:val="multilevel"/>
     <w:tmpl w:val="139229D4"/>
@@ -24251,7 +25076,7 @@
       </w:rPr>
     </w:lvl>
   </w:abstractNum>
-  <w:abstractNum w:abstractNumId="77" w15:restartNumberingAfterBreak="0">
+  <w:abstractNum w:abstractNumId="80" w15:restartNumberingAfterBreak="0">
     <w:nsid w:val="7A251DB5"/>
     <w:multiLevelType w:val="multilevel"/>
     <w:tmpl w:val="A60243AE"/>
@@ -24400,7 +25225,7 @@
       </w:rPr>
     </w:lvl>
   </w:abstractNum>
-  <w:abstractNum w:abstractNumId="78" w15:restartNumberingAfterBreak="0">
+  <w:abstractNum w:abstractNumId="81" w15:restartNumberingAfterBreak="0">
     <w:nsid w:val="7C6F0D89"/>
     <w:multiLevelType w:val="multilevel"/>
     <w:tmpl w:val="F3E8C6DA"/>
@@ -24549,7 +25374,7 @@
       </w:rPr>
     </w:lvl>
   </w:abstractNum>
-  <w:abstractNum w:abstractNumId="79" w15:restartNumberingAfterBreak="0">
+  <w:abstractNum w:abstractNumId="82" w15:restartNumberingAfterBreak="0">
     <w:nsid w:val="7CC447D5"/>
     <w:multiLevelType w:val="multilevel"/>
     <w:tmpl w:val="F53EFE4C"/>
@@ -24698,7 +25523,7 @@
       </w:rPr>
     </w:lvl>
   </w:abstractNum>
-  <w:abstractNum w:abstractNumId="80" w15:restartNumberingAfterBreak="0">
+  <w:abstractNum w:abstractNumId="83" w15:restartNumberingAfterBreak="0">
     <w:nsid w:val="7DB559E2"/>
     <w:multiLevelType w:val="hybridMultilevel"/>
     <w:tmpl w:val="7780024C"/>
@@ -24811,7 +25636,7 @@
       </w:rPr>
     </w:lvl>
   </w:abstractNum>
-  <w:abstractNum w:abstractNumId="81" w15:restartNumberingAfterBreak="0">
+  <w:abstractNum w:abstractNumId="84" w15:restartNumberingAfterBreak="0">
     <w:nsid w:val="7E1B2E64"/>
     <w:multiLevelType w:val="hybridMultilevel"/>
     <w:tmpl w:val="E276480E"/>
@@ -24924,7 +25749,7 @@
       </w:rPr>
     </w:lvl>
   </w:abstractNum>
-  <w:abstractNum w:abstractNumId="82" w15:restartNumberingAfterBreak="0">
+  <w:abstractNum w:abstractNumId="85" w15:restartNumberingAfterBreak="0">
     <w:nsid w:val="7F007273"/>
     <w:multiLevelType w:val="multilevel"/>
     <w:tmpl w:val="F4D2AA58"/>
@@ -25074,7 +25899,7 @@
     </w:lvl>
   </w:abstractNum>
   <w:num w:numId="1" w16cid:durableId="448354519">
-    <w:abstractNumId w:val="40"/>
+    <w:abstractNumId w:val="41"/>
   </w:num>
   <w:num w:numId="2" w16cid:durableId="267277991">
     <w:abstractNumId w:val="4"/>
@@ -25083,34 +25908,34 @@
     <w:abstractNumId w:val="11"/>
   </w:num>
   <w:num w:numId="4" w16cid:durableId="1373382629">
-    <w:abstractNumId w:val="73"/>
+    <w:abstractNumId w:val="76"/>
   </w:num>
   <w:num w:numId="5" w16cid:durableId="1915696360">
-    <w:abstractNumId w:val="50"/>
+    <w:abstractNumId w:val="51"/>
   </w:num>
   <w:num w:numId="6" w16cid:durableId="44070181">
     <w:abstractNumId w:val="20"/>
   </w:num>
   <w:num w:numId="7" w16cid:durableId="493452589">
-    <w:abstractNumId w:val="79"/>
+    <w:abstractNumId w:val="82"/>
   </w:num>
   <w:num w:numId="8" w16cid:durableId="925652620">
-    <w:abstractNumId w:val="66"/>
+    <w:abstractNumId w:val="68"/>
   </w:num>
   <w:num w:numId="9" w16cid:durableId="2105029407">
-    <w:abstractNumId w:val="77"/>
+    <w:abstractNumId w:val="80"/>
   </w:num>
   <w:num w:numId="10" w16cid:durableId="1322386189">
-    <w:abstractNumId w:val="58"/>
+    <w:abstractNumId w:val="60"/>
   </w:num>
   <w:num w:numId="11" w16cid:durableId="1145046778">
-    <w:abstractNumId w:val="36"/>
+    <w:abstractNumId w:val="37"/>
   </w:num>
   <w:num w:numId="12" w16cid:durableId="886575476">
-    <w:abstractNumId w:val="68"/>
+    <w:abstractNumId w:val="70"/>
   </w:num>
   <w:num w:numId="13" w16cid:durableId="434445510">
-    <w:abstractNumId w:val="53"/>
+    <w:abstractNumId w:val="54"/>
   </w:num>
   <w:num w:numId="14" w16cid:durableId="1548566209">
     <w:abstractNumId w:val="23"/>
@@ -25119,7 +25944,7 @@
     <w:abstractNumId w:val="6"/>
   </w:num>
   <w:num w:numId="16" w16cid:durableId="1081374075">
-    <w:abstractNumId w:val="41"/>
+    <w:abstractNumId w:val="42"/>
   </w:num>
   <w:num w:numId="17" w16cid:durableId="1595045529">
     <w:abstractNumId w:val="13"/>
@@ -25128,61 +25953,61 @@
     <w:abstractNumId w:val="14"/>
   </w:num>
   <w:num w:numId="19" w16cid:durableId="113258773">
-    <w:abstractNumId w:val="47"/>
+    <w:abstractNumId w:val="48"/>
   </w:num>
   <w:num w:numId="20" w16cid:durableId="965312005">
-    <w:abstractNumId w:val="49"/>
+    <w:abstractNumId w:val="50"/>
   </w:num>
   <w:num w:numId="21" w16cid:durableId="343359711">
-    <w:abstractNumId w:val="81"/>
+    <w:abstractNumId w:val="84"/>
   </w:num>
   <w:num w:numId="22" w16cid:durableId="547838144">
-    <w:abstractNumId w:val="75"/>
+    <w:abstractNumId w:val="78"/>
   </w:num>
   <w:num w:numId="23" w16cid:durableId="1031033420">
-    <w:abstractNumId w:val="64"/>
+    <w:abstractNumId w:val="66"/>
   </w:num>
   <w:num w:numId="24" w16cid:durableId="519204185">
     <w:abstractNumId w:val="30"/>
   </w:num>
   <w:num w:numId="25" w16cid:durableId="1706559306">
-    <w:abstractNumId w:val="55"/>
+    <w:abstractNumId w:val="56"/>
   </w:num>
   <w:num w:numId="26" w16cid:durableId="1050305727">
-    <w:abstractNumId w:val="38"/>
+    <w:abstractNumId w:val="39"/>
   </w:num>
   <w:num w:numId="27" w16cid:durableId="1439444620">
-    <w:abstractNumId w:val="48"/>
+    <w:abstractNumId w:val="49"/>
   </w:num>
   <w:num w:numId="28" w16cid:durableId="1831407804">
     <w:abstractNumId w:val="8"/>
   </w:num>
   <w:num w:numId="29" w16cid:durableId="1777367443">
-    <w:abstractNumId w:val="31"/>
+    <w:abstractNumId w:val="32"/>
   </w:num>
   <w:num w:numId="30" w16cid:durableId="479158040">
-    <w:abstractNumId w:val="71"/>
+    <w:abstractNumId w:val="74"/>
   </w:num>
   <w:num w:numId="31" w16cid:durableId="2026666882">
-    <w:abstractNumId w:val="65"/>
+    <w:abstractNumId w:val="67"/>
   </w:num>
   <w:num w:numId="32" w16cid:durableId="1640843127">
+    <w:abstractNumId w:val="75"/>
+  </w:num>
+  <w:num w:numId="33" w16cid:durableId="83958067">
+    <w:abstractNumId w:val="36"/>
+  </w:num>
+  <w:num w:numId="34" w16cid:durableId="1831871160">
     <w:abstractNumId w:val="72"/>
   </w:num>
-  <w:num w:numId="33" w16cid:durableId="83958067">
-    <w:abstractNumId w:val="35"/>
-  </w:num>
-  <w:num w:numId="34" w16cid:durableId="1831871160">
-    <w:abstractNumId w:val="70"/>
-  </w:num>
   <w:num w:numId="35" w16cid:durableId="727649376">
-    <w:abstractNumId w:val="33"/>
+    <w:abstractNumId w:val="34"/>
   </w:num>
   <w:num w:numId="36" w16cid:durableId="804392417">
     <w:abstractNumId w:val="26"/>
   </w:num>
   <w:num w:numId="37" w16cid:durableId="2016688023">
-    <w:abstractNumId w:val="52"/>
+    <w:abstractNumId w:val="53"/>
   </w:num>
   <w:num w:numId="38" w16cid:durableId="174225593">
     <w:abstractNumId w:val="28"/>
@@ -25200,31 +26025,31 @@
     <w:abstractNumId w:val="10"/>
   </w:num>
   <w:num w:numId="43" w16cid:durableId="1671104138">
-    <w:abstractNumId w:val="37"/>
+    <w:abstractNumId w:val="38"/>
   </w:num>
   <w:num w:numId="44" w16cid:durableId="991250543">
     <w:abstractNumId w:val="16"/>
   </w:num>
   <w:num w:numId="45" w16cid:durableId="57870292">
-    <w:abstractNumId w:val="54"/>
+    <w:abstractNumId w:val="55"/>
   </w:num>
   <w:num w:numId="46" w16cid:durableId="1132557770">
-    <w:abstractNumId w:val="82"/>
+    <w:abstractNumId w:val="85"/>
   </w:num>
   <w:num w:numId="47" w16cid:durableId="536357828">
-    <w:abstractNumId w:val="42"/>
+    <w:abstractNumId w:val="43"/>
   </w:num>
   <w:num w:numId="48" w16cid:durableId="604652666">
-    <w:abstractNumId w:val="34"/>
+    <w:abstractNumId w:val="35"/>
   </w:num>
   <w:num w:numId="49" w16cid:durableId="1565608183">
-    <w:abstractNumId w:val="59"/>
+    <w:abstractNumId w:val="61"/>
   </w:num>
   <w:num w:numId="50" w16cid:durableId="1160925032">
     <w:abstractNumId w:val="19"/>
   </w:num>
   <w:num w:numId="51" w16cid:durableId="1074083402">
-    <w:abstractNumId w:val="44"/>
+    <w:abstractNumId w:val="45"/>
   </w:num>
   <w:num w:numId="52" w16cid:durableId="505705463">
     <w:abstractNumId w:val="27"/>
@@ -25233,7 +26058,7 @@
     <w:abstractNumId w:val="7"/>
   </w:num>
   <w:num w:numId="54" w16cid:durableId="1059288088">
-    <w:abstractNumId w:val="43"/>
+    <w:abstractNumId w:val="44"/>
   </w:num>
   <w:num w:numId="55" w16cid:durableId="1800486562">
     <w:abstractNumId w:val="29"/>
@@ -25245,25 +26070,25 @@
     <w:abstractNumId w:val="24"/>
   </w:num>
   <w:num w:numId="58" w16cid:durableId="1153330480">
-    <w:abstractNumId w:val="51"/>
+    <w:abstractNumId w:val="52"/>
   </w:num>
   <w:num w:numId="59" w16cid:durableId="1571041670">
     <w:abstractNumId w:val="12"/>
   </w:num>
   <w:num w:numId="60" w16cid:durableId="1139416074">
-    <w:abstractNumId w:val="32"/>
+    <w:abstractNumId w:val="33"/>
   </w:num>
   <w:num w:numId="61" w16cid:durableId="95058015">
-    <w:abstractNumId w:val="78"/>
+    <w:abstractNumId w:val="81"/>
   </w:num>
   <w:num w:numId="62" w16cid:durableId="326058897">
     <w:abstractNumId w:val="2"/>
   </w:num>
   <w:num w:numId="63" w16cid:durableId="1822691731">
-    <w:abstractNumId w:val="56"/>
+    <w:abstractNumId w:val="57"/>
   </w:num>
   <w:num w:numId="64" w16cid:durableId="491482094">
-    <w:abstractNumId w:val="39"/>
+    <w:abstractNumId w:val="40"/>
   </w:num>
   <w:num w:numId="65" w16cid:durableId="624000986">
     <w:abstractNumId w:val="1"/>
@@ -25278,34 +26103,34 @@
     <w:abstractNumId w:val="0"/>
   </w:num>
   <w:num w:numId="69" w16cid:durableId="842819424">
-    <w:abstractNumId w:val="69"/>
+    <w:abstractNumId w:val="71"/>
   </w:num>
   <w:num w:numId="70" w16cid:durableId="2118792854">
-    <w:abstractNumId w:val="60"/>
+    <w:abstractNumId w:val="62"/>
   </w:num>
   <w:num w:numId="71" w16cid:durableId="1506017899">
-    <w:abstractNumId w:val="74"/>
+    <w:abstractNumId w:val="77"/>
   </w:num>
   <w:num w:numId="72" w16cid:durableId="1922787855">
-    <w:abstractNumId w:val="61"/>
+    <w:abstractNumId w:val="63"/>
   </w:num>
   <w:num w:numId="73" w16cid:durableId="240912039">
     <w:abstractNumId w:val="9"/>
   </w:num>
   <w:num w:numId="74" w16cid:durableId="2005474240">
-    <w:abstractNumId w:val="45"/>
+    <w:abstractNumId w:val="46"/>
   </w:num>
   <w:num w:numId="75" w16cid:durableId="297106655">
-    <w:abstractNumId w:val="46"/>
+    <w:abstractNumId w:val="47"/>
   </w:num>
   <w:num w:numId="76" w16cid:durableId="1263805218">
-    <w:abstractNumId w:val="63"/>
+    <w:abstractNumId w:val="65"/>
   </w:num>
   <w:num w:numId="77" w16cid:durableId="336930133">
-    <w:abstractNumId w:val="76"/>
+    <w:abstractNumId w:val="79"/>
   </w:num>
   <w:num w:numId="78" w16cid:durableId="1358193180">
-    <w:abstractNumId w:val="62"/>
+    <w:abstractNumId w:val="64"/>
   </w:num>
   <w:num w:numId="79" w16cid:durableId="611593919">
     <w:abstractNumId w:val="15"/>
@@ -25314,13 +26139,22 @@
     <w:abstractNumId w:val="5"/>
   </w:num>
   <w:num w:numId="81" w16cid:durableId="1669598111">
-    <w:abstractNumId w:val="57"/>
+    <w:abstractNumId w:val="58"/>
   </w:num>
   <w:num w:numId="82" w16cid:durableId="729501046">
-    <w:abstractNumId w:val="80"/>
+    <w:abstractNumId w:val="83"/>
   </w:num>
   <w:num w:numId="83" w16cid:durableId="1432243327">
-    <w:abstractNumId w:val="67"/>
+    <w:abstractNumId w:val="69"/>
+  </w:num>
+  <w:num w:numId="84" w16cid:durableId="1673410959">
+    <w:abstractNumId w:val="59"/>
+  </w:num>
+  <w:num w:numId="85" w16cid:durableId="946810640">
+    <w:abstractNumId w:val="31"/>
+  </w:num>
+  <w:num w:numId="86" w16cid:durableId="1698191965">
+    <w:abstractNumId w:val="73"/>
   </w:num>
   <w:numIdMacAtCleanup w:val="82"/>
 </w:numbering>
@@ -25726,6 +26560,7 @@
   <w:style w:type="paragraph" w:default="1" w:styleId="Normal">
     <w:name w:val="Normal"/>
     <w:qFormat/>
+    <w:rsid w:val="0051731B"/>
   </w:style>
   <w:style w:type="paragraph" w:styleId="Heading1">
     <w:name w:val="heading 1"/>
@@ -25929,6 +26764,7 @@
   <w:style w:type="character" w:default="1" w:styleId="DefaultParagraphFont">
     <w:name w:val="Default Paragraph Font"/>
     <w:uiPriority w:val="1"/>
+    <w:semiHidden/>
     <w:unhideWhenUsed/>
   </w:style>
   <w:style w:type="table" w:default="1" w:styleId="TableNormal">

</xml_diff>

<commit_message>
added up to july 3
</commit_message>
<xml_diff>
--- a/EOD update daily.docx
+++ b/EOD update daily.docx
@@ -981,15 +981,7 @@
         </w:tabs>
       </w:pPr>
       <w:r>
-        <w:t xml:space="preserve">Fixed role </w:t>
-      </w:r>
-      <w:proofErr w:type="gramStart"/>
-      <w:r>
-        <w:t>return</w:t>
-      </w:r>
-      <w:proofErr w:type="gramEnd"/>
-      <w:r>
-        <w:t xml:space="preserve"> type issue</w:t>
+        <w:t>Fixed role return type issue</w:t>
       </w:r>
     </w:p>
     <w:p>
@@ -1672,21 +1664,7 @@
           <w:highlight w:val="yellow"/>
         </w:rPr>
         <w:lastRenderedPageBreak/>
-        <w:t xml:space="preserve">May: 17 2025 </w:t>
-      </w:r>
-      <w:proofErr w:type="gramStart"/>
-      <w:r>
-        <w:rPr>
-          <w:highlight w:val="yellow"/>
-        </w:rPr>
-        <w:t>login:8:55</w:t>
-      </w:r>
-      <w:proofErr w:type="gramEnd"/>
-      <w:r>
-        <w:rPr>
-          <w:highlight w:val="yellow"/>
-        </w:rPr>
-        <w:t xml:space="preserve"> | logout:</w:t>
+        <w:t>May: 17 2025 login:8:55 | logout:</w:t>
       </w:r>
       <w:r>
         <w:rPr>
@@ -1835,40 +1813,32 @@
         <w:rPr>
           <w:highlight w:val="yellow"/>
         </w:rPr>
-        <w:t xml:space="preserve"> </w:t>
-      </w:r>
-      <w:proofErr w:type="gramStart"/>
+        <w:t xml:space="preserve"> login:</w:t>
+      </w:r>
       <w:r>
         <w:rPr>
           <w:highlight w:val="yellow"/>
         </w:rPr>
-        <w:t>login:</w:t>
+        <w:t>9</w:t>
       </w:r>
       <w:r>
         <w:rPr>
           <w:highlight w:val="yellow"/>
         </w:rPr>
-        <w:t>9</w:t>
+        <w:t>:</w:t>
       </w:r>
       <w:r>
         <w:rPr>
           <w:highlight w:val="yellow"/>
         </w:rPr>
-        <w:t>:</w:t>
+        <w:t>0</w:t>
       </w:r>
       <w:r>
         <w:rPr>
           <w:highlight w:val="yellow"/>
         </w:rPr>
-        <w:t>0</w:t>
-      </w:r>
-      <w:r>
-        <w:rPr>
-          <w:highlight w:val="yellow"/>
-        </w:rPr>
         <w:t>3</w:t>
       </w:r>
-      <w:proofErr w:type="gramEnd"/>
       <w:r>
         <w:rPr>
           <w:highlight w:val="yellow"/>
@@ -2002,34 +1972,26 @@
         <w:rPr>
           <w:highlight w:val="yellow"/>
         </w:rPr>
-        <w:t xml:space="preserve"> </w:t>
-      </w:r>
-      <w:proofErr w:type="gramStart"/>
+        <w:t xml:space="preserve"> login:</w:t>
+      </w:r>
       <w:r>
         <w:rPr>
           <w:highlight w:val="yellow"/>
         </w:rPr>
-        <w:t>login:</w:t>
+        <w:t>9</w:t>
       </w:r>
       <w:r>
         <w:rPr>
           <w:highlight w:val="yellow"/>
         </w:rPr>
-        <w:t>9</w:t>
+        <w:t>:</w:t>
       </w:r>
       <w:r>
         <w:rPr>
           <w:highlight w:val="yellow"/>
         </w:rPr>
-        <w:t>:</w:t>
-      </w:r>
-      <w:r>
-        <w:rPr>
-          <w:highlight w:val="yellow"/>
-        </w:rPr>
         <w:t>40</w:t>
       </w:r>
-      <w:proofErr w:type="gramEnd"/>
       <w:r>
         <w:rPr>
           <w:highlight w:val="yellow"/>
@@ -2285,11 +2247,7 @@
       </w:r>
       <w:proofErr w:type="spellEnd"/>
       <w:r>
-        <w:t xml:space="preserve"> and </w:t>
-      </w:r>
-      <w:proofErr w:type="gramStart"/>
-      <w:r>
-        <w:t>collections/</w:t>
+        <w:t xml:space="preserve"> and collections/</w:t>
       </w:r>
       <w:proofErr w:type="spellStart"/>
       <w:r>
@@ -2302,7 +2260,6 @@
       <w:r>
         <w:t xml:space="preserve"> file</w:t>
       </w:r>
-      <w:proofErr w:type="gramEnd"/>
     </w:p>
     <w:p>
       <w:pPr>
@@ -2751,35 +2708,203 @@
         <w:rPr>
           <w:highlight w:val="yellow"/>
         </w:rPr>
+        <w:t xml:space="preserve"> 2026</w:t>
+      </w:r>
+      <w:r>
+        <w:t xml:space="preserve"> : Monday login: 9:03</w:t>
+      </w:r>
+      <w:r>
+        <w:t xml:space="preserve"> am</w:t>
+      </w:r>
+      <w:r>
+        <w:t xml:space="preserve"> logout:</w:t>
+      </w:r>
+      <w:r>
+        <w:t xml:space="preserve"> 5:00 pm</w:t>
+      </w:r>
+    </w:p>
+    <w:p>
+      <w:r>
+        <w:t>Mac store:</w:t>
+      </w:r>
+    </w:p>
+    <w:p>
+      <w:pPr>
+        <w:pStyle w:val="ListParagraph"/>
+        <w:numPr>
+          <w:ilvl w:val="0"/>
+          <w:numId w:val="20"/>
+        </w:numPr>
+      </w:pPr>
+      <w:r>
+        <w:t xml:space="preserve">Fixed issue where Quantity Selector was not being applied correctly—only 1 item was being added to the cart regardless of selected quantity. Root cause was qty not being properly passed to cart logic; ensured qty is correctly forwarded in both Add to Cart and Buy It Now flows. Also fixed Buy It Now pricing inconsistency by aligning it with Add to Cart pricing logic, ensuring offer price is correctly applied from the same calculation source in </w:t>
+      </w:r>
+      <w:proofErr w:type="spellStart"/>
+      <w:r>
+        <w:t>ProductDetailClient.tsx</w:t>
+      </w:r>
+      <w:proofErr w:type="spellEnd"/>
+      <w:r>
+        <w:t>.</w:t>
+      </w:r>
+    </w:p>
+    <w:p>
+      <w:pPr>
+        <w:pStyle w:val="ListParagraph"/>
+        <w:numPr>
+          <w:ilvl w:val="0"/>
+          <w:numId w:val="20"/>
+        </w:numPr>
+      </w:pPr>
+      <w:r>
+        <w:t xml:space="preserve">Analyzed </w:t>
+      </w:r>
+      <w:proofErr w:type="spellStart"/>
+      <w:r>
+        <w:t>MacStore</w:t>
+      </w:r>
+      <w:proofErr w:type="spellEnd"/>
+      <w:r>
+        <w:t xml:space="preserve"> project and identified a minor slider scroll issue along with some responsiveness issues on dashboard and a few pages, mainly on larger screen devices. </w:t>
+      </w:r>
+    </w:p>
+    <w:p>
+      <w:pPr>
+        <w:pStyle w:val="ListParagraph"/>
+        <w:numPr>
+          <w:ilvl w:val="0"/>
+          <w:numId w:val="20"/>
+        </w:numPr>
+      </w:pPr>
+      <w:r>
+        <w:t xml:space="preserve">Manually tested Contact Us form validations and documented that all required field validations are working correctly and admin receives customer requests successfully. </w:t>
+      </w:r>
+    </w:p>
+    <w:p>
+      <w:pPr>
+        <w:pStyle w:val="ListParagraph"/>
+        <w:numPr>
+          <w:ilvl w:val="0"/>
+          <w:numId w:val="20"/>
+        </w:numPr>
+      </w:pPr>
+      <w:r>
+        <w:t xml:space="preserve">Offer backend pricing issue still needs senior review. Frontend is sending offer data correctly, but admin side is not receiving the offer price properly. </w:t>
+      </w:r>
+    </w:p>
+    <w:p>
+      <w:pPr>
+        <w:pStyle w:val="ListParagraph"/>
+        <w:numPr>
+          <w:ilvl w:val="0"/>
+          <w:numId w:val="20"/>
+        </w:numPr>
+      </w:pPr>
+      <w:r>
+        <w:t xml:space="preserve">Some pages still require responsiveness review and improvements. </w:t>
+      </w:r>
+    </w:p>
+    <w:p>
+      <w:pPr>
+        <w:pStyle w:val="ListParagraph"/>
+        <w:numPr>
+          <w:ilvl w:val="0"/>
+          <w:numId w:val="20"/>
+        </w:numPr>
+      </w:pPr>
+      <w:r>
+        <w:t xml:space="preserve">Identified a few content/naming typos that can be improved for clearer messaging. </w:t>
+      </w:r>
+    </w:p>
+    <w:p>
+      <w:pPr>
+        <w:pStyle w:val="ListParagraph"/>
+        <w:numPr>
+          <w:ilvl w:val="0"/>
+          <w:numId w:val="20"/>
+        </w:numPr>
+      </w:pPr>
+      <w:r>
+        <w:t>Suggested some UI/UX refactoring improvements for better overall experience.</w:t>
+      </w:r>
+    </w:p>
+    <w:p>
+      <w:r>
+        <w:br w:type="page"/>
+      </w:r>
+    </w:p>
+    <w:p>
+      <w:pPr>
+        <w:pStyle w:val="Heading1"/>
+      </w:pPr>
+      <w:r>
+        <w:lastRenderedPageBreak/>
+        <w:t>May 26 2026: Tuesday login: 9:15 am logout:5:00 pm</w:t>
+      </w:r>
+    </w:p>
+    <w:p>
+      <w:r>
+        <w:t>Mac Store:</w:t>
+      </w:r>
+    </w:p>
+    <w:p>
+      <w:pPr>
+        <w:pStyle w:val="ListParagraph"/>
+        <w:numPr>
+          <w:ilvl w:val="0"/>
+          <w:numId w:val="21"/>
+        </w:numPr>
+      </w:pPr>
+      <w:r>
+        <w:t>On mobile and tablet devices, the slider was blocking vertical scrolling, the auto-slide stopped on touch and resumed with delay, and the navigation buttons were incorrectly positioned in the middle.</w:t>
+      </w:r>
+      <w:r>
         <w:t xml:space="preserve"> </w:t>
       </w:r>
-      <w:proofErr w:type="gramStart"/>
+      <w:r>
+        <w:t>All issues are resolved, and the section is now fully responsive with smooth scrolling, stable auto-slide on touch devices, and correctly positioned navigation buttons.</w:t>
+      </w:r>
+      <w:r>
+        <w:t xml:space="preserve"> Chances made in </w:t>
+      </w:r>
+      <w:proofErr w:type="spellStart"/>
+      <w:r>
+        <w:t>NewLaunchesClient.tsx</w:t>
+      </w:r>
+      <w:proofErr w:type="spellEnd"/>
+    </w:p>
+    <w:p>
+      <w:pPr>
+        <w:pStyle w:val="ListParagraph"/>
+        <w:numPr>
+          <w:ilvl w:val="0"/>
+          <w:numId w:val="21"/>
+        </w:numPr>
+      </w:pPr>
+      <w:r>
+        <w:t>Create a doc highlighting some bugs on the frontend and send to the senior developer</w:t>
+      </w:r>
+    </w:p>
+    <w:p>
+      <w:r>
+        <w:br w:type="page"/>
+      </w:r>
+    </w:p>
+    <w:p>
+      <w:pPr>
+        <w:pStyle w:val="Heading1"/>
+      </w:pPr>
       <w:r>
         <w:rPr>
           <w:highlight w:val="yellow"/>
         </w:rPr>
-        <w:t>2026</w:t>
-      </w:r>
-      <w:r>
-        <w:t xml:space="preserve"> :</w:t>
-      </w:r>
-      <w:proofErr w:type="gramEnd"/>
-      <w:r>
-        <w:t xml:space="preserve"> Monday login: 9:03</w:t>
-      </w:r>
-      <w:r>
-        <w:t xml:space="preserve"> am</w:t>
-      </w:r>
-      <w:r>
-        <w:t xml:space="preserve"> logout:</w:t>
-      </w:r>
-      <w:r>
-        <w:t xml:space="preserve"> 5:00 pm</w:t>
-      </w:r>
-    </w:p>
-    <w:p>
-      <w:r>
-        <w:t>Mac store:</w:t>
+        <w:lastRenderedPageBreak/>
+        <w:t>May 27 2026: login:9:01 logout:5:00</w:t>
+      </w:r>
+    </w:p>
+    <w:p>
+      <w:r>
+        <w:t xml:space="preserve">Mac store: </w:t>
       </w:r>
     </w:p>
     <w:p>
@@ -2787,19 +2912,59 @@
         <w:pStyle w:val="ListParagraph"/>
         <w:numPr>
           <w:ilvl w:val="0"/>
-          <w:numId w:val="20"/>
-        </w:numPr>
-      </w:pPr>
-      <w:r>
-        <w:t xml:space="preserve">Fixed issue where Quantity Selector was not being applied correctly—only 1 item was being added to the cart regardless of selected quantity. Root cause was qty not being properly passed to cart logic; ensured qty is correctly forwarded in both Add to Cart and Buy It Now flows. Also fixed Buy It Now pricing inconsistency by aligning it with Add to Cart pricing logic, ensuring offer price is correctly applied from the same calculation source in </w:t>
+          <w:numId w:val="22"/>
+        </w:numPr>
+      </w:pPr>
+      <w:r>
+        <w:t xml:space="preserve">Worked on making the user dashboard responsive across mobile/tablet devices. Updated </w:t>
       </w:r>
       <w:proofErr w:type="spellStart"/>
       <w:r>
-        <w:t>ProductDetailClient.tsx</w:t>
+        <w:t>AccountDashboardClient.tsx</w:t>
       </w:r>
       <w:proofErr w:type="spellEnd"/>
       <w:r>
-        <w:t>.</w:t>
+        <w:t xml:space="preserve"> and verified everything is working fine across screen sizes.</w:t>
+      </w:r>
+      <w:r>
+        <w:t xml:space="preserve"> </w:t>
+      </w:r>
+      <w:r>
+        <w:t xml:space="preserve">While working on this, noticed we are building most layouts from scratch instead of reusing the existing </w:t>
+      </w:r>
+      <w:proofErr w:type="spellStart"/>
+      <w:r>
+        <w:t>AccountLayout.tsx</w:t>
+      </w:r>
+      <w:proofErr w:type="spellEnd"/>
+      <w:r>
+        <w:t xml:space="preserve"> component (currently used in Orders, Wishlist, Notifications, Personal Info, etc.).</w:t>
+      </w:r>
+      <w:r>
+        <w:t xml:space="preserve"> </w:t>
+      </w:r>
+      <w:r>
+        <w:t xml:space="preserve">Current implementation is stable and no issues found, but for a cleaner long-term responsive solution we may eventually need to refactor </w:t>
+      </w:r>
+      <w:proofErr w:type="spellStart"/>
+      <w:r>
+        <w:t>AccountLayout.tsx</w:t>
+      </w:r>
+      <w:proofErr w:type="spellEnd"/>
+      <w:r>
+        <w:t xml:space="preserve"> and reuse it for dashboard-related layouts as well, since adding sidebar responsiveness later would require additional refactoring effort.</w:t>
+      </w:r>
+    </w:p>
+    <w:p>
+      <w:pPr>
+        <w:pStyle w:val="NormalWeb"/>
+        <w:numPr>
+          <w:ilvl w:val="0"/>
+          <w:numId w:val="22"/>
+        </w:numPr>
+      </w:pPr>
+      <w:r>
+        <w:t>refactor: replace p tags with anchor tags using static link for map</w:t>
       </w:r>
     </w:p>
     <w:p>
@@ -2807,79 +2972,11 @@
         <w:pStyle w:val="ListParagraph"/>
         <w:numPr>
           <w:ilvl w:val="0"/>
-          <w:numId w:val="20"/>
-        </w:numPr>
-      </w:pPr>
-      <w:r>
-        <w:t xml:space="preserve">Analyzed </w:t>
-      </w:r>
-      <w:proofErr w:type="spellStart"/>
-      <w:r>
-        <w:t>MacStore</w:t>
-      </w:r>
-      <w:proofErr w:type="spellEnd"/>
-      <w:r>
-        <w:t xml:space="preserve"> project and identified a minor slider scroll issue along with some responsiveness issues on dashboard and a few pages, mainly on larger screen devices. </w:t>
-      </w:r>
-    </w:p>
-    <w:p>
-      <w:pPr>
-        <w:pStyle w:val="ListParagraph"/>
-        <w:numPr>
-          <w:ilvl w:val="0"/>
-          <w:numId w:val="20"/>
-        </w:numPr>
-      </w:pPr>
-      <w:r>
-        <w:t xml:space="preserve">Manually tested Contact Us form validations and documented that all required field validations are working correctly and admin receives customer requests successfully. </w:t>
-      </w:r>
-    </w:p>
-    <w:p>
-      <w:pPr>
-        <w:pStyle w:val="ListParagraph"/>
-        <w:numPr>
-          <w:ilvl w:val="0"/>
-          <w:numId w:val="20"/>
-        </w:numPr>
-      </w:pPr>
-      <w:r>
-        <w:t xml:space="preserve">Offer backend pricing issue still needs senior review. Frontend is sending offer data correctly, but admin side is not receiving the offer price properly. </w:t>
-      </w:r>
-    </w:p>
-    <w:p>
-      <w:pPr>
-        <w:pStyle w:val="ListParagraph"/>
-        <w:numPr>
-          <w:ilvl w:val="0"/>
-          <w:numId w:val="20"/>
-        </w:numPr>
-      </w:pPr>
-      <w:r>
-        <w:t xml:space="preserve">Some pages still require responsiveness review and improvements. </w:t>
-      </w:r>
-    </w:p>
-    <w:p>
-      <w:pPr>
-        <w:pStyle w:val="ListParagraph"/>
-        <w:numPr>
-          <w:ilvl w:val="0"/>
-          <w:numId w:val="20"/>
-        </w:numPr>
-      </w:pPr>
-      <w:r>
-        <w:t xml:space="preserve">Identified a few content/naming typos that can be improved for clearer messaging. </w:t>
-      </w:r>
-    </w:p>
-    <w:p>
-      <w:pPr>
-        <w:pStyle w:val="ListParagraph"/>
-        <w:numPr>
-          <w:ilvl w:val="0"/>
-          <w:numId w:val="20"/>
-        </w:numPr>
-      </w:pPr>
-      <w:r>
-        <w:t>Suggested some UI/UX refactoring improvements for better overall experience.</w:t>
+          <w:numId w:val="22"/>
+        </w:numPr>
+      </w:pPr>
+      <w:r>
+        <w:t xml:space="preserve">Tested the changed things everything is working fine. </w:t>
       </w:r>
     </w:p>
     <w:p>
@@ -2892,198 +2989,11 @@
         <w:pStyle w:val="Heading1"/>
       </w:pPr>
       <w:r>
+        <w:rPr>
+          <w:highlight w:val="yellow"/>
+        </w:rPr>
         <w:lastRenderedPageBreak/>
-        <w:t xml:space="preserve">May 26 2026: Tuesday login: 9:15 am </w:t>
-      </w:r>
-      <w:proofErr w:type="gramStart"/>
-      <w:r>
-        <w:t>logout:5:00</w:t>
-      </w:r>
-      <w:proofErr w:type="gramEnd"/>
-      <w:r>
-        <w:t xml:space="preserve"> pm</w:t>
-      </w:r>
-    </w:p>
-    <w:p>
-      <w:r>
-        <w:t>Mac Store:</w:t>
-      </w:r>
-    </w:p>
-    <w:p>
-      <w:pPr>
-        <w:pStyle w:val="ListParagraph"/>
-        <w:numPr>
-          <w:ilvl w:val="0"/>
-          <w:numId w:val="21"/>
-        </w:numPr>
-      </w:pPr>
-      <w:r>
-        <w:t>On mobile and tablet devices, the slider was blocking vertical scrolling, the auto-slide stopped on touch and resumed with delay, and the navigation buttons were incorrectly positioned in the middle.</w:t>
-      </w:r>
-      <w:r>
-        <w:t xml:space="preserve"> </w:t>
-      </w:r>
-      <w:r>
-        <w:t>All issues are resolved, and the section is now fully responsive with smooth scrolling, stable auto-slide on touch devices, and correctly positioned navigation buttons.</w:t>
-      </w:r>
-      <w:r>
-        <w:t xml:space="preserve"> Chances made in </w:t>
-      </w:r>
-      <w:proofErr w:type="spellStart"/>
-      <w:r>
-        <w:t>NewLaunchesClient.tsx</w:t>
-      </w:r>
-      <w:proofErr w:type="spellEnd"/>
-    </w:p>
-    <w:p>
-      <w:pPr>
-        <w:pStyle w:val="ListParagraph"/>
-        <w:numPr>
-          <w:ilvl w:val="0"/>
-          <w:numId w:val="21"/>
-        </w:numPr>
-      </w:pPr>
-      <w:r>
-        <w:t>Create a doc highlighting some bugs on the frontend and send to the senior developer</w:t>
-      </w:r>
-    </w:p>
-    <w:p>
-      <w:r>
-        <w:br w:type="page"/>
-      </w:r>
-    </w:p>
-    <w:p>
-      <w:pPr>
-        <w:pStyle w:val="Heading1"/>
-      </w:pPr>
-      <w:r>
-        <w:rPr>
-          <w:highlight w:val="yellow"/>
-        </w:rPr>
-        <w:lastRenderedPageBreak/>
-        <w:t xml:space="preserve">May 27 2026: </w:t>
-      </w:r>
-      <w:proofErr w:type="gramStart"/>
-      <w:r>
-        <w:rPr>
-          <w:highlight w:val="yellow"/>
-        </w:rPr>
-        <w:t>login:9:01</w:t>
-      </w:r>
-      <w:proofErr w:type="gramEnd"/>
-      <w:r>
-        <w:rPr>
-          <w:highlight w:val="yellow"/>
-        </w:rPr>
-        <w:t xml:space="preserve"> logout:5:00</w:t>
-      </w:r>
-    </w:p>
-    <w:p>
-      <w:r>
-        <w:t xml:space="preserve">Mac store: </w:t>
-      </w:r>
-    </w:p>
-    <w:p>
-      <w:pPr>
-        <w:pStyle w:val="ListParagraph"/>
-        <w:numPr>
-          <w:ilvl w:val="0"/>
-          <w:numId w:val="22"/>
-        </w:numPr>
-      </w:pPr>
-      <w:r>
-        <w:t xml:space="preserve">Worked on making the user dashboard responsive across mobile/tablet devices. Updated </w:t>
-      </w:r>
-      <w:proofErr w:type="spellStart"/>
-      <w:r>
-        <w:t>AccountDashboardClient.tsx</w:t>
-      </w:r>
-      <w:proofErr w:type="spellEnd"/>
-      <w:r>
-        <w:t xml:space="preserve"> and verified everything is working fine across screen sizes.</w:t>
-      </w:r>
-      <w:r>
-        <w:t xml:space="preserve"> </w:t>
-      </w:r>
-      <w:r>
-        <w:t xml:space="preserve">While working on this, noticed we are building most layouts from scratch instead of reusing the existing </w:t>
-      </w:r>
-      <w:proofErr w:type="spellStart"/>
-      <w:r>
-        <w:t>AccountLayout.tsx</w:t>
-      </w:r>
-      <w:proofErr w:type="spellEnd"/>
-      <w:r>
-        <w:t xml:space="preserve"> component (currently used in Orders, Wishlist, Notifications, Personal Info, etc.).</w:t>
-      </w:r>
-      <w:r>
-        <w:t xml:space="preserve"> </w:t>
-      </w:r>
-      <w:r>
-        <w:t xml:space="preserve">Current implementation is stable and no issues found, but for a cleaner long-term responsive solution we may eventually need to refactor </w:t>
-      </w:r>
-      <w:proofErr w:type="spellStart"/>
-      <w:r>
-        <w:t>AccountLayout.tsx</w:t>
-      </w:r>
-      <w:proofErr w:type="spellEnd"/>
-      <w:r>
-        <w:t xml:space="preserve"> and reuse it for dashboard-related layouts as well, since adding sidebar responsiveness later would require additional refactoring effort.</w:t>
-      </w:r>
-    </w:p>
-    <w:p>
-      <w:pPr>
-        <w:pStyle w:val="NormalWeb"/>
-        <w:numPr>
-          <w:ilvl w:val="0"/>
-          <w:numId w:val="22"/>
-        </w:numPr>
-      </w:pPr>
-      <w:r>
-        <w:t>refactor: replace p tags with anchor tags using static link for map</w:t>
-      </w:r>
-    </w:p>
-    <w:p>
-      <w:pPr>
-        <w:pStyle w:val="ListParagraph"/>
-        <w:numPr>
-          <w:ilvl w:val="0"/>
-          <w:numId w:val="22"/>
-        </w:numPr>
-      </w:pPr>
-      <w:r>
-        <w:t xml:space="preserve">Tested the changed things everything is working fine. </w:t>
-      </w:r>
-    </w:p>
-    <w:p>
-      <w:r>
-        <w:br w:type="page"/>
-      </w:r>
-    </w:p>
-    <w:p>
-      <w:pPr>
-        <w:pStyle w:val="Heading1"/>
-      </w:pPr>
-      <w:r>
-        <w:rPr>
-          <w:highlight w:val="yellow"/>
-        </w:rPr>
-        <w:lastRenderedPageBreak/>
-        <w:t xml:space="preserve">May 28 2026 </w:t>
-      </w:r>
-      <w:proofErr w:type="gramStart"/>
-      <w:r>
-        <w:rPr>
-          <w:highlight w:val="yellow"/>
-        </w:rPr>
-        <w:t>login:8:50</w:t>
-      </w:r>
-      <w:proofErr w:type="gramEnd"/>
-      <w:r>
-        <w:rPr>
-          <w:highlight w:val="yellow"/>
-        </w:rPr>
-        <w:t>pm logout: 5:00pm</w:t>
+        <w:t>May 28 2026 login:8:50pm logout: 5:00pm</w:t>
       </w:r>
     </w:p>
     <w:p>
@@ -3919,30 +3829,18 @@
       </w:r>
     </w:p>
     <w:p>
-      <w:proofErr w:type="gramStart"/>
       <w:r>
         <w:t>Or:---------------------------------------------------------------------</w:t>
       </w:r>
-      <w:proofErr w:type="gramEnd"/>
-    </w:p>
-    <w:p>
-      <w:proofErr w:type="gramStart"/>
-      <w:r>
-        <w:t>  Analyzed</w:t>
-      </w:r>
-      <w:proofErr w:type="gramEnd"/>
-      <w:r>
-        <w:t xml:space="preserve"> profile update issue and created report for senior review.</w:t>
-      </w:r>
-    </w:p>
-    <w:p>
-      <w:proofErr w:type="gramStart"/>
-      <w:r>
-        <w:t>  Observed</w:t>
-      </w:r>
-      <w:proofErr w:type="gramEnd"/>
-      <w:r>
-        <w:t xml:space="preserve"> that profile data updates in backend but UI updates only after refresh (possible </w:t>
+    </w:p>
+    <w:p>
+      <w:r>
+        <w:t>  Analyzed profile update issue and created report for senior review.</w:t>
+      </w:r>
+    </w:p>
+    <w:p>
+      <w:r>
+        <w:t xml:space="preserve">  Observed that profile data updates in backend but UI updates only after refresh (possible </w:t>
       </w:r>
       <w:proofErr w:type="spellStart"/>
       <w:r>
@@ -3954,33 +3852,18 @@
       </w:r>
     </w:p>
     <w:p>
-      <w:proofErr w:type="gramStart"/>
-      <w:r>
-        <w:t>  Identified</w:t>
-      </w:r>
-      <w:proofErr w:type="gramEnd"/>
-      <w:r>
-        <w:t xml:space="preserve"> latitude and longitude values are not being stored properly, causing address update issues in admin panel.</w:t>
-      </w:r>
-    </w:p>
-    <w:p>
-      <w:proofErr w:type="gramStart"/>
-      <w:r>
-        <w:t>  Investigated</w:t>
-      </w:r>
-      <w:proofErr w:type="gramEnd"/>
-      <w:r>
-        <w:t xml:space="preserve"> order/product data issue where product details are showing null/empty in admin order view.</w:t>
-      </w:r>
-    </w:p>
-    <w:p>
-      <w:proofErr w:type="gramStart"/>
-      <w:r>
-        <w:t>  Verified</w:t>
-      </w:r>
-      <w:proofErr w:type="gramEnd"/>
-      <w:r>
-        <w:t xml:space="preserve"> that order status flow is working correctly:</w:t>
+      <w:r>
+        <w:t>  Identified latitude and longitude values are not being stored properly, causing address update issues in admin panel.</w:t>
+      </w:r>
+    </w:p>
+    <w:p>
+      <w:r>
+        <w:t>  Investigated order/product data issue where product details are showing null/empty in admin order view.</w:t>
+      </w:r>
+    </w:p>
+    <w:p>
+      <w:r>
+        <w:t>  Verified that order status flow is working correctly:</w:t>
       </w:r>
     </w:p>
     <w:p>
@@ -4004,23 +3887,13 @@
       </w:r>
     </w:p>
     <w:p>
-      <w:proofErr w:type="gramStart"/>
-      <w:r>
-        <w:t>  Submitted</w:t>
-      </w:r>
-      <w:proofErr w:type="gramEnd"/>
-      <w:r>
-        <w:t xml:space="preserve"> PR for review and approval from senior.</w:t>
-      </w:r>
-    </w:p>
-    <w:p>
-      <w:proofErr w:type="gramStart"/>
-      <w:r>
-        <w:t>  Learned</w:t>
-      </w:r>
-      <w:proofErr w:type="gramEnd"/>
-      <w:r>
-        <w:t xml:space="preserve"> Git merge strategies and repository safety concepts:</w:t>
+      <w:r>
+        <w:t>  Submitted PR for review and approval from senior.</w:t>
+      </w:r>
+    </w:p>
+    <w:p>
+      <w:r>
+        <w:t>  Learned Git merge strategies and repository safety concepts:</w:t>
       </w:r>
     </w:p>
     <w:p>
@@ -4205,12 +4078,10 @@
         <w:t xml:space="preserve">, </w:t>
       </w:r>
       <w:proofErr w:type="spellStart"/>
-      <w:proofErr w:type="gramStart"/>
       <w:r>
         <w:t>router.replace</w:t>
       </w:r>
       <w:proofErr w:type="spellEnd"/>
-      <w:proofErr w:type="gramEnd"/>
       <w:r>
         <w:t xml:space="preserve">, and navigation fixes were tested, but the redirect was inconsistent and currently handled as a known UX limitation rather than a backend issue. </w:t>
       </w:r>
@@ -4293,7 +4164,6 @@
         <w:lastRenderedPageBreak/>
         <w:t xml:space="preserve">May 31 2026: Sunday login: 9:52am </w:t>
       </w:r>
-      <w:proofErr w:type="gramStart"/>
       <w:r>
         <w:rPr>
           <w:highlight w:val="yellow"/>
@@ -4304,14 +4174,7 @@
         <w:rPr>
           <w:highlight w:val="yellow"/>
         </w:rPr>
-        <w:t>:5:00</w:t>
-      </w:r>
-      <w:proofErr w:type="gramEnd"/>
-      <w:r>
-        <w:rPr>
-          <w:highlight w:val="yellow"/>
-        </w:rPr>
-        <w:t>pm</w:t>
+        <w:t>:5:00pm</w:t>
       </w:r>
     </w:p>
     <w:p>
@@ -4421,12 +4284,10 @@
         <w:t xml:space="preserve">Fix: remove those local states and use </w:t>
       </w:r>
       <w:proofErr w:type="spellStart"/>
-      <w:proofErr w:type="gramStart"/>
       <w:r>
         <w:t>customer.phone</w:t>
       </w:r>
       <w:proofErr w:type="spellEnd"/>
-      <w:proofErr w:type="gramEnd"/>
       <w:r>
         <w:t xml:space="preserve"> / </w:t>
       </w:r>
@@ -4781,12 +4642,10 @@
         <w:t xml:space="preserve">Dependencies: </w:t>
       </w:r>
       <w:proofErr w:type="spellStart"/>
-      <w:proofErr w:type="gramStart"/>
       <w:r>
         <w:t>package.json</w:t>
       </w:r>
       <w:proofErr w:type="spellEnd"/>
-      <w:proofErr w:type="gramEnd"/>
       <w:r>
         <w:t>, package-</w:t>
       </w:r>
@@ -5723,21 +5582,7 @@
           <w:highlight w:val="yellow"/>
         </w:rPr>
         <w:lastRenderedPageBreak/>
-        <w:t xml:space="preserve">June 5 2026 Friday Login: 8: 50 </w:t>
-      </w:r>
-      <w:proofErr w:type="gramStart"/>
-      <w:r>
-        <w:rPr>
-          <w:highlight w:val="yellow"/>
-        </w:rPr>
-        <w:t>logout</w:t>
-      </w:r>
-      <w:proofErr w:type="gramEnd"/>
-      <w:r>
-        <w:rPr>
-          <w:highlight w:val="yellow"/>
-        </w:rPr>
-        <w:t>:</w:t>
+        <w:t>June 5 2026 Friday Login: 8: 50 logout:</w:t>
       </w:r>
       <w:r>
         <w:t xml:space="preserve"> </w:t>
@@ -6146,21 +5991,7 @@
           <w:highlight w:val="yellow"/>
         </w:rPr>
         <w:lastRenderedPageBreak/>
-        <w:t xml:space="preserve">June 8 2026 </w:t>
-      </w:r>
-      <w:proofErr w:type="gramStart"/>
-      <w:r>
-        <w:rPr>
-          <w:highlight w:val="yellow"/>
-        </w:rPr>
-        <w:t>Monday  was</w:t>
-      </w:r>
-      <w:proofErr w:type="gramEnd"/>
-      <w:r>
-        <w:rPr>
-          <w:highlight w:val="yellow"/>
-        </w:rPr>
-        <w:t xml:space="preserve"> on leave</w:t>
+        <w:t>June 8 2026 Monday  was on leave</w:t>
       </w:r>
     </w:p>
     <w:p>
@@ -6454,21 +6285,7 @@
           <w:highlight w:val="yellow"/>
         </w:rPr>
         <w:lastRenderedPageBreak/>
-        <w:t xml:space="preserve">June 10 </w:t>
-      </w:r>
-      <w:proofErr w:type="gramStart"/>
-      <w:r>
-        <w:rPr>
-          <w:highlight w:val="yellow"/>
-        </w:rPr>
-        <w:t>2026 :</w:t>
-      </w:r>
-      <w:proofErr w:type="gramEnd"/>
-      <w:r>
-        <w:rPr>
-          <w:highlight w:val="yellow"/>
-        </w:rPr>
-        <w:t xml:space="preserve"> Wednesday login: 9:13 AM Logout</w:t>
+        <w:t>June 10 2026 : Wednesday login: 9:13 AM Logout</w:t>
       </w:r>
       <w:r>
         <w:t xml:space="preserve">: </w:t>
@@ -7037,15 +6854,7 @@
         </w:numPr>
       </w:pPr>
       <w:r>
-        <w:t xml:space="preserve">Used optional chaining </w:t>
-      </w:r>
-      <w:proofErr w:type="gramStart"/>
-      <w:r>
-        <w:t>(?.</w:t>
-      </w:r>
-      <w:proofErr w:type="gramEnd"/>
-      <w:r>
-        <w:t xml:space="preserve">) for safe property access. </w:t>
+        <w:t xml:space="preserve">Used optional chaining (?.) for safe property access. </w:t>
       </w:r>
     </w:p>
     <w:p>
@@ -7056,15 +6865,7 @@
         </w:numPr>
       </w:pPr>
       <w:r>
-        <w:t xml:space="preserve">Converted static content into structured arrays and rendered </w:t>
-      </w:r>
-      <w:proofErr w:type="gramStart"/>
-      <w:r>
-        <w:t>using .map</w:t>
-      </w:r>
-      <w:proofErr w:type="gramEnd"/>
-      <w:r>
-        <w:t xml:space="preserve">(). </w:t>
+        <w:t xml:space="preserve">Converted static content into structured arrays and rendered using .map(). </w:t>
       </w:r>
     </w:p>
     <w:p>
@@ -7727,29 +7528,7 @@
           <w:szCs w:val="20"/>
           <w14:ligatures w14:val="none"/>
         </w:rPr>
-        <w:t xml:space="preserve">  about: </w:t>
-      </w:r>
-      <w:proofErr w:type="gramStart"/>
-      <w:r>
-        <w:rPr>
-          <w:rFonts w:ascii="Courier New" w:eastAsia="Times New Roman" w:hAnsi="Courier New" w:cs="Courier New"/>
-          <w:kern w:val="0"/>
-          <w:sz w:val="20"/>
-          <w:szCs w:val="20"/>
-          <w14:ligatures w14:val="none"/>
-        </w:rPr>
-        <w:t>string[</w:t>
-      </w:r>
-      <w:proofErr w:type="gramEnd"/>
-      <w:r>
-        <w:rPr>
-          <w:rFonts w:ascii="Courier New" w:eastAsia="Times New Roman" w:hAnsi="Courier New" w:cs="Courier New"/>
-          <w:kern w:val="0"/>
-          <w:sz w:val="20"/>
-          <w:szCs w:val="20"/>
-          <w14:ligatures w14:val="none"/>
-        </w:rPr>
-        <w:t>];</w:t>
+        <w:t xml:space="preserve">  about: string[];</w:t>
       </w:r>
     </w:p>
     <w:p>
@@ -9395,7 +9174,6 @@
         <w:t xml:space="preserve">Handle undefined data using </w:t>
       </w:r>
       <w:proofErr w:type="spellStart"/>
-      <w:proofErr w:type="gramStart"/>
       <w:r>
         <w:rPr>
           <w:rFonts w:ascii="Times New Roman" w:eastAsia="Times New Roman" w:hAnsi="Times New Roman" w:cs="Times New Roman"/>
@@ -9411,16 +9189,7 @@
           <w:kern w:val="0"/>
           <w14:ligatures w14:val="none"/>
         </w:rPr>
-        <w:t>(</w:t>
-      </w:r>
-      <w:proofErr w:type="gramEnd"/>
-      <w:r>
-        <w:rPr>
-          <w:rFonts w:ascii="Times New Roman" w:eastAsia="Times New Roman" w:hAnsi="Times New Roman" w:cs="Times New Roman"/>
-          <w:kern w:val="0"/>
-          <w14:ligatures w14:val="none"/>
-        </w:rPr>
-        <w:t>).</w:t>
+        <w:t>().</w:t>
       </w:r>
     </w:p>
     <w:p>
@@ -9620,7 +9389,6 @@
         <w:t>/</w:t>
       </w:r>
       <w:proofErr w:type="spellStart"/>
-      <w:proofErr w:type="gramStart"/>
       <w:r>
         <w:rPr>
           <w:rFonts w:ascii="Courier New" w:eastAsia="Times New Roman" w:hAnsi="Courier New" w:cs="Courier New"/>
@@ -9629,18 +9397,7 @@
           <w:szCs w:val="20"/>
           <w14:ligatures w14:val="none"/>
         </w:rPr>
-        <w:t>search</w:t>
-      </w:r>
-      <w:proofErr w:type="gramEnd"/>
-      <w:r>
-        <w:rPr>
-          <w:rFonts w:ascii="Courier New" w:eastAsia="Times New Roman" w:hAnsi="Courier New" w:cs="Courier New"/>
-          <w:kern w:val="0"/>
-          <w:sz w:val="20"/>
-          <w:szCs w:val="20"/>
-          <w14:ligatures w14:val="none"/>
-        </w:rPr>
-        <w:t>?q</w:t>
+        <w:t>search?q</w:t>
       </w:r>
       <w:proofErr w:type="spellEnd"/>
       <w:r>
@@ -10213,15 +9970,7 @@
         </w:numPr>
       </w:pPr>
       <w:r>
-        <w:t xml:space="preserve">Make 2 doc and send it </w:t>
-      </w:r>
-      <w:proofErr w:type="gramStart"/>
-      <w:r>
-        <w:t>to</w:t>
-      </w:r>
-      <w:proofErr w:type="gramEnd"/>
-      <w:r>
-        <w:t xml:space="preserve"> senior</w:t>
+        <w:t>Make 2 doc and send it to senior</w:t>
       </w:r>
     </w:p>
     <w:p>
@@ -11653,21 +11402,7 @@
           <w:highlight w:val="yellow"/>
         </w:rPr>
         <w:lastRenderedPageBreak/>
-        <w:t xml:space="preserve">June 19 2026 Friday </w:t>
-      </w:r>
-      <w:proofErr w:type="gramStart"/>
-      <w:r>
-        <w:rPr>
-          <w:highlight w:val="yellow"/>
-        </w:rPr>
-        <w:t>login :</w:t>
-      </w:r>
-      <w:proofErr w:type="gramEnd"/>
-      <w:r>
-        <w:rPr>
-          <w:highlight w:val="yellow"/>
-        </w:rPr>
-        <w:t>9:06 logout: 5:00</w:t>
+        <w:t>June 19 2026 Friday login :9:06 logout: 5:00</w:t>
       </w:r>
     </w:p>
     <w:p>
@@ -11846,7 +11581,6 @@
         <w:t xml:space="preserve">Tested banner creation and display functionality; verified that everything is working as </w:t>
       </w:r>
       <w:proofErr w:type="spellStart"/>
-      <w:proofErr w:type="gramStart"/>
       <w:r>
         <w:t>expected.</w:t>
       </w:r>
@@ -11854,7 +11588,6 @@
         <w:t>Improved</w:t>
       </w:r>
       <w:proofErr w:type="spellEnd"/>
-      <w:proofErr w:type="gramEnd"/>
       <w:r>
         <w:t xml:space="preserve"> mobile responsiveness of the banner content and CTA link.</w:t>
       </w:r>
@@ -12414,15 +12147,7 @@
         </w:numPr>
       </w:pPr>
       <w:r>
-        <w:t xml:space="preserve">Observed that the API started showing issues after multiple </w:t>
-      </w:r>
-      <w:proofErr w:type="gramStart"/>
-      <w:r>
-        <w:t>test</w:t>
-      </w:r>
-      <w:proofErr w:type="gramEnd"/>
-      <w:r>
-        <w:t xml:space="preserve"> runs and performed further analysis to understand the possible cause.</w:t>
+        <w:t>Observed that the API started showing issues after multiple test runs and performed further analysis to understand the possible cause.</w:t>
       </w:r>
     </w:p>
     <w:p>
@@ -12641,12 +12366,10 @@
         <w:t xml:space="preserve">Debugged subcategory slug mismatch — subcategory param was incorrectly extracting the parent category slug from </w:t>
       </w:r>
       <w:proofErr w:type="spellStart"/>
-      <w:proofErr w:type="gramStart"/>
       <w:r>
         <w:t>c.href</w:t>
       </w:r>
       <w:proofErr w:type="spellEnd"/>
-      <w:proofErr w:type="gramEnd"/>
       <w:r>
         <w:t xml:space="preserve"> instead of using the child's own slug. </w:t>
       </w:r>
@@ -13277,21 +13000,10 @@
           <w:highlight w:val="yellow"/>
         </w:rPr>
         <w:lastRenderedPageBreak/>
-        <w:t xml:space="preserve">June 26 2026 Friday Login: 9:02 AM </w:t>
-      </w:r>
-      <w:proofErr w:type="gramStart"/>
-      <w:r>
-        <w:rPr>
-          <w:highlight w:val="yellow"/>
-        </w:rPr>
-        <w:t>Logout:</w:t>
-      </w:r>
-      <w:r>
-        <w:t>5:00</w:t>
-      </w:r>
-      <w:proofErr w:type="gramEnd"/>
-      <w:r>
-        <w:t xml:space="preserve"> PM</w:t>
+        <w:t>June 26 2026 Friday Login: 9:02 AM Logout:</w:t>
+      </w:r>
+      <w:r>
+        <w:t>5:00 PM</w:t>
       </w:r>
     </w:p>
     <w:p>
@@ -13436,19 +13148,11 @@
         </w:rPr>
         <w:t xml:space="preserve"> </w:t>
       </w:r>
-      <w:proofErr w:type="gramStart"/>
       <w:r>
         <w:rPr>
           <w:highlight w:val="yellow"/>
         </w:rPr>
-        <w:t>2026  (</w:t>
-      </w:r>
-      <w:proofErr w:type="gramEnd"/>
-      <w:r>
-        <w:rPr>
-          <w:highlight w:val="yellow"/>
-        </w:rPr>
-        <w:t>Sun Mon Tue) : was on leave</w:t>
+        <w:t>2026  (Sun Mon Tue) : was on leave</w:t>
       </w:r>
     </w:p>
     <w:p/>
@@ -13516,22 +13220,144 @@
         </w:rPr>
         <w:t xml:space="preserve"> AM </w:t>
       </w:r>
-      <w:proofErr w:type="gramStart"/>
       <w:r>
         <w:rPr>
           <w:highlight w:val="yellow"/>
         </w:rPr>
-        <w:t>Logout:5:00</w:t>
-      </w:r>
-      <w:proofErr w:type="gramEnd"/>
+        <w:t>Logout:5:00 PM</w:t>
+      </w:r>
+    </w:p>
+    <w:p/>
+    <w:p>
+      <w:pPr>
+        <w:pStyle w:val="ListParagraph"/>
+        <w:numPr>
+          <w:ilvl w:val="0"/>
+          <w:numId w:val="84"/>
+        </w:numPr>
+      </w:pPr>
+      <w:r>
+        <w:t xml:space="preserve">Explained the category/collection navigation fixes and product listing changes, then pushed the code and got it merged into the main branch. </w:t>
+      </w:r>
+    </w:p>
+    <w:p>
+      <w:pPr>
+        <w:pStyle w:val="ListParagraph"/>
+        <w:numPr>
+          <w:ilvl w:val="0"/>
+          <w:numId w:val="84"/>
+        </w:numPr>
+      </w:pPr>
+      <w:r>
+        <w:t xml:space="preserve">Updated him on all codebase changes and development progress that happened during his one-week leave. </w:t>
+      </w:r>
+    </w:p>
+    <w:p>
+      <w:pPr>
+        <w:pStyle w:val="ListParagraph"/>
+        <w:numPr>
+          <w:ilvl w:val="0"/>
+          <w:numId w:val="84"/>
+        </w:numPr>
+      </w:pPr>
+      <w:r>
+        <w:t xml:space="preserve">Discussed the overall codebase, current system behavior, working and pending areas, and aligned on tomorrow's priorities. </w:t>
+      </w:r>
+    </w:p>
+    <w:p>
+      <w:pPr>
+        <w:pStyle w:val="ListParagraph"/>
+        <w:numPr>
+          <w:ilvl w:val="0"/>
+          <w:numId w:val="84"/>
+        </w:numPr>
+      </w:pPr>
+      <w:r>
+        <w:t xml:space="preserve">Had an initial discussion with the </w:t>
+      </w:r>
+      <w:r>
+        <w:t>senior</w:t>
+      </w:r>
+      <w:r>
+        <w:t xml:space="preserve"> regarding</w:t>
+      </w:r>
+      <w:r>
+        <w:t xml:space="preserve"> what is meta with developer</w:t>
+      </w:r>
+      <w:r>
+        <w:t xml:space="preserve"> and </w:t>
+      </w:r>
+      <w:r>
+        <w:t>study about it</w:t>
+      </w:r>
+      <w:r>
+        <w:t>.</w:t>
+      </w:r>
+    </w:p>
+    <w:p>
+      <w:pPr>
+        <w:pStyle w:val="ListParagraph"/>
+        <w:numPr>
+          <w:ilvl w:val="0"/>
+          <w:numId w:val="84"/>
+        </w:numPr>
+      </w:pPr>
+      <w:r>
+        <w:t>Show him the frontend of webbing plex and pages that got designed</w:t>
+      </w:r>
+      <w:r>
+        <w:t xml:space="preserve"> and the flow.</w:t>
+      </w:r>
+    </w:p>
+    <w:p>
+      <w:pPr>
+        <w:pStyle w:val="ListParagraph"/>
+        <w:numPr>
+          <w:ilvl w:val="0"/>
+          <w:numId w:val="84"/>
+        </w:numPr>
+      </w:pPr>
+      <w:r>
+        <w:t xml:space="preserve">Transfer the ownership of the project </w:t>
+      </w:r>
+      <w:proofErr w:type="spellStart"/>
+      <w:r>
+        <w:t>webbingplex</w:t>
+      </w:r>
+      <w:proofErr w:type="spellEnd"/>
+    </w:p>
+    <w:p>
+      <w:r>
+        <w:br w:type="page"/>
+      </w:r>
+    </w:p>
+    <w:p>
+      <w:pPr>
+        <w:pStyle w:val="Heading1"/>
+      </w:pPr>
       <w:r>
         <w:rPr>
           <w:highlight w:val="yellow"/>
         </w:rPr>
-        <w:t xml:space="preserve"> PM</w:t>
-      </w:r>
-    </w:p>
-    <w:p/>
+        <w:lastRenderedPageBreak/>
+        <w:t xml:space="preserve">July </w:t>
+      </w:r>
+      <w:r>
+        <w:rPr>
+          <w:highlight w:val="yellow"/>
+        </w:rPr>
+        <w:t>02</w:t>
+      </w:r>
+      <w:r>
+        <w:rPr>
+          <w:highlight w:val="yellow"/>
+        </w:rPr>
+        <w:t xml:space="preserve"> 2026 Thursday Login: 9:29 AM Logout:</w:t>
+      </w:r>
+      <w:r>
+        <w:t xml:space="preserve"> 5:00 PM</w:t>
+      </w:r>
+    </w:p>
     <w:p>
       <w:pPr>
         <w:pStyle w:val="ListParagraph"/>
@@ -13541,7 +13367,7 @@
         </w:numPr>
       </w:pPr>
       <w:r>
-        <w:t xml:space="preserve">Explained the category/collection navigation fixes and product listing changes, then pushed the code and got it merged into the main branch. </w:t>
+        <w:t>Verified the admin panel new arrivals functionality after manual test.</w:t>
       </w:r>
     </w:p>
     <w:p>
@@ -13553,7 +13379,7 @@
         </w:numPr>
       </w:pPr>
       <w:r>
-        <w:t xml:space="preserve">Updated him on all codebase changes and development progress that happened during his one-week leave. </w:t>
+        <w:t xml:space="preserve">Analyzed the new arrival section and identified responsiveness and UI issues. Completed the basic fixes; the code will be pushed after the review. </w:t>
       </w:r>
     </w:p>
     <w:p>
@@ -13565,7 +13391,7 @@
         </w:numPr>
       </w:pPr>
       <w:r>
-        <w:t xml:space="preserve">Discussed the overall codebase, current system behavior, working and pending areas, and aligned on tomorrow's priorities. </w:t>
+        <w:t xml:space="preserve">Set up PHP for the senior, completed the configuration, and pushed the builds. This took a significant amount of time due to configuration errors that required troubleshooting. </w:t>
       </w:r>
     </w:p>
     <w:p>
@@ -13577,25 +13403,10 @@
         </w:numPr>
       </w:pPr>
       <w:r>
-        <w:t xml:space="preserve">Had an initial discussion with the </w:t>
-      </w:r>
-      <w:r>
-        <w:t>senior</w:t>
-      </w:r>
-      <w:r>
-        <w:t xml:space="preserve"> regarding</w:t>
-      </w:r>
-      <w:r>
-        <w:t xml:space="preserve"> what is meta with developer</w:t>
-      </w:r>
-      <w:r>
-        <w:t xml:space="preserve"> and </w:t>
-      </w:r>
-      <w:r>
-        <w:t>study about it</w:t>
-      </w:r>
-      <w:r>
-        <w:t>.</w:t>
+        <w:t>Had discussions with the senior regarding ongoing tasks and implementation details</w:t>
+      </w:r>
+      <w:r>
+        <w:t xml:space="preserve"> of mac.</w:t>
       </w:r>
     </w:p>
     <w:p>
@@ -13607,10 +13418,77 @@
         </w:numPr>
       </w:pPr>
       <w:r>
-        <w:t>Show him the frontend of webbing plex and pages that got designed</w:t>
-      </w:r>
-      <w:r>
-        <w:t xml:space="preserve"> and the flow.</w:t>
+        <w:t xml:space="preserve">Clone the repo of </w:t>
+      </w:r>
+      <w:proofErr w:type="spellStart"/>
+      <w:r>
+        <w:t>mayau</w:t>
+      </w:r>
+      <w:proofErr w:type="spellEnd"/>
+      <w:r>
+        <w:t xml:space="preserve"> tech for tomorrow priority </w:t>
+      </w:r>
+    </w:p>
+    <w:p>
+      <w:r>
+        <w:br w:type="page"/>
+      </w:r>
+    </w:p>
+    <w:p>
+      <w:pPr>
+        <w:pStyle w:val="Heading1"/>
+      </w:pPr>
+      <w:r>
+        <w:rPr>
+          <w:highlight w:val="yellow"/>
+        </w:rPr>
+        <w:lastRenderedPageBreak/>
+        <w:t xml:space="preserve">July </w:t>
+      </w:r>
+      <w:r>
+        <w:rPr>
+          <w:highlight w:val="yellow"/>
+        </w:rPr>
+        <w:t>03</w:t>
+      </w:r>
+      <w:r>
+        <w:rPr>
+          <w:highlight w:val="yellow"/>
+        </w:rPr>
+        <w:t xml:space="preserve"> 2026 Thursday Login: 9:</w:t>
+      </w:r>
+      <w:r>
+        <w:rPr>
+          <w:highlight w:val="yellow"/>
+        </w:rPr>
+        <w:t>08</w:t>
+      </w:r>
+      <w:r>
+        <w:rPr>
+          <w:highlight w:val="yellow"/>
+        </w:rPr>
+        <w:t xml:space="preserve"> </w:t>
+      </w:r>
+      <w:r>
+        <w:rPr>
+          <w:highlight w:val="yellow"/>
+        </w:rPr>
+        <w:t>AM Logout: 5:00 PM</w:t>
+      </w:r>
+    </w:p>
+    <w:p>
+      <w:pPr>
+        <w:rPr>
+          <w:b/>
+          <w:bCs/>
+        </w:rPr>
+      </w:pPr>
+      <w:r>
+        <w:rPr>
+          <w:b/>
+          <w:bCs/>
+        </w:rPr>
+        <w:t>Mac store:</w:t>
       </w:r>
     </w:p>
     <w:p>
@@ -13618,107 +13496,553 @@
         <w:pStyle w:val="ListParagraph"/>
         <w:numPr>
           <w:ilvl w:val="0"/>
+          <w:numId w:val="90"/>
+        </w:numPr>
+      </w:pPr>
+      <w:r>
+        <w:t xml:space="preserve">Pushed </w:t>
+      </w:r>
+      <w:r>
+        <w:rPr>
+          <w:b/>
+          <w:bCs/>
+        </w:rPr>
+        <w:t>New Arrivals</w:t>
+      </w:r>
+      <w:r>
+        <w:t xml:space="preserve"> code and integrated product API; verified basic rendering and ensured changes are ready for testing.</w:t>
+      </w:r>
+    </w:p>
+    <w:p>
+      <w:pPr>
+        <w:rPr>
+          <w:b/>
+          <w:bCs/>
+        </w:rPr>
+      </w:pPr>
+      <w:proofErr w:type="spellStart"/>
+      <w:r>
+        <w:rPr>
+          <w:b/>
+          <w:bCs/>
+        </w:rPr>
+        <w:t>Mayou</w:t>
+      </w:r>
+      <w:proofErr w:type="spellEnd"/>
+      <w:r>
+        <w:rPr>
+          <w:b/>
+          <w:bCs/>
+        </w:rPr>
+        <w:t>-Tech</w:t>
+      </w:r>
+      <w:r>
+        <w:rPr>
+          <w:b/>
+          <w:bCs/>
+        </w:rPr>
+        <w:t>:</w:t>
+      </w:r>
+    </w:p>
+    <w:p>
+      <w:pPr>
+        <w:pStyle w:val="ListParagraph"/>
+        <w:numPr>
+          <w:ilvl w:val="0"/>
           <w:numId w:val="84"/>
         </w:numPr>
       </w:pPr>
       <w:r>
-        <w:t xml:space="preserve">Transfer the ownership of the project </w:t>
+        <w:t xml:space="preserve">Created Product, </w:t>
       </w:r>
       <w:proofErr w:type="spellStart"/>
       <w:r>
-        <w:t>webbingplex</w:t>
+        <w:t>ProductListResponse</w:t>
       </w:r>
       <w:proofErr w:type="spellEnd"/>
-    </w:p>
-    <w:p>
-      <w:r>
-        <w:br w:type="page"/>
-      </w:r>
-    </w:p>
-    <w:p>
-      <w:pPr>
-        <w:pStyle w:val="Heading1"/>
-      </w:pPr>
-      <w:r>
-        <w:rPr>
-          <w:highlight w:val="yellow"/>
-        </w:rPr>
+      <w:r>
+        <w:t xml:space="preserve">, and </w:t>
+      </w:r>
+      <w:proofErr w:type="spellStart"/>
+      <w:r>
+        <w:t>ProductResponse</w:t>
+      </w:r>
+      <w:proofErr w:type="spellEnd"/>
+      <w:r>
+        <w:t xml:space="preserve"> types for API consistency </w:t>
+      </w:r>
+    </w:p>
+    <w:p>
+      <w:pPr>
+        <w:pStyle w:val="ListParagraph"/>
+        <w:numPr>
+          <w:ilvl w:val="0"/>
+          <w:numId w:val="84"/>
+        </w:numPr>
+      </w:pPr>
+      <w:r>
+        <w:t xml:space="preserve">Implemented </w:t>
+      </w:r>
+      <w:proofErr w:type="spellStart"/>
+      <w:r>
+        <w:t>getProducts</w:t>
+      </w:r>
+      <w:proofErr w:type="spellEnd"/>
+      <w:r>
+        <w:t xml:space="preserve">() function using generic </w:t>
+      </w:r>
+      <w:proofErr w:type="spellStart"/>
+      <w:r>
+        <w:t>apiFetch</w:t>
+      </w:r>
+      <w:proofErr w:type="spellEnd"/>
+      <w:r>
+        <w:t xml:space="preserve">&lt;T&gt; </w:t>
+      </w:r>
+    </w:p>
+    <w:p>
+      <w:pPr>
+        <w:pStyle w:val="ListParagraph"/>
+        <w:numPr>
+          <w:ilvl w:val="0"/>
+          <w:numId w:val="84"/>
+        </w:numPr>
+      </w:pPr>
+      <w:r>
+        <w:t xml:space="preserve">Ensured type-safe API response handling for product listing </w:t>
+      </w:r>
+    </w:p>
+    <w:p>
+      <w:pPr>
+        <w:pStyle w:val="ListParagraph"/>
+        <w:numPr>
+          <w:ilvl w:val="0"/>
+          <w:numId w:val="84"/>
+        </w:numPr>
+      </w:pPr>
+      <w:r>
+        <w:t xml:space="preserve">Verified GET request works with default fetch method </w:t>
+      </w:r>
+    </w:p>
+    <w:p>
+      <w:pPr>
+        <w:pStyle w:val="ListParagraph"/>
+        <w:numPr>
+          <w:ilvl w:val="0"/>
+          <w:numId w:val="84"/>
+        </w:numPr>
+      </w:pPr>
+      <w:r>
+        <w:t>Structured API layer for future extension (e.g., single product, CRUD operations)</w:t>
+      </w:r>
+    </w:p>
+    <w:p>
+      <w:pPr>
+        <w:rPr>
+          <w:b/>
+          <w:bCs/>
+        </w:rPr>
+      </w:pPr>
+      <w:r>
+        <w:rPr>
+          <w:b/>
+          <w:bCs/>
+        </w:rPr>
+        <w:t>Product A</w:t>
+      </w:r>
+      <w:r>
+        <w:rPr>
+          <w:b/>
+          <w:bCs/>
+        </w:rPr>
+        <w:t>PI</w:t>
+      </w:r>
+      <w:r>
+        <w:rPr>
+          <w:b/>
+          <w:bCs/>
+        </w:rPr>
+        <w:t xml:space="preserve"> integration </w:t>
+      </w:r>
+      <w:r>
+        <w:rPr>
+          <w:b/>
+          <w:bCs/>
+        </w:rPr>
+        <w:t>(</w:t>
+      </w:r>
+      <w:proofErr w:type="spellStart"/>
+      <w:r>
+        <w:rPr>
+          <w:b/>
+          <w:bCs/>
+        </w:rPr>
+        <w:t>mayoutech</w:t>
+      </w:r>
+      <w:proofErr w:type="spellEnd"/>
+      <w:r>
+        <w:rPr>
+          <w:b/>
+          <w:bCs/>
+        </w:rPr>
+        <w:t>)</w:t>
+      </w:r>
+    </w:p>
+    <w:p>
+      <w:pPr>
+        <w:numPr>
+          <w:ilvl w:val="0"/>
+          <w:numId w:val="88"/>
+        </w:numPr>
+      </w:pPr>
+      <w:r>
+        <w:t xml:space="preserve">Tested </w:t>
+      </w:r>
+      <w:proofErr w:type="spellStart"/>
+      <w:r>
+        <w:t>getAllProducts</w:t>
+      </w:r>
+      <w:proofErr w:type="spellEnd"/>
+      <w:r>
+        <w:t xml:space="preserve"> API — data is returning correctly as expected </w:t>
+      </w:r>
+    </w:p>
+    <w:p>
+      <w:pPr>
+        <w:numPr>
+          <w:ilvl w:val="0"/>
+          <w:numId w:val="88"/>
+        </w:numPr>
+      </w:pPr>
+      <w:r>
+        <w:t xml:space="preserve">Completed basic API integration into the existing codebase (initial base setup done) </w:t>
+      </w:r>
+    </w:p>
+    <w:p>
+      <w:pPr>
+        <w:numPr>
+          <w:ilvl w:val="0"/>
+          <w:numId w:val="88"/>
+        </w:numPr>
+      </w:pPr>
+      <w:r>
+        <w:t xml:space="preserve">Integrated product API into product display flow and confirmed products are rendering in UI </w:t>
+      </w:r>
+    </w:p>
+    <w:p>
+      <w:pPr>
+        <w:numPr>
+          <w:ilvl w:val="0"/>
+          <w:numId w:val="88"/>
+        </w:numPr>
+      </w:pPr>
+      <w:r>
+        <w:t>I</w:t>
+      </w:r>
+      <w:r>
+        <w:t>mage rendering in both admin panel and frontend</w:t>
+      </w:r>
+      <w:r>
+        <w:t xml:space="preserve"> are not displaying.</w:t>
+      </w:r>
+      <w:r>
+        <w:t xml:space="preserve"> </w:t>
+      </w:r>
+    </w:p>
+    <w:p>
+      <w:pPr>
+        <w:numPr>
+          <w:ilvl w:val="0"/>
+          <w:numId w:val="88"/>
+        </w:numPr>
+      </w:pPr>
+      <w:r>
+        <w:t xml:space="preserve">Refactored API usage structure with assistance to improve code quality and maintainability </w:t>
+      </w:r>
+    </w:p>
+    <w:p>
+      <w:pPr>
+        <w:numPr>
+          <w:ilvl w:val="0"/>
+          <w:numId w:val="88"/>
+        </w:numPr>
+      </w:pPr>
+      <w:r>
+        <w:t xml:space="preserve">Requires a review from senior </w:t>
+      </w:r>
+      <w:r>
+        <w:t xml:space="preserve">whether it follows best practices </w:t>
+      </w:r>
+    </w:p>
+    <w:p>
+      <w:pPr>
+        <w:ind w:firstLine="360"/>
+        <w:rPr>
+          <w:b/>
+          <w:bCs/>
+        </w:rPr>
+      </w:pPr>
+      <w:r>
+        <w:rPr>
+          <w:b/>
+          <w:bCs/>
+        </w:rPr>
+        <w:t>Affected files:</w:t>
+      </w:r>
+    </w:p>
+    <w:p>
+      <w:pPr>
+        <w:numPr>
+          <w:ilvl w:val="0"/>
+          <w:numId w:val="89"/>
+        </w:numPr>
+      </w:pPr>
+      <w:proofErr w:type="spellStart"/>
+      <w:r>
+        <w:t>src</w:t>
+      </w:r>
+      <w:proofErr w:type="spellEnd"/>
+      <w:r>
+        <w:t>/components/store/</w:t>
+      </w:r>
+      <w:proofErr w:type="spellStart"/>
+      <w:r>
+        <w:t>StoreCatelog.tsx</w:t>
+      </w:r>
+      <w:proofErr w:type="spellEnd"/>
+      <w:r>
+        <w:t xml:space="preserve"> </w:t>
+      </w:r>
+    </w:p>
+    <w:p>
+      <w:pPr>
+        <w:numPr>
+          <w:ilvl w:val="0"/>
+          <w:numId w:val="89"/>
+        </w:numPr>
+      </w:pPr>
+      <w:proofErr w:type="spellStart"/>
+      <w:r>
+        <w:t>src</w:t>
+      </w:r>
+      <w:proofErr w:type="spellEnd"/>
+      <w:r>
+        <w:t>/components/store/</w:t>
+      </w:r>
+      <w:proofErr w:type="spellStart"/>
+      <w:r>
+        <w:t>StoreProductCard.tsx</w:t>
+      </w:r>
+      <w:proofErr w:type="spellEnd"/>
+      <w:r>
+        <w:t xml:space="preserve"> </w:t>
+      </w:r>
+    </w:p>
+    <w:p>
+      <w:pPr>
+        <w:numPr>
+          <w:ilvl w:val="0"/>
+          <w:numId w:val="89"/>
+        </w:numPr>
+      </w:pPr>
+      <w:proofErr w:type="spellStart"/>
+      <w:r>
+        <w:t>src</w:t>
+      </w:r>
+      <w:proofErr w:type="spellEnd"/>
+      <w:r>
+        <w:t>/lib/</w:t>
+      </w:r>
+      <w:proofErr w:type="spellStart"/>
+      <w:r>
+        <w:t>api.ts</w:t>
+      </w:r>
+      <w:proofErr w:type="spellEnd"/>
+      <w:r>
+        <w:t xml:space="preserve"> </w:t>
+      </w:r>
+    </w:p>
+    <w:p>
+      <w:pPr>
+        <w:numPr>
+          <w:ilvl w:val="0"/>
+          <w:numId w:val="89"/>
+        </w:numPr>
+      </w:pPr>
+      <w:proofErr w:type="spellStart"/>
+      <w:r>
+        <w:t>src</w:t>
+      </w:r>
+      <w:proofErr w:type="spellEnd"/>
+      <w:r>
+        <w:t>/lib/</w:t>
+      </w:r>
+      <w:proofErr w:type="spellStart"/>
+      <w:r>
+        <w:t>productApi.ts</w:t>
+      </w:r>
+      <w:proofErr w:type="spellEnd"/>
+    </w:p>
+    <w:p>
+      <w:pPr>
+        <w:rPr>
+          <w:b/>
+          <w:bCs/>
+        </w:rPr>
+      </w:pPr>
+      <w:r>
+        <w:rPr>
+          <w:b/>
+          <w:bCs/>
+        </w:rPr>
+        <w:t>Category API Integration (</w:t>
+      </w:r>
+      <w:proofErr w:type="spellStart"/>
+      <w:r>
+        <w:rPr>
+          <w:b/>
+          <w:bCs/>
+        </w:rPr>
+        <w:t>mayoutech</w:t>
+      </w:r>
+      <w:proofErr w:type="spellEnd"/>
+      <w:r>
+        <w:rPr>
+          <w:b/>
+          <w:bCs/>
+        </w:rPr>
+        <w:t>):</w:t>
+      </w:r>
+    </w:p>
+    <w:p>
+      <w:pPr>
+        <w:pStyle w:val="ListParagraph"/>
+        <w:numPr>
+          <w:ilvl w:val="0"/>
+          <w:numId w:val="91"/>
+        </w:numPr>
+      </w:pPr>
+      <w:r>
+        <w:t xml:space="preserve">Implemented </w:t>
+      </w:r>
+      <w:proofErr w:type="spellStart"/>
+      <w:r>
+        <w:t>getCategories</w:t>
+      </w:r>
+      <w:proofErr w:type="spellEnd"/>
+      <w:r>
+        <w:t xml:space="preserve"> API and integrated the initial category data fetching flow.</w:t>
+      </w:r>
+    </w:p>
+    <w:p>
+      <w:pPr>
+        <w:pStyle w:val="ListParagraph"/>
+        <w:numPr>
+          <w:ilvl w:val="0"/>
+          <w:numId w:val="91"/>
+        </w:numPr>
+      </w:pPr>
+      <w:r>
+        <w:t>Completed basic API integration into the existing codebase</w:t>
+      </w:r>
+    </w:p>
+    <w:p>
+      <w:pPr>
+        <w:pStyle w:val="ListParagraph"/>
+        <w:numPr>
+          <w:ilvl w:val="0"/>
+          <w:numId w:val="91"/>
+        </w:numPr>
+      </w:pPr>
+      <w:r>
         <w:lastRenderedPageBreak/>
-        <w:t>July 26 2026 Thursday Login: 9:29 AM Logout:</w:t>
-      </w:r>
+        <w:t xml:space="preserve">Integrate category </w:t>
+      </w:r>
+      <w:proofErr w:type="spellStart"/>
+      <w:r>
+        <w:t>api</w:t>
+      </w:r>
+      <w:proofErr w:type="spellEnd"/>
+      <w:r>
+        <w:t xml:space="preserve"> to display list of categories</w:t>
+      </w:r>
+      <w:r>
+        <w:tab/>
+      </w:r>
+      <w:r>
+        <w:tab/>
+      </w:r>
+    </w:p>
+    <w:p>
+      <w:pPr>
+        <w:ind w:firstLine="360"/>
+        <w:rPr>
+          <w:b/>
+          <w:bCs/>
+        </w:rPr>
+      </w:pPr>
+      <w:r>
+        <w:rPr>
+          <w:b/>
+          <w:bCs/>
+        </w:rPr>
+        <w:t>Affected files:</w:t>
+      </w:r>
+    </w:p>
+    <w:p>
+      <w:pPr>
+        <w:numPr>
+          <w:ilvl w:val="0"/>
+          <w:numId w:val="89"/>
+        </w:numPr>
+      </w:pPr>
+      <w:proofErr w:type="spellStart"/>
+      <w:r>
+        <w:t>src</w:t>
+      </w:r>
+      <w:proofErr w:type="spellEnd"/>
+      <w:r>
+        <w:t>/components/store/</w:t>
+      </w:r>
+      <w:proofErr w:type="spellStart"/>
+      <w:r>
+        <w:t>Store</w:t>
+      </w:r>
+      <w:r>
+        <w:t>Sidebar.tsx</w:t>
+      </w:r>
+      <w:proofErr w:type="spellEnd"/>
       <w:r>
         <w:t xml:space="preserve"> </w:t>
       </w:r>
     </w:p>
     <w:p>
       <w:pPr>
-        <w:pStyle w:val="ListParagraph"/>
-        <w:numPr>
-          <w:ilvl w:val="0"/>
-          <w:numId w:val="84"/>
-        </w:numPr>
-      </w:pPr>
-      <w:r>
-        <w:t>Verified the admin panel new arrivals functionality after manual test.</w:t>
-      </w:r>
-    </w:p>
-    <w:p>
-      <w:pPr>
-        <w:pStyle w:val="ListParagraph"/>
-        <w:numPr>
-          <w:ilvl w:val="0"/>
-          <w:numId w:val="84"/>
-        </w:numPr>
-      </w:pPr>
-      <w:r>
-        <w:t xml:space="preserve">Analyzed the new arrival section and identified responsiveness and UI issues. Completed the basic fixes; the code will be pushed after the review. </w:t>
-      </w:r>
-    </w:p>
-    <w:p>
-      <w:pPr>
-        <w:pStyle w:val="ListParagraph"/>
-        <w:numPr>
-          <w:ilvl w:val="0"/>
-          <w:numId w:val="84"/>
-        </w:numPr>
-      </w:pPr>
-      <w:r>
-        <w:t xml:space="preserve">Set up PHP for the senior, completed the configuration, and pushed the builds. This took a significant amount of time due to configuration errors that required troubleshooting. </w:t>
-      </w:r>
-    </w:p>
-    <w:p>
-      <w:pPr>
-        <w:pStyle w:val="ListParagraph"/>
-        <w:numPr>
-          <w:ilvl w:val="0"/>
-          <w:numId w:val="84"/>
-        </w:numPr>
-      </w:pPr>
-      <w:r>
-        <w:t>Had discussions with the senior regarding ongoing tasks and implementation details</w:t>
-      </w:r>
-      <w:r>
-        <w:t xml:space="preserve"> of mac.</w:t>
-      </w:r>
-    </w:p>
-    <w:p>
-      <w:pPr>
-        <w:pStyle w:val="ListParagraph"/>
-        <w:numPr>
-          <w:ilvl w:val="0"/>
-          <w:numId w:val="84"/>
-        </w:numPr>
-      </w:pPr>
-      <w:r>
-        <w:t xml:space="preserve">Clone the repo of </w:t>
-      </w:r>
+        <w:numPr>
+          <w:ilvl w:val="0"/>
+          <w:numId w:val="89"/>
+        </w:numPr>
+      </w:pPr>
       <w:proofErr w:type="spellStart"/>
       <w:r>
-        <w:t>mayau</w:t>
+        <w:t>src</w:t>
       </w:r>
       <w:proofErr w:type="spellEnd"/>
       <w:r>
-        <w:t xml:space="preserve"> tech for tomorrow priority </w:t>
+        <w:t>/lib/</w:t>
+      </w:r>
+      <w:proofErr w:type="spellStart"/>
+      <w:r>
+        <w:t>Category</w:t>
+      </w:r>
+      <w:r>
+        <w:t>Api.ts</w:t>
+      </w:r>
+      <w:proofErr w:type="spellEnd"/>
+    </w:p>
+    <w:p>
+      <w:r>
+        <w:t xml:space="preserve">A pr request is made </w:t>
       </w:r>
     </w:p>
     <w:sectPr>
@@ -14479,6 +14803,119 @@
     </w:lvl>
   </w:abstractNum>
   <w:abstractNum w:abstractNumId="5" w15:restartNumberingAfterBreak="0">
+    <w:nsid w:val="09442CA2"/>
+    <w:multiLevelType w:val="hybridMultilevel"/>
+    <w:tmpl w:val="E3B8C8FA"/>
+    <w:lvl w:ilvl="0" w:tplc="04090001">
+      <w:start w:val="1"/>
+      <w:numFmt w:val="bullet"/>
+      <w:lvlText w:val=""/>
+      <w:lvlJc w:val="left"/>
+      <w:pPr>
+        <w:ind w:left="720" w:hanging="360"/>
+      </w:pPr>
+      <w:rPr>
+        <w:rFonts w:ascii="Symbol" w:hAnsi="Symbol" w:hint="default"/>
+      </w:rPr>
+    </w:lvl>
+    <w:lvl w:ilvl="1" w:tplc="04090003" w:tentative="1">
+      <w:start w:val="1"/>
+      <w:numFmt w:val="bullet"/>
+      <w:lvlText w:val="o"/>
+      <w:lvlJc w:val="left"/>
+      <w:pPr>
+        <w:ind w:left="1440" w:hanging="360"/>
+      </w:pPr>
+      <w:rPr>
+        <w:rFonts w:ascii="Courier New" w:hAnsi="Courier New" w:cs="Courier New" w:hint="default"/>
+      </w:rPr>
+    </w:lvl>
+    <w:lvl w:ilvl="2" w:tplc="04090005" w:tentative="1">
+      <w:start w:val="1"/>
+      <w:numFmt w:val="bullet"/>
+      <w:lvlText w:val=""/>
+      <w:lvlJc w:val="left"/>
+      <w:pPr>
+        <w:ind w:left="2160" w:hanging="360"/>
+      </w:pPr>
+      <w:rPr>
+        <w:rFonts w:ascii="Wingdings" w:hAnsi="Wingdings" w:hint="default"/>
+      </w:rPr>
+    </w:lvl>
+    <w:lvl w:ilvl="3" w:tplc="04090001" w:tentative="1">
+      <w:start w:val="1"/>
+      <w:numFmt w:val="bullet"/>
+      <w:lvlText w:val=""/>
+      <w:lvlJc w:val="left"/>
+      <w:pPr>
+        <w:ind w:left="2880" w:hanging="360"/>
+      </w:pPr>
+      <w:rPr>
+        <w:rFonts w:ascii="Symbol" w:hAnsi="Symbol" w:hint="default"/>
+      </w:rPr>
+    </w:lvl>
+    <w:lvl w:ilvl="4" w:tplc="04090003" w:tentative="1">
+      <w:start w:val="1"/>
+      <w:numFmt w:val="bullet"/>
+      <w:lvlText w:val="o"/>
+      <w:lvlJc w:val="left"/>
+      <w:pPr>
+        <w:ind w:left="3600" w:hanging="360"/>
+      </w:pPr>
+      <w:rPr>
+        <w:rFonts w:ascii="Courier New" w:hAnsi="Courier New" w:cs="Courier New" w:hint="default"/>
+      </w:rPr>
+    </w:lvl>
+    <w:lvl w:ilvl="5" w:tplc="04090005" w:tentative="1">
+      <w:start w:val="1"/>
+      <w:numFmt w:val="bullet"/>
+      <w:lvlText w:val=""/>
+      <w:lvlJc w:val="left"/>
+      <w:pPr>
+        <w:ind w:left="4320" w:hanging="360"/>
+      </w:pPr>
+      <w:rPr>
+        <w:rFonts w:ascii="Wingdings" w:hAnsi="Wingdings" w:hint="default"/>
+      </w:rPr>
+    </w:lvl>
+    <w:lvl w:ilvl="6" w:tplc="04090001" w:tentative="1">
+      <w:start w:val="1"/>
+      <w:numFmt w:val="bullet"/>
+      <w:lvlText w:val=""/>
+      <w:lvlJc w:val="left"/>
+      <w:pPr>
+        <w:ind w:left="5040" w:hanging="360"/>
+      </w:pPr>
+      <w:rPr>
+        <w:rFonts w:ascii="Symbol" w:hAnsi="Symbol" w:hint="default"/>
+      </w:rPr>
+    </w:lvl>
+    <w:lvl w:ilvl="7" w:tplc="04090003" w:tentative="1">
+      <w:start w:val="1"/>
+      <w:numFmt w:val="bullet"/>
+      <w:lvlText w:val="o"/>
+      <w:lvlJc w:val="left"/>
+      <w:pPr>
+        <w:ind w:left="5760" w:hanging="360"/>
+      </w:pPr>
+      <w:rPr>
+        <w:rFonts w:ascii="Courier New" w:hAnsi="Courier New" w:cs="Courier New" w:hint="default"/>
+      </w:rPr>
+    </w:lvl>
+    <w:lvl w:ilvl="8" w:tplc="04090005" w:tentative="1">
+      <w:start w:val="1"/>
+      <w:numFmt w:val="bullet"/>
+      <w:lvlText w:val=""/>
+      <w:lvlJc w:val="left"/>
+      <w:pPr>
+        <w:ind w:left="6480" w:hanging="360"/>
+      </w:pPr>
+      <w:rPr>
+        <w:rFonts w:ascii="Wingdings" w:hAnsi="Wingdings" w:hint="default"/>
+      </w:rPr>
+    </w:lvl>
+  </w:abstractNum>
+  <w:abstractNum w:abstractNumId="6" w15:restartNumberingAfterBreak="0">
     <w:nsid w:val="0A2733E1"/>
     <w:multiLevelType w:val="multilevel"/>
     <w:tmpl w:val="1BBE9F4A"/>
@@ -14627,7 +15064,7 @@
       </w:rPr>
     </w:lvl>
   </w:abstractNum>
-  <w:abstractNum w:abstractNumId="6" w15:restartNumberingAfterBreak="0">
+  <w:abstractNum w:abstractNumId="7" w15:restartNumberingAfterBreak="0">
     <w:nsid w:val="0C6F2C28"/>
     <w:multiLevelType w:val="multilevel"/>
     <w:tmpl w:val="6C3EFB04"/>
@@ -14776,7 +15213,7 @@
       </w:rPr>
     </w:lvl>
   </w:abstractNum>
-  <w:abstractNum w:abstractNumId="7" w15:restartNumberingAfterBreak="0">
+  <w:abstractNum w:abstractNumId="8" w15:restartNumberingAfterBreak="0">
     <w:nsid w:val="11F05B77"/>
     <w:multiLevelType w:val="multilevel"/>
     <w:tmpl w:val="517A47E6"/>
@@ -14925,7 +15362,7 @@
       </w:rPr>
     </w:lvl>
   </w:abstractNum>
-  <w:abstractNum w:abstractNumId="8" w15:restartNumberingAfterBreak="0">
+  <w:abstractNum w:abstractNumId="9" w15:restartNumberingAfterBreak="0">
     <w:nsid w:val="13450393"/>
     <w:multiLevelType w:val="multilevel"/>
     <w:tmpl w:val="A0E635FE"/>
@@ -15074,7 +15511,7 @@
       </w:rPr>
     </w:lvl>
   </w:abstractNum>
-  <w:abstractNum w:abstractNumId="9" w15:restartNumberingAfterBreak="0">
+  <w:abstractNum w:abstractNumId="10" w15:restartNumberingAfterBreak="0">
     <w:nsid w:val="1391477F"/>
     <w:multiLevelType w:val="multilevel"/>
     <w:tmpl w:val="3DFA2094"/>
@@ -15223,7 +15660,7 @@
       </w:rPr>
     </w:lvl>
   </w:abstractNum>
-  <w:abstractNum w:abstractNumId="10" w15:restartNumberingAfterBreak="0">
+  <w:abstractNum w:abstractNumId="11" w15:restartNumberingAfterBreak="0">
     <w:nsid w:val="13FF5CF7"/>
     <w:multiLevelType w:val="multilevel"/>
     <w:tmpl w:val="89728396"/>
@@ -15372,7 +15809,7 @@
       </w:rPr>
     </w:lvl>
   </w:abstractNum>
-  <w:abstractNum w:abstractNumId="11" w15:restartNumberingAfterBreak="0">
+  <w:abstractNum w:abstractNumId="12" w15:restartNumberingAfterBreak="0">
     <w:nsid w:val="141110BB"/>
     <w:multiLevelType w:val="multilevel"/>
     <w:tmpl w:val="2DB4CBDA"/>
@@ -15521,7 +15958,7 @@
       </w:rPr>
     </w:lvl>
   </w:abstractNum>
-  <w:abstractNum w:abstractNumId="12" w15:restartNumberingAfterBreak="0">
+  <w:abstractNum w:abstractNumId="13" w15:restartNumberingAfterBreak="0">
     <w:nsid w:val="15453ECD"/>
     <w:multiLevelType w:val="multilevel"/>
     <w:tmpl w:val="032035F0"/>
@@ -15670,7 +16107,7 @@
       </w:rPr>
     </w:lvl>
   </w:abstractNum>
-  <w:abstractNum w:abstractNumId="13" w15:restartNumberingAfterBreak="0">
+  <w:abstractNum w:abstractNumId="14" w15:restartNumberingAfterBreak="0">
     <w:nsid w:val="159700FE"/>
     <w:multiLevelType w:val="hybridMultilevel"/>
     <w:tmpl w:val="6DA61706"/>
@@ -15783,7 +16220,156 @@
       </w:rPr>
     </w:lvl>
   </w:abstractNum>
-  <w:abstractNum w:abstractNumId="14" w15:restartNumberingAfterBreak="0">
+  <w:abstractNum w:abstractNumId="15" w15:restartNumberingAfterBreak="0">
+    <w:nsid w:val="164E5DA4"/>
+    <w:multiLevelType w:val="multilevel"/>
+    <w:tmpl w:val="3EDCE6C2"/>
+    <w:lvl w:ilvl="0">
+      <w:start w:val="1"/>
+      <w:numFmt w:val="bullet"/>
+      <w:lvlText w:val=""/>
+      <w:lvlJc w:val="left"/>
+      <w:pPr>
+        <w:tabs>
+          <w:tab w:val="num" w:pos="720"/>
+        </w:tabs>
+        <w:ind w:left="720" w:hanging="360"/>
+      </w:pPr>
+      <w:rPr>
+        <w:rFonts w:ascii="Symbol" w:hAnsi="Symbol" w:hint="default"/>
+        <w:sz w:val="20"/>
+      </w:rPr>
+    </w:lvl>
+    <w:lvl w:ilvl="1" w:tentative="1">
+      <w:start w:val="1"/>
+      <w:numFmt w:val="bullet"/>
+      <w:lvlText w:val="o"/>
+      <w:lvlJc w:val="left"/>
+      <w:pPr>
+        <w:tabs>
+          <w:tab w:val="num" w:pos="1440"/>
+        </w:tabs>
+        <w:ind w:left="1440" w:hanging="360"/>
+      </w:pPr>
+      <w:rPr>
+        <w:rFonts w:ascii="Courier New" w:hAnsi="Courier New" w:hint="default"/>
+        <w:sz w:val="20"/>
+      </w:rPr>
+    </w:lvl>
+    <w:lvl w:ilvl="2" w:tentative="1">
+      <w:start w:val="1"/>
+      <w:numFmt w:val="bullet"/>
+      <w:lvlText w:val=""/>
+      <w:lvlJc w:val="left"/>
+      <w:pPr>
+        <w:tabs>
+          <w:tab w:val="num" w:pos="2160"/>
+        </w:tabs>
+        <w:ind w:left="2160" w:hanging="360"/>
+      </w:pPr>
+      <w:rPr>
+        <w:rFonts w:ascii="Wingdings" w:hAnsi="Wingdings" w:hint="default"/>
+        <w:sz w:val="20"/>
+      </w:rPr>
+    </w:lvl>
+    <w:lvl w:ilvl="3" w:tentative="1">
+      <w:start w:val="1"/>
+      <w:numFmt w:val="bullet"/>
+      <w:lvlText w:val=""/>
+      <w:lvlJc w:val="left"/>
+      <w:pPr>
+        <w:tabs>
+          <w:tab w:val="num" w:pos="2880"/>
+        </w:tabs>
+        <w:ind w:left="2880" w:hanging="360"/>
+      </w:pPr>
+      <w:rPr>
+        <w:rFonts w:ascii="Wingdings" w:hAnsi="Wingdings" w:hint="default"/>
+        <w:sz w:val="20"/>
+      </w:rPr>
+    </w:lvl>
+    <w:lvl w:ilvl="4" w:tentative="1">
+      <w:start w:val="1"/>
+      <w:numFmt w:val="bullet"/>
+      <w:lvlText w:val=""/>
+      <w:lvlJc w:val="left"/>
+      <w:pPr>
+        <w:tabs>
+          <w:tab w:val="num" w:pos="3600"/>
+        </w:tabs>
+        <w:ind w:left="3600" w:hanging="360"/>
+      </w:pPr>
+      <w:rPr>
+        <w:rFonts w:ascii="Wingdings" w:hAnsi="Wingdings" w:hint="default"/>
+        <w:sz w:val="20"/>
+      </w:rPr>
+    </w:lvl>
+    <w:lvl w:ilvl="5" w:tentative="1">
+      <w:start w:val="1"/>
+      <w:numFmt w:val="bullet"/>
+      <w:lvlText w:val=""/>
+      <w:lvlJc w:val="left"/>
+      <w:pPr>
+        <w:tabs>
+          <w:tab w:val="num" w:pos="4320"/>
+        </w:tabs>
+        <w:ind w:left="4320" w:hanging="360"/>
+      </w:pPr>
+      <w:rPr>
+        <w:rFonts w:ascii="Wingdings" w:hAnsi="Wingdings" w:hint="default"/>
+        <w:sz w:val="20"/>
+      </w:rPr>
+    </w:lvl>
+    <w:lvl w:ilvl="6" w:tentative="1">
+      <w:start w:val="1"/>
+      <w:numFmt w:val="bullet"/>
+      <w:lvlText w:val=""/>
+      <w:lvlJc w:val="left"/>
+      <w:pPr>
+        <w:tabs>
+          <w:tab w:val="num" w:pos="5040"/>
+        </w:tabs>
+        <w:ind w:left="5040" w:hanging="360"/>
+      </w:pPr>
+      <w:rPr>
+        <w:rFonts w:ascii="Wingdings" w:hAnsi="Wingdings" w:hint="default"/>
+        <w:sz w:val="20"/>
+      </w:rPr>
+    </w:lvl>
+    <w:lvl w:ilvl="7" w:tentative="1">
+      <w:start w:val="1"/>
+      <w:numFmt w:val="bullet"/>
+      <w:lvlText w:val=""/>
+      <w:lvlJc w:val="left"/>
+      <w:pPr>
+        <w:tabs>
+          <w:tab w:val="num" w:pos="5760"/>
+        </w:tabs>
+        <w:ind w:left="5760" w:hanging="360"/>
+      </w:pPr>
+      <w:rPr>
+        <w:rFonts w:ascii="Wingdings" w:hAnsi="Wingdings" w:hint="default"/>
+        <w:sz w:val="20"/>
+      </w:rPr>
+    </w:lvl>
+    <w:lvl w:ilvl="8" w:tentative="1">
+      <w:start w:val="1"/>
+      <w:numFmt w:val="bullet"/>
+      <w:lvlText w:val=""/>
+      <w:lvlJc w:val="left"/>
+      <w:pPr>
+        <w:tabs>
+          <w:tab w:val="num" w:pos="6480"/>
+        </w:tabs>
+        <w:ind w:left="6480" w:hanging="360"/>
+      </w:pPr>
+      <w:rPr>
+        <w:rFonts w:ascii="Wingdings" w:hAnsi="Wingdings" w:hint="default"/>
+        <w:sz w:val="20"/>
+      </w:rPr>
+    </w:lvl>
+  </w:abstractNum>
+  <w:abstractNum w:abstractNumId="16" w15:restartNumberingAfterBreak="0">
     <w:nsid w:val="17CB03B8"/>
     <w:multiLevelType w:val="multilevel"/>
     <w:tmpl w:val="BDE80E90"/>
@@ -15932,7 +16518,7 @@
       </w:rPr>
     </w:lvl>
   </w:abstractNum>
-  <w:abstractNum w:abstractNumId="15" w15:restartNumberingAfterBreak="0">
+  <w:abstractNum w:abstractNumId="17" w15:restartNumberingAfterBreak="0">
     <w:nsid w:val="1802351A"/>
     <w:multiLevelType w:val="multilevel"/>
     <w:tmpl w:val="D55CE120"/>
@@ -16081,7 +16667,7 @@
       </w:rPr>
     </w:lvl>
   </w:abstractNum>
-  <w:abstractNum w:abstractNumId="16" w15:restartNumberingAfterBreak="0">
+  <w:abstractNum w:abstractNumId="18" w15:restartNumberingAfterBreak="0">
     <w:nsid w:val="18577577"/>
     <w:multiLevelType w:val="multilevel"/>
     <w:tmpl w:val="4BEC0844"/>
@@ -16230,7 +16816,7 @@
       </w:rPr>
     </w:lvl>
   </w:abstractNum>
-  <w:abstractNum w:abstractNumId="17" w15:restartNumberingAfterBreak="0">
+  <w:abstractNum w:abstractNumId="19" w15:restartNumberingAfterBreak="0">
     <w:nsid w:val="1A055FA1"/>
     <w:multiLevelType w:val="multilevel"/>
     <w:tmpl w:val="F126FEB2"/>
@@ -16379,7 +16965,7 @@
       </w:rPr>
     </w:lvl>
   </w:abstractNum>
-  <w:abstractNum w:abstractNumId="18" w15:restartNumberingAfterBreak="0">
+  <w:abstractNum w:abstractNumId="20" w15:restartNumberingAfterBreak="0">
     <w:nsid w:val="1B1F3CCB"/>
     <w:multiLevelType w:val="multilevel"/>
     <w:tmpl w:val="0A8E2F46"/>
@@ -16528,7 +17114,7 @@
       </w:rPr>
     </w:lvl>
   </w:abstractNum>
-  <w:abstractNum w:abstractNumId="19" w15:restartNumberingAfterBreak="0">
+  <w:abstractNum w:abstractNumId="21" w15:restartNumberingAfterBreak="0">
     <w:nsid w:val="1F8D1B11"/>
     <w:multiLevelType w:val="hybridMultilevel"/>
     <w:tmpl w:val="36F229B2"/>
@@ -16641,7 +17227,7 @@
       </w:rPr>
     </w:lvl>
   </w:abstractNum>
-  <w:abstractNum w:abstractNumId="20" w15:restartNumberingAfterBreak="0">
+  <w:abstractNum w:abstractNumId="22" w15:restartNumberingAfterBreak="0">
     <w:nsid w:val="24131328"/>
     <w:multiLevelType w:val="multilevel"/>
     <w:tmpl w:val="3EB62E3C"/>
@@ -16790,7 +17376,7 @@
       </w:rPr>
     </w:lvl>
   </w:abstractNum>
-  <w:abstractNum w:abstractNumId="21" w15:restartNumberingAfterBreak="0">
+  <w:abstractNum w:abstractNumId="23" w15:restartNumberingAfterBreak="0">
     <w:nsid w:val="255029EC"/>
     <w:multiLevelType w:val="multilevel"/>
     <w:tmpl w:val="EB60805A"/>
@@ -16939,7 +17525,7 @@
       </w:rPr>
     </w:lvl>
   </w:abstractNum>
-  <w:abstractNum w:abstractNumId="22" w15:restartNumberingAfterBreak="0">
+  <w:abstractNum w:abstractNumId="24" w15:restartNumberingAfterBreak="0">
     <w:nsid w:val="263A27F7"/>
     <w:multiLevelType w:val="multilevel"/>
     <w:tmpl w:val="D9EE3A16"/>
@@ -17088,7 +17674,7 @@
       </w:rPr>
     </w:lvl>
   </w:abstractNum>
-  <w:abstractNum w:abstractNumId="23" w15:restartNumberingAfterBreak="0">
+  <w:abstractNum w:abstractNumId="25" w15:restartNumberingAfterBreak="0">
     <w:nsid w:val="266E01BD"/>
     <w:multiLevelType w:val="hybridMultilevel"/>
     <w:tmpl w:val="E8F46C30"/>
@@ -17201,7 +17787,7 @@
       </w:rPr>
     </w:lvl>
   </w:abstractNum>
-  <w:abstractNum w:abstractNumId="24" w15:restartNumberingAfterBreak="0">
+  <w:abstractNum w:abstractNumId="26" w15:restartNumberingAfterBreak="0">
     <w:nsid w:val="288D6092"/>
     <w:multiLevelType w:val="multilevel"/>
     <w:tmpl w:val="F5F2C6D4"/>
@@ -17350,7 +17936,7 @@
       </w:rPr>
     </w:lvl>
   </w:abstractNum>
-  <w:abstractNum w:abstractNumId="25" w15:restartNumberingAfterBreak="0">
+  <w:abstractNum w:abstractNumId="27" w15:restartNumberingAfterBreak="0">
     <w:nsid w:val="28AF68D9"/>
     <w:multiLevelType w:val="multilevel"/>
     <w:tmpl w:val="1DBC2298"/>
@@ -17499,7 +18085,7 @@
       </w:rPr>
     </w:lvl>
   </w:abstractNum>
-  <w:abstractNum w:abstractNumId="26" w15:restartNumberingAfterBreak="0">
+  <w:abstractNum w:abstractNumId="28" w15:restartNumberingAfterBreak="0">
     <w:nsid w:val="2A7219A1"/>
     <w:multiLevelType w:val="hybridMultilevel"/>
     <w:tmpl w:val="2708D780"/>
@@ -17612,7 +18198,156 @@
       </w:rPr>
     </w:lvl>
   </w:abstractNum>
-  <w:abstractNum w:abstractNumId="27" w15:restartNumberingAfterBreak="0">
+  <w:abstractNum w:abstractNumId="29" w15:restartNumberingAfterBreak="0">
+    <w:nsid w:val="2B504781"/>
+    <w:multiLevelType w:val="multilevel"/>
+    <w:tmpl w:val="E59ACD4A"/>
+    <w:lvl w:ilvl="0">
+      <w:start w:val="1"/>
+      <w:numFmt w:val="bullet"/>
+      <w:lvlText w:val=""/>
+      <w:lvlJc w:val="left"/>
+      <w:pPr>
+        <w:tabs>
+          <w:tab w:val="num" w:pos="720"/>
+        </w:tabs>
+        <w:ind w:left="720" w:hanging="360"/>
+      </w:pPr>
+      <w:rPr>
+        <w:rFonts w:ascii="Symbol" w:hAnsi="Symbol" w:hint="default"/>
+        <w:sz w:val="20"/>
+      </w:rPr>
+    </w:lvl>
+    <w:lvl w:ilvl="1" w:tentative="1">
+      <w:start w:val="1"/>
+      <w:numFmt w:val="bullet"/>
+      <w:lvlText w:val="o"/>
+      <w:lvlJc w:val="left"/>
+      <w:pPr>
+        <w:tabs>
+          <w:tab w:val="num" w:pos="1440"/>
+        </w:tabs>
+        <w:ind w:left="1440" w:hanging="360"/>
+      </w:pPr>
+      <w:rPr>
+        <w:rFonts w:ascii="Courier New" w:hAnsi="Courier New" w:hint="default"/>
+        <w:sz w:val="20"/>
+      </w:rPr>
+    </w:lvl>
+    <w:lvl w:ilvl="2" w:tentative="1">
+      <w:start w:val="1"/>
+      <w:numFmt w:val="bullet"/>
+      <w:lvlText w:val=""/>
+      <w:lvlJc w:val="left"/>
+      <w:pPr>
+        <w:tabs>
+          <w:tab w:val="num" w:pos="2160"/>
+        </w:tabs>
+        <w:ind w:left="2160" w:hanging="360"/>
+      </w:pPr>
+      <w:rPr>
+        <w:rFonts w:ascii="Wingdings" w:hAnsi="Wingdings" w:hint="default"/>
+        <w:sz w:val="20"/>
+      </w:rPr>
+    </w:lvl>
+    <w:lvl w:ilvl="3" w:tentative="1">
+      <w:start w:val="1"/>
+      <w:numFmt w:val="bullet"/>
+      <w:lvlText w:val=""/>
+      <w:lvlJc w:val="left"/>
+      <w:pPr>
+        <w:tabs>
+          <w:tab w:val="num" w:pos="2880"/>
+        </w:tabs>
+        <w:ind w:left="2880" w:hanging="360"/>
+      </w:pPr>
+      <w:rPr>
+        <w:rFonts w:ascii="Wingdings" w:hAnsi="Wingdings" w:hint="default"/>
+        <w:sz w:val="20"/>
+      </w:rPr>
+    </w:lvl>
+    <w:lvl w:ilvl="4" w:tentative="1">
+      <w:start w:val="1"/>
+      <w:numFmt w:val="bullet"/>
+      <w:lvlText w:val=""/>
+      <w:lvlJc w:val="left"/>
+      <w:pPr>
+        <w:tabs>
+          <w:tab w:val="num" w:pos="3600"/>
+        </w:tabs>
+        <w:ind w:left="3600" w:hanging="360"/>
+      </w:pPr>
+      <w:rPr>
+        <w:rFonts w:ascii="Wingdings" w:hAnsi="Wingdings" w:hint="default"/>
+        <w:sz w:val="20"/>
+      </w:rPr>
+    </w:lvl>
+    <w:lvl w:ilvl="5" w:tentative="1">
+      <w:start w:val="1"/>
+      <w:numFmt w:val="bullet"/>
+      <w:lvlText w:val=""/>
+      <w:lvlJc w:val="left"/>
+      <w:pPr>
+        <w:tabs>
+          <w:tab w:val="num" w:pos="4320"/>
+        </w:tabs>
+        <w:ind w:left="4320" w:hanging="360"/>
+      </w:pPr>
+      <w:rPr>
+        <w:rFonts w:ascii="Wingdings" w:hAnsi="Wingdings" w:hint="default"/>
+        <w:sz w:val="20"/>
+      </w:rPr>
+    </w:lvl>
+    <w:lvl w:ilvl="6" w:tentative="1">
+      <w:start w:val="1"/>
+      <w:numFmt w:val="bullet"/>
+      <w:lvlText w:val=""/>
+      <w:lvlJc w:val="left"/>
+      <w:pPr>
+        <w:tabs>
+          <w:tab w:val="num" w:pos="5040"/>
+        </w:tabs>
+        <w:ind w:left="5040" w:hanging="360"/>
+      </w:pPr>
+      <w:rPr>
+        <w:rFonts w:ascii="Wingdings" w:hAnsi="Wingdings" w:hint="default"/>
+        <w:sz w:val="20"/>
+      </w:rPr>
+    </w:lvl>
+    <w:lvl w:ilvl="7" w:tentative="1">
+      <w:start w:val="1"/>
+      <w:numFmt w:val="bullet"/>
+      <w:lvlText w:val=""/>
+      <w:lvlJc w:val="left"/>
+      <w:pPr>
+        <w:tabs>
+          <w:tab w:val="num" w:pos="5760"/>
+        </w:tabs>
+        <w:ind w:left="5760" w:hanging="360"/>
+      </w:pPr>
+      <w:rPr>
+        <w:rFonts w:ascii="Wingdings" w:hAnsi="Wingdings" w:hint="default"/>
+        <w:sz w:val="20"/>
+      </w:rPr>
+    </w:lvl>
+    <w:lvl w:ilvl="8" w:tentative="1">
+      <w:start w:val="1"/>
+      <w:numFmt w:val="bullet"/>
+      <w:lvlText w:val=""/>
+      <w:lvlJc w:val="left"/>
+      <w:pPr>
+        <w:tabs>
+          <w:tab w:val="num" w:pos="6480"/>
+        </w:tabs>
+        <w:ind w:left="6480" w:hanging="360"/>
+      </w:pPr>
+      <w:rPr>
+        <w:rFonts w:ascii="Wingdings" w:hAnsi="Wingdings" w:hint="default"/>
+        <w:sz w:val="20"/>
+      </w:rPr>
+    </w:lvl>
+  </w:abstractNum>
+  <w:abstractNum w:abstractNumId="30" w15:restartNumberingAfterBreak="0">
     <w:nsid w:val="2D6066E5"/>
     <w:multiLevelType w:val="hybridMultilevel"/>
     <w:tmpl w:val="3F7E4BEE"/>
@@ -17725,7 +18460,7 @@
       </w:rPr>
     </w:lvl>
   </w:abstractNum>
-  <w:abstractNum w:abstractNumId="28" w15:restartNumberingAfterBreak="0">
+  <w:abstractNum w:abstractNumId="31" w15:restartNumberingAfterBreak="0">
     <w:nsid w:val="2E437B66"/>
     <w:multiLevelType w:val="multilevel"/>
     <w:tmpl w:val="933E292E"/>
@@ -17874,7 +18609,7 @@
       </w:rPr>
     </w:lvl>
   </w:abstractNum>
-  <w:abstractNum w:abstractNumId="29" w15:restartNumberingAfterBreak="0">
+  <w:abstractNum w:abstractNumId="32" w15:restartNumberingAfterBreak="0">
     <w:nsid w:val="30863A82"/>
     <w:multiLevelType w:val="multilevel"/>
     <w:tmpl w:val="7A7664C8"/>
@@ -18023,7 +18758,7 @@
       </w:rPr>
     </w:lvl>
   </w:abstractNum>
-  <w:abstractNum w:abstractNumId="30" w15:restartNumberingAfterBreak="0">
+  <w:abstractNum w:abstractNumId="33" w15:restartNumberingAfterBreak="0">
     <w:nsid w:val="30C41755"/>
     <w:multiLevelType w:val="multilevel"/>
     <w:tmpl w:val="812C0BF0"/>
@@ -18172,7 +18907,7 @@
       </w:rPr>
     </w:lvl>
   </w:abstractNum>
-  <w:abstractNum w:abstractNumId="31" w15:restartNumberingAfterBreak="0">
+  <w:abstractNum w:abstractNumId="34" w15:restartNumberingAfterBreak="0">
     <w:nsid w:val="31B76C7C"/>
     <w:multiLevelType w:val="hybridMultilevel"/>
     <w:tmpl w:val="533CBDFC"/>
@@ -18285,7 +19020,7 @@
       </w:rPr>
     </w:lvl>
   </w:abstractNum>
-  <w:abstractNum w:abstractNumId="32" w15:restartNumberingAfterBreak="0">
+  <w:abstractNum w:abstractNumId="35" w15:restartNumberingAfterBreak="0">
     <w:nsid w:val="329A797C"/>
     <w:multiLevelType w:val="multilevel"/>
     <w:tmpl w:val="DA8EF3C0"/>
@@ -18434,7 +19169,7 @@
       </w:rPr>
     </w:lvl>
   </w:abstractNum>
-  <w:abstractNum w:abstractNumId="33" w15:restartNumberingAfterBreak="0">
+  <w:abstractNum w:abstractNumId="36" w15:restartNumberingAfterBreak="0">
     <w:nsid w:val="33FB5ACC"/>
     <w:multiLevelType w:val="multilevel"/>
     <w:tmpl w:val="1770922E"/>
@@ -18583,7 +19318,7 @@
       </w:rPr>
     </w:lvl>
   </w:abstractNum>
-  <w:abstractNum w:abstractNumId="34" w15:restartNumberingAfterBreak="0">
+  <w:abstractNum w:abstractNumId="37" w15:restartNumberingAfterBreak="0">
     <w:nsid w:val="34B53B68"/>
     <w:multiLevelType w:val="multilevel"/>
     <w:tmpl w:val="75F4A9D8"/>
@@ -18732,7 +19467,7 @@
       </w:rPr>
     </w:lvl>
   </w:abstractNum>
-  <w:abstractNum w:abstractNumId="35" w15:restartNumberingAfterBreak="0">
+  <w:abstractNum w:abstractNumId="38" w15:restartNumberingAfterBreak="0">
     <w:nsid w:val="35082C2D"/>
     <w:multiLevelType w:val="multilevel"/>
     <w:tmpl w:val="00C280E4"/>
@@ -18881,7 +19616,7 @@
       </w:rPr>
     </w:lvl>
   </w:abstractNum>
-  <w:abstractNum w:abstractNumId="36" w15:restartNumberingAfterBreak="0">
+  <w:abstractNum w:abstractNumId="39" w15:restartNumberingAfterBreak="0">
     <w:nsid w:val="351A58D3"/>
     <w:multiLevelType w:val="multilevel"/>
     <w:tmpl w:val="DDA83992"/>
@@ -19030,7 +19765,7 @@
       </w:rPr>
     </w:lvl>
   </w:abstractNum>
-  <w:abstractNum w:abstractNumId="37" w15:restartNumberingAfterBreak="0">
+  <w:abstractNum w:abstractNumId="40" w15:restartNumberingAfterBreak="0">
     <w:nsid w:val="3780706F"/>
     <w:multiLevelType w:val="multilevel"/>
     <w:tmpl w:val="381CDEA8"/>
@@ -19179,7 +19914,7 @@
       </w:rPr>
     </w:lvl>
   </w:abstractNum>
-  <w:abstractNum w:abstractNumId="38" w15:restartNumberingAfterBreak="0">
+  <w:abstractNum w:abstractNumId="41" w15:restartNumberingAfterBreak="0">
     <w:nsid w:val="38F414DA"/>
     <w:multiLevelType w:val="multilevel"/>
     <w:tmpl w:val="2DEAE2BC"/>
@@ -19328,7 +20063,7 @@
       </w:rPr>
     </w:lvl>
   </w:abstractNum>
-  <w:abstractNum w:abstractNumId="39" w15:restartNumberingAfterBreak="0">
+  <w:abstractNum w:abstractNumId="42" w15:restartNumberingAfterBreak="0">
     <w:nsid w:val="392457FE"/>
     <w:multiLevelType w:val="multilevel"/>
     <w:tmpl w:val="DB469F6C"/>
@@ -19477,7 +20212,7 @@
       </w:rPr>
     </w:lvl>
   </w:abstractNum>
-  <w:abstractNum w:abstractNumId="40" w15:restartNumberingAfterBreak="0">
+  <w:abstractNum w:abstractNumId="43" w15:restartNumberingAfterBreak="0">
     <w:nsid w:val="3A923EFF"/>
     <w:multiLevelType w:val="multilevel"/>
     <w:tmpl w:val="F4004242"/>
@@ -19626,7 +20361,7 @@
       </w:rPr>
     </w:lvl>
   </w:abstractNum>
-  <w:abstractNum w:abstractNumId="41" w15:restartNumberingAfterBreak="0">
+  <w:abstractNum w:abstractNumId="44" w15:restartNumberingAfterBreak="0">
     <w:nsid w:val="40460948"/>
     <w:multiLevelType w:val="multilevel"/>
     <w:tmpl w:val="62C49374"/>
@@ -19775,7 +20510,7 @@
       </w:rPr>
     </w:lvl>
   </w:abstractNum>
-  <w:abstractNum w:abstractNumId="42" w15:restartNumberingAfterBreak="0">
+  <w:abstractNum w:abstractNumId="45" w15:restartNumberingAfterBreak="0">
     <w:nsid w:val="413E1D27"/>
     <w:multiLevelType w:val="hybridMultilevel"/>
     <w:tmpl w:val="4F060846"/>
@@ -19888,7 +20623,7 @@
       </w:rPr>
     </w:lvl>
   </w:abstractNum>
-  <w:abstractNum w:abstractNumId="43" w15:restartNumberingAfterBreak="0">
+  <w:abstractNum w:abstractNumId="46" w15:restartNumberingAfterBreak="0">
     <w:nsid w:val="421C74CE"/>
     <w:multiLevelType w:val="multilevel"/>
     <w:tmpl w:val="A6045D7E"/>
@@ -20037,7 +20772,7 @@
       </w:rPr>
     </w:lvl>
   </w:abstractNum>
-  <w:abstractNum w:abstractNumId="44" w15:restartNumberingAfterBreak="0">
+  <w:abstractNum w:abstractNumId="47" w15:restartNumberingAfterBreak="0">
     <w:nsid w:val="42696F10"/>
     <w:multiLevelType w:val="multilevel"/>
     <w:tmpl w:val="27506A40"/>
@@ -20186,7 +20921,7 @@
       </w:rPr>
     </w:lvl>
   </w:abstractNum>
-  <w:abstractNum w:abstractNumId="45" w15:restartNumberingAfterBreak="0">
+  <w:abstractNum w:abstractNumId="48" w15:restartNumberingAfterBreak="0">
     <w:nsid w:val="42AB5966"/>
     <w:multiLevelType w:val="multilevel"/>
     <w:tmpl w:val="CE088554"/>
@@ -20335,7 +21070,7 @@
       </w:rPr>
     </w:lvl>
   </w:abstractNum>
-  <w:abstractNum w:abstractNumId="46" w15:restartNumberingAfterBreak="0">
+  <w:abstractNum w:abstractNumId="49" w15:restartNumberingAfterBreak="0">
     <w:nsid w:val="4529096C"/>
     <w:multiLevelType w:val="hybridMultilevel"/>
     <w:tmpl w:val="FFF85C74"/>
@@ -20447,7 +21182,7 @@
       </w:rPr>
     </w:lvl>
   </w:abstractNum>
-  <w:abstractNum w:abstractNumId="47" w15:restartNumberingAfterBreak="0">
+  <w:abstractNum w:abstractNumId="50" w15:restartNumberingAfterBreak="0">
     <w:nsid w:val="46236874"/>
     <w:multiLevelType w:val="hybridMultilevel"/>
     <w:tmpl w:val="CF56BA42"/>
@@ -20560,7 +21295,7 @@
       </w:rPr>
     </w:lvl>
   </w:abstractNum>
-  <w:abstractNum w:abstractNumId="48" w15:restartNumberingAfterBreak="0">
+  <w:abstractNum w:abstractNumId="51" w15:restartNumberingAfterBreak="0">
     <w:nsid w:val="470C52B7"/>
     <w:multiLevelType w:val="multilevel"/>
     <w:tmpl w:val="DDBACCE6"/>
@@ -20709,7 +21444,7 @@
       </w:rPr>
     </w:lvl>
   </w:abstractNum>
-  <w:abstractNum w:abstractNumId="49" w15:restartNumberingAfterBreak="0">
+  <w:abstractNum w:abstractNumId="52" w15:restartNumberingAfterBreak="0">
     <w:nsid w:val="471B09B3"/>
     <w:multiLevelType w:val="multilevel"/>
     <w:tmpl w:val="A1B2CB16"/>
@@ -20858,7 +21593,7 @@
       </w:rPr>
     </w:lvl>
   </w:abstractNum>
-  <w:abstractNum w:abstractNumId="50" w15:restartNumberingAfterBreak="0">
+  <w:abstractNum w:abstractNumId="53" w15:restartNumberingAfterBreak="0">
     <w:nsid w:val="486B038C"/>
     <w:multiLevelType w:val="hybridMultilevel"/>
     <w:tmpl w:val="8C4A79DA"/>
@@ -20971,7 +21706,7 @@
       </w:rPr>
     </w:lvl>
   </w:abstractNum>
-  <w:abstractNum w:abstractNumId="51" w15:restartNumberingAfterBreak="0">
+  <w:abstractNum w:abstractNumId="54" w15:restartNumberingAfterBreak="0">
     <w:nsid w:val="4888582A"/>
     <w:multiLevelType w:val="multilevel"/>
     <w:tmpl w:val="2A22B8AA"/>
@@ -21120,7 +21855,7 @@
       </w:rPr>
     </w:lvl>
   </w:abstractNum>
-  <w:abstractNum w:abstractNumId="52" w15:restartNumberingAfterBreak="0">
+  <w:abstractNum w:abstractNumId="55" w15:restartNumberingAfterBreak="0">
     <w:nsid w:val="48E0701C"/>
     <w:multiLevelType w:val="multilevel"/>
     <w:tmpl w:val="4FB6510C"/>
@@ -21269,7 +22004,7 @@
       </w:rPr>
     </w:lvl>
   </w:abstractNum>
-  <w:abstractNum w:abstractNumId="53" w15:restartNumberingAfterBreak="0">
+  <w:abstractNum w:abstractNumId="56" w15:restartNumberingAfterBreak="0">
     <w:nsid w:val="4A8D35E4"/>
     <w:multiLevelType w:val="hybridMultilevel"/>
     <w:tmpl w:val="35A2089C"/>
@@ -21382,7 +22117,7 @@
       </w:rPr>
     </w:lvl>
   </w:abstractNum>
-  <w:abstractNum w:abstractNumId="54" w15:restartNumberingAfterBreak="0">
+  <w:abstractNum w:abstractNumId="57" w15:restartNumberingAfterBreak="0">
     <w:nsid w:val="4B8865D9"/>
     <w:multiLevelType w:val="multilevel"/>
     <w:tmpl w:val="238E69C6"/>
@@ -21531,7 +22266,7 @@
       </w:rPr>
     </w:lvl>
   </w:abstractNum>
-  <w:abstractNum w:abstractNumId="55" w15:restartNumberingAfterBreak="0">
+  <w:abstractNum w:abstractNumId="58" w15:restartNumberingAfterBreak="0">
     <w:nsid w:val="4D161459"/>
     <w:multiLevelType w:val="multilevel"/>
     <w:tmpl w:val="C10436FE"/>
@@ -21680,7 +22415,7 @@
       </w:rPr>
     </w:lvl>
   </w:abstractNum>
-  <w:abstractNum w:abstractNumId="56" w15:restartNumberingAfterBreak="0">
+  <w:abstractNum w:abstractNumId="59" w15:restartNumberingAfterBreak="0">
     <w:nsid w:val="4DA44DE1"/>
     <w:multiLevelType w:val="multilevel"/>
     <w:tmpl w:val="EA649872"/>
@@ -21829,7 +22564,7 @@
       </w:rPr>
     </w:lvl>
   </w:abstractNum>
-  <w:abstractNum w:abstractNumId="57" w15:restartNumberingAfterBreak="0">
+  <w:abstractNum w:abstractNumId="60" w15:restartNumberingAfterBreak="0">
     <w:nsid w:val="507F6DDB"/>
     <w:multiLevelType w:val="multilevel"/>
     <w:tmpl w:val="644671D8"/>
@@ -21978,7 +22713,7 @@
       </w:rPr>
     </w:lvl>
   </w:abstractNum>
-  <w:abstractNum w:abstractNumId="58" w15:restartNumberingAfterBreak="0">
+  <w:abstractNum w:abstractNumId="61" w15:restartNumberingAfterBreak="0">
     <w:nsid w:val="5232184E"/>
     <w:multiLevelType w:val="multilevel"/>
     <w:tmpl w:val="16B80DA4"/>
@@ -22127,7 +22862,7 @@
       </w:rPr>
     </w:lvl>
   </w:abstractNum>
-  <w:abstractNum w:abstractNumId="59" w15:restartNumberingAfterBreak="0">
+  <w:abstractNum w:abstractNumId="62" w15:restartNumberingAfterBreak="0">
     <w:nsid w:val="53C03E13"/>
     <w:multiLevelType w:val="hybridMultilevel"/>
     <w:tmpl w:val="83FCBC06"/>
@@ -22240,7 +22975,7 @@
       </w:rPr>
     </w:lvl>
   </w:abstractNum>
-  <w:abstractNum w:abstractNumId="60" w15:restartNumberingAfterBreak="0">
+  <w:abstractNum w:abstractNumId="63" w15:restartNumberingAfterBreak="0">
     <w:nsid w:val="5A897983"/>
     <w:multiLevelType w:val="multilevel"/>
     <w:tmpl w:val="F05C9280"/>
@@ -22389,7 +23124,7 @@
       </w:rPr>
     </w:lvl>
   </w:abstractNum>
-  <w:abstractNum w:abstractNumId="61" w15:restartNumberingAfterBreak="0">
+  <w:abstractNum w:abstractNumId="64" w15:restartNumberingAfterBreak="0">
     <w:nsid w:val="5DD73975"/>
     <w:multiLevelType w:val="hybridMultilevel"/>
     <w:tmpl w:val="F3C8F606"/>
@@ -22502,7 +23237,7 @@
       </w:rPr>
     </w:lvl>
   </w:abstractNum>
-  <w:abstractNum w:abstractNumId="62" w15:restartNumberingAfterBreak="0">
+  <w:abstractNum w:abstractNumId="65" w15:restartNumberingAfterBreak="0">
     <w:nsid w:val="628566FA"/>
     <w:multiLevelType w:val="multilevel"/>
     <w:tmpl w:val="C576D23C"/>
@@ -22651,7 +23386,7 @@
       </w:rPr>
     </w:lvl>
   </w:abstractNum>
-  <w:abstractNum w:abstractNumId="63" w15:restartNumberingAfterBreak="0">
+  <w:abstractNum w:abstractNumId="66" w15:restartNumberingAfterBreak="0">
     <w:nsid w:val="628F4BF2"/>
     <w:multiLevelType w:val="multilevel"/>
     <w:tmpl w:val="A680F95C"/>
@@ -22800,7 +23535,7 @@
       </w:rPr>
     </w:lvl>
   </w:abstractNum>
-  <w:abstractNum w:abstractNumId="64" w15:restartNumberingAfterBreak="0">
+  <w:abstractNum w:abstractNumId="67" w15:restartNumberingAfterBreak="0">
     <w:nsid w:val="65C91593"/>
     <w:multiLevelType w:val="multilevel"/>
     <w:tmpl w:val="B8C27B96"/>
@@ -22949,7 +23684,7 @@
       </w:rPr>
     </w:lvl>
   </w:abstractNum>
-  <w:abstractNum w:abstractNumId="65" w15:restartNumberingAfterBreak="0">
+  <w:abstractNum w:abstractNumId="68" w15:restartNumberingAfterBreak="0">
     <w:nsid w:val="667B593B"/>
     <w:multiLevelType w:val="multilevel"/>
     <w:tmpl w:val="CE58BC76"/>
@@ -23098,7 +23833,7 @@
       </w:rPr>
     </w:lvl>
   </w:abstractNum>
-  <w:abstractNum w:abstractNumId="66" w15:restartNumberingAfterBreak="0">
+  <w:abstractNum w:abstractNumId="69" w15:restartNumberingAfterBreak="0">
     <w:nsid w:val="69F3676B"/>
     <w:multiLevelType w:val="multilevel"/>
     <w:tmpl w:val="6F324960"/>
@@ -23247,7 +23982,7 @@
       </w:rPr>
     </w:lvl>
   </w:abstractNum>
-  <w:abstractNum w:abstractNumId="67" w15:restartNumberingAfterBreak="0">
+  <w:abstractNum w:abstractNumId="70" w15:restartNumberingAfterBreak="0">
     <w:nsid w:val="6EBE3AC0"/>
     <w:multiLevelType w:val="multilevel"/>
     <w:tmpl w:val="1FFA36AC"/>
@@ -23396,7 +24131,7 @@
       </w:rPr>
     </w:lvl>
   </w:abstractNum>
-  <w:abstractNum w:abstractNumId="68" w15:restartNumberingAfterBreak="0">
+  <w:abstractNum w:abstractNumId="71" w15:restartNumberingAfterBreak="0">
     <w:nsid w:val="6EFD3537"/>
     <w:multiLevelType w:val="multilevel"/>
     <w:tmpl w:val="97C84188"/>
@@ -23545,7 +24280,7 @@
       </w:rPr>
     </w:lvl>
   </w:abstractNum>
-  <w:abstractNum w:abstractNumId="69" w15:restartNumberingAfterBreak="0">
+  <w:abstractNum w:abstractNumId="72" w15:restartNumberingAfterBreak="0">
     <w:nsid w:val="6F322895"/>
     <w:multiLevelType w:val="hybridMultilevel"/>
     <w:tmpl w:val="0E2649FC"/>
@@ -23658,7 +24393,7 @@
       </w:rPr>
     </w:lvl>
   </w:abstractNum>
-  <w:abstractNum w:abstractNumId="70" w15:restartNumberingAfterBreak="0">
+  <w:abstractNum w:abstractNumId="73" w15:restartNumberingAfterBreak="0">
     <w:nsid w:val="6F4737A3"/>
     <w:multiLevelType w:val="multilevel"/>
     <w:tmpl w:val="6EC638F4"/>
@@ -23807,7 +24542,7 @@
       </w:rPr>
     </w:lvl>
   </w:abstractNum>
-  <w:abstractNum w:abstractNumId="71" w15:restartNumberingAfterBreak="0">
+  <w:abstractNum w:abstractNumId="74" w15:restartNumberingAfterBreak="0">
     <w:nsid w:val="71B866B8"/>
     <w:multiLevelType w:val="multilevel"/>
     <w:tmpl w:val="D6A61A68"/>
@@ -23956,7 +24691,7 @@
       </w:rPr>
     </w:lvl>
   </w:abstractNum>
-  <w:abstractNum w:abstractNumId="72" w15:restartNumberingAfterBreak="0">
+  <w:abstractNum w:abstractNumId="75" w15:restartNumberingAfterBreak="0">
     <w:nsid w:val="71FE7096"/>
     <w:multiLevelType w:val="multilevel"/>
     <w:tmpl w:val="DB9A52BE"/>
@@ -24105,7 +24840,7 @@
       </w:rPr>
     </w:lvl>
   </w:abstractNum>
-  <w:abstractNum w:abstractNumId="73" w15:restartNumberingAfterBreak="0">
+  <w:abstractNum w:abstractNumId="76" w15:restartNumberingAfterBreak="0">
     <w:nsid w:val="72601284"/>
     <w:multiLevelType w:val="hybridMultilevel"/>
     <w:tmpl w:val="19AC3094"/>
@@ -24218,7 +24953,7 @@
       </w:rPr>
     </w:lvl>
   </w:abstractNum>
-  <w:abstractNum w:abstractNumId="74" w15:restartNumberingAfterBreak="0">
+  <w:abstractNum w:abstractNumId="77" w15:restartNumberingAfterBreak="0">
     <w:nsid w:val="74D4408F"/>
     <w:multiLevelType w:val="multilevel"/>
     <w:tmpl w:val="C854DE4A"/>
@@ -24367,7 +25102,7 @@
       </w:rPr>
     </w:lvl>
   </w:abstractNum>
-  <w:abstractNum w:abstractNumId="75" w15:restartNumberingAfterBreak="0">
+  <w:abstractNum w:abstractNumId="78" w15:restartNumberingAfterBreak="0">
     <w:nsid w:val="75854F38"/>
     <w:multiLevelType w:val="multilevel"/>
     <w:tmpl w:val="D5CED040"/>
@@ -24516,7 +25251,156 @@
       </w:rPr>
     </w:lvl>
   </w:abstractNum>
-  <w:abstractNum w:abstractNumId="76" w15:restartNumberingAfterBreak="0">
+  <w:abstractNum w:abstractNumId="79" w15:restartNumberingAfterBreak="0">
+    <w:nsid w:val="758D06DE"/>
+    <w:multiLevelType w:val="multilevel"/>
+    <w:tmpl w:val="E59ACD4A"/>
+    <w:lvl w:ilvl="0">
+      <w:start w:val="1"/>
+      <w:numFmt w:val="bullet"/>
+      <w:lvlText w:val=""/>
+      <w:lvlJc w:val="left"/>
+      <w:pPr>
+        <w:tabs>
+          <w:tab w:val="num" w:pos="720"/>
+        </w:tabs>
+        <w:ind w:left="720" w:hanging="360"/>
+      </w:pPr>
+      <w:rPr>
+        <w:rFonts w:ascii="Symbol" w:hAnsi="Symbol" w:hint="default"/>
+        <w:sz w:val="20"/>
+      </w:rPr>
+    </w:lvl>
+    <w:lvl w:ilvl="1" w:tentative="1">
+      <w:start w:val="1"/>
+      <w:numFmt w:val="bullet"/>
+      <w:lvlText w:val="o"/>
+      <w:lvlJc w:val="left"/>
+      <w:pPr>
+        <w:tabs>
+          <w:tab w:val="num" w:pos="1440"/>
+        </w:tabs>
+        <w:ind w:left="1440" w:hanging="360"/>
+      </w:pPr>
+      <w:rPr>
+        <w:rFonts w:ascii="Courier New" w:hAnsi="Courier New" w:hint="default"/>
+        <w:sz w:val="20"/>
+      </w:rPr>
+    </w:lvl>
+    <w:lvl w:ilvl="2" w:tentative="1">
+      <w:start w:val="1"/>
+      <w:numFmt w:val="bullet"/>
+      <w:lvlText w:val=""/>
+      <w:lvlJc w:val="left"/>
+      <w:pPr>
+        <w:tabs>
+          <w:tab w:val="num" w:pos="2160"/>
+        </w:tabs>
+        <w:ind w:left="2160" w:hanging="360"/>
+      </w:pPr>
+      <w:rPr>
+        <w:rFonts w:ascii="Wingdings" w:hAnsi="Wingdings" w:hint="default"/>
+        <w:sz w:val="20"/>
+      </w:rPr>
+    </w:lvl>
+    <w:lvl w:ilvl="3" w:tentative="1">
+      <w:start w:val="1"/>
+      <w:numFmt w:val="bullet"/>
+      <w:lvlText w:val=""/>
+      <w:lvlJc w:val="left"/>
+      <w:pPr>
+        <w:tabs>
+          <w:tab w:val="num" w:pos="2880"/>
+        </w:tabs>
+        <w:ind w:left="2880" w:hanging="360"/>
+      </w:pPr>
+      <w:rPr>
+        <w:rFonts w:ascii="Wingdings" w:hAnsi="Wingdings" w:hint="default"/>
+        <w:sz w:val="20"/>
+      </w:rPr>
+    </w:lvl>
+    <w:lvl w:ilvl="4" w:tentative="1">
+      <w:start w:val="1"/>
+      <w:numFmt w:val="bullet"/>
+      <w:lvlText w:val=""/>
+      <w:lvlJc w:val="left"/>
+      <w:pPr>
+        <w:tabs>
+          <w:tab w:val="num" w:pos="3600"/>
+        </w:tabs>
+        <w:ind w:left="3600" w:hanging="360"/>
+      </w:pPr>
+      <w:rPr>
+        <w:rFonts w:ascii="Wingdings" w:hAnsi="Wingdings" w:hint="default"/>
+        <w:sz w:val="20"/>
+      </w:rPr>
+    </w:lvl>
+    <w:lvl w:ilvl="5" w:tentative="1">
+      <w:start w:val="1"/>
+      <w:numFmt w:val="bullet"/>
+      <w:lvlText w:val=""/>
+      <w:lvlJc w:val="left"/>
+      <w:pPr>
+        <w:tabs>
+          <w:tab w:val="num" w:pos="4320"/>
+        </w:tabs>
+        <w:ind w:left="4320" w:hanging="360"/>
+      </w:pPr>
+      <w:rPr>
+        <w:rFonts w:ascii="Wingdings" w:hAnsi="Wingdings" w:hint="default"/>
+        <w:sz w:val="20"/>
+      </w:rPr>
+    </w:lvl>
+    <w:lvl w:ilvl="6" w:tentative="1">
+      <w:start w:val="1"/>
+      <w:numFmt w:val="bullet"/>
+      <w:lvlText w:val=""/>
+      <w:lvlJc w:val="left"/>
+      <w:pPr>
+        <w:tabs>
+          <w:tab w:val="num" w:pos="5040"/>
+        </w:tabs>
+        <w:ind w:left="5040" w:hanging="360"/>
+      </w:pPr>
+      <w:rPr>
+        <w:rFonts w:ascii="Wingdings" w:hAnsi="Wingdings" w:hint="default"/>
+        <w:sz w:val="20"/>
+      </w:rPr>
+    </w:lvl>
+    <w:lvl w:ilvl="7" w:tentative="1">
+      <w:start w:val="1"/>
+      <w:numFmt w:val="bullet"/>
+      <w:lvlText w:val=""/>
+      <w:lvlJc w:val="left"/>
+      <w:pPr>
+        <w:tabs>
+          <w:tab w:val="num" w:pos="5760"/>
+        </w:tabs>
+        <w:ind w:left="5760" w:hanging="360"/>
+      </w:pPr>
+      <w:rPr>
+        <w:rFonts w:ascii="Wingdings" w:hAnsi="Wingdings" w:hint="default"/>
+        <w:sz w:val="20"/>
+      </w:rPr>
+    </w:lvl>
+    <w:lvl w:ilvl="8" w:tentative="1">
+      <w:start w:val="1"/>
+      <w:numFmt w:val="bullet"/>
+      <w:lvlText w:val=""/>
+      <w:lvlJc w:val="left"/>
+      <w:pPr>
+        <w:tabs>
+          <w:tab w:val="num" w:pos="6480"/>
+        </w:tabs>
+        <w:ind w:left="6480" w:hanging="360"/>
+      </w:pPr>
+      <w:rPr>
+        <w:rFonts w:ascii="Wingdings" w:hAnsi="Wingdings" w:hint="default"/>
+        <w:sz w:val="20"/>
+      </w:rPr>
+    </w:lvl>
+  </w:abstractNum>
+  <w:abstractNum w:abstractNumId="80" w15:restartNumberingAfterBreak="0">
     <w:nsid w:val="761A133C"/>
     <w:multiLevelType w:val="multilevel"/>
     <w:tmpl w:val="0F382862"/>
@@ -24665,7 +25549,7 @@
       </w:rPr>
     </w:lvl>
   </w:abstractNum>
-  <w:abstractNum w:abstractNumId="77" w15:restartNumberingAfterBreak="0">
+  <w:abstractNum w:abstractNumId="81" w15:restartNumberingAfterBreak="0">
     <w:nsid w:val="76A27D4F"/>
     <w:multiLevelType w:val="multilevel"/>
     <w:tmpl w:val="1D745170"/>
@@ -24814,7 +25698,7 @@
       </w:rPr>
     </w:lvl>
   </w:abstractNum>
-  <w:abstractNum w:abstractNumId="78" w15:restartNumberingAfterBreak="0">
+  <w:abstractNum w:abstractNumId="82" w15:restartNumberingAfterBreak="0">
     <w:nsid w:val="796D1793"/>
     <w:multiLevelType w:val="hybridMultilevel"/>
     <w:tmpl w:val="2938CC24"/>
@@ -24927,7 +25811,7 @@
       </w:rPr>
     </w:lvl>
   </w:abstractNum>
-  <w:abstractNum w:abstractNumId="79" w15:restartNumberingAfterBreak="0">
+  <w:abstractNum w:abstractNumId="83" w15:restartNumberingAfterBreak="0">
     <w:nsid w:val="7A0A2BF8"/>
     <w:multiLevelType w:val="multilevel"/>
     <w:tmpl w:val="139229D4"/>
@@ -25076,7 +25960,7 @@
       </w:rPr>
     </w:lvl>
   </w:abstractNum>
-  <w:abstractNum w:abstractNumId="80" w15:restartNumberingAfterBreak="0">
+  <w:abstractNum w:abstractNumId="84" w15:restartNumberingAfterBreak="0">
     <w:nsid w:val="7A251DB5"/>
     <w:multiLevelType w:val="multilevel"/>
     <w:tmpl w:val="A60243AE"/>
@@ -25225,7 +26109,120 @@
       </w:rPr>
     </w:lvl>
   </w:abstractNum>
-  <w:abstractNum w:abstractNumId="81" w15:restartNumberingAfterBreak="0">
+  <w:abstractNum w:abstractNumId="85" w15:restartNumberingAfterBreak="0">
+    <w:nsid w:val="7A2B27BF"/>
+    <w:multiLevelType w:val="hybridMultilevel"/>
+    <w:tmpl w:val="1B6C6C7E"/>
+    <w:lvl w:ilvl="0" w:tplc="04090001">
+      <w:start w:val="1"/>
+      <w:numFmt w:val="bullet"/>
+      <w:lvlText w:val=""/>
+      <w:lvlJc w:val="left"/>
+      <w:pPr>
+        <w:ind w:left="720" w:hanging="360"/>
+      </w:pPr>
+      <w:rPr>
+        <w:rFonts w:ascii="Symbol" w:hAnsi="Symbol" w:hint="default"/>
+      </w:rPr>
+    </w:lvl>
+    <w:lvl w:ilvl="1" w:tplc="04090003" w:tentative="1">
+      <w:start w:val="1"/>
+      <w:numFmt w:val="bullet"/>
+      <w:lvlText w:val="o"/>
+      <w:lvlJc w:val="left"/>
+      <w:pPr>
+        <w:ind w:left="1440" w:hanging="360"/>
+      </w:pPr>
+      <w:rPr>
+        <w:rFonts w:ascii="Courier New" w:hAnsi="Courier New" w:cs="Courier New" w:hint="default"/>
+      </w:rPr>
+    </w:lvl>
+    <w:lvl w:ilvl="2" w:tplc="04090005" w:tentative="1">
+      <w:start w:val="1"/>
+      <w:numFmt w:val="bullet"/>
+      <w:lvlText w:val=""/>
+      <w:lvlJc w:val="left"/>
+      <w:pPr>
+        <w:ind w:left="2160" w:hanging="360"/>
+      </w:pPr>
+      <w:rPr>
+        <w:rFonts w:ascii="Wingdings" w:hAnsi="Wingdings" w:hint="default"/>
+      </w:rPr>
+    </w:lvl>
+    <w:lvl w:ilvl="3" w:tplc="04090001" w:tentative="1">
+      <w:start w:val="1"/>
+      <w:numFmt w:val="bullet"/>
+      <w:lvlText w:val=""/>
+      <w:lvlJc w:val="left"/>
+      <w:pPr>
+        <w:ind w:left="2880" w:hanging="360"/>
+      </w:pPr>
+      <w:rPr>
+        <w:rFonts w:ascii="Symbol" w:hAnsi="Symbol" w:hint="default"/>
+      </w:rPr>
+    </w:lvl>
+    <w:lvl w:ilvl="4" w:tplc="04090003" w:tentative="1">
+      <w:start w:val="1"/>
+      <w:numFmt w:val="bullet"/>
+      <w:lvlText w:val="o"/>
+      <w:lvlJc w:val="left"/>
+      <w:pPr>
+        <w:ind w:left="3600" w:hanging="360"/>
+      </w:pPr>
+      <w:rPr>
+        <w:rFonts w:ascii="Courier New" w:hAnsi="Courier New" w:cs="Courier New" w:hint="default"/>
+      </w:rPr>
+    </w:lvl>
+    <w:lvl w:ilvl="5" w:tplc="04090005" w:tentative="1">
+      <w:start w:val="1"/>
+      <w:numFmt w:val="bullet"/>
+      <w:lvlText w:val=""/>
+      <w:lvlJc w:val="left"/>
+      <w:pPr>
+        <w:ind w:left="4320" w:hanging="360"/>
+      </w:pPr>
+      <w:rPr>
+        <w:rFonts w:ascii="Wingdings" w:hAnsi="Wingdings" w:hint="default"/>
+      </w:rPr>
+    </w:lvl>
+    <w:lvl w:ilvl="6" w:tplc="04090001" w:tentative="1">
+      <w:start w:val="1"/>
+      <w:numFmt w:val="bullet"/>
+      <w:lvlText w:val=""/>
+      <w:lvlJc w:val="left"/>
+      <w:pPr>
+        <w:ind w:left="5040" w:hanging="360"/>
+      </w:pPr>
+      <w:rPr>
+        <w:rFonts w:ascii="Symbol" w:hAnsi="Symbol" w:hint="default"/>
+      </w:rPr>
+    </w:lvl>
+    <w:lvl w:ilvl="7" w:tplc="04090003" w:tentative="1">
+      <w:start w:val="1"/>
+      <w:numFmt w:val="bullet"/>
+      <w:lvlText w:val="o"/>
+      <w:lvlJc w:val="left"/>
+      <w:pPr>
+        <w:ind w:left="5760" w:hanging="360"/>
+      </w:pPr>
+      <w:rPr>
+        <w:rFonts w:ascii="Courier New" w:hAnsi="Courier New" w:cs="Courier New" w:hint="default"/>
+      </w:rPr>
+    </w:lvl>
+    <w:lvl w:ilvl="8" w:tplc="04090005" w:tentative="1">
+      <w:start w:val="1"/>
+      <w:numFmt w:val="bullet"/>
+      <w:lvlText w:val=""/>
+      <w:lvlJc w:val="left"/>
+      <w:pPr>
+        <w:ind w:left="6480" w:hanging="360"/>
+      </w:pPr>
+      <w:rPr>
+        <w:rFonts w:ascii="Wingdings" w:hAnsi="Wingdings" w:hint="default"/>
+      </w:rPr>
+    </w:lvl>
+  </w:abstractNum>
+  <w:abstractNum w:abstractNumId="86" w15:restartNumberingAfterBreak="0">
     <w:nsid w:val="7C6F0D89"/>
     <w:multiLevelType w:val="multilevel"/>
     <w:tmpl w:val="F3E8C6DA"/>
@@ -25374,7 +26371,7 @@
       </w:rPr>
     </w:lvl>
   </w:abstractNum>
-  <w:abstractNum w:abstractNumId="82" w15:restartNumberingAfterBreak="0">
+  <w:abstractNum w:abstractNumId="87" w15:restartNumberingAfterBreak="0">
     <w:nsid w:val="7CC447D5"/>
     <w:multiLevelType w:val="multilevel"/>
     <w:tmpl w:val="F53EFE4C"/>
@@ -25523,7 +26520,7 @@
       </w:rPr>
     </w:lvl>
   </w:abstractNum>
-  <w:abstractNum w:abstractNumId="83" w15:restartNumberingAfterBreak="0">
+  <w:abstractNum w:abstractNumId="88" w15:restartNumberingAfterBreak="0">
     <w:nsid w:val="7DB559E2"/>
     <w:multiLevelType w:val="hybridMultilevel"/>
     <w:tmpl w:val="7780024C"/>
@@ -25636,7 +26633,7 @@
       </w:rPr>
     </w:lvl>
   </w:abstractNum>
-  <w:abstractNum w:abstractNumId="84" w15:restartNumberingAfterBreak="0">
+  <w:abstractNum w:abstractNumId="89" w15:restartNumberingAfterBreak="0">
     <w:nsid w:val="7E1B2E64"/>
     <w:multiLevelType w:val="hybridMultilevel"/>
     <w:tmpl w:val="E276480E"/>
@@ -25749,7 +26746,7 @@
       </w:rPr>
     </w:lvl>
   </w:abstractNum>
-  <w:abstractNum w:abstractNumId="85" w15:restartNumberingAfterBreak="0">
+  <w:abstractNum w:abstractNumId="90" w15:restartNumberingAfterBreak="0">
     <w:nsid w:val="7F007273"/>
     <w:multiLevelType w:val="multilevel"/>
     <w:tmpl w:val="F4D2AA58"/>
@@ -25899,262 +26896,277 @@
     </w:lvl>
   </w:abstractNum>
   <w:num w:numId="1" w16cid:durableId="448354519">
-    <w:abstractNumId w:val="41"/>
+    <w:abstractNumId w:val="44"/>
   </w:num>
   <w:num w:numId="2" w16cid:durableId="267277991">
     <w:abstractNumId w:val="4"/>
   </w:num>
   <w:num w:numId="3" w16cid:durableId="2100128481">
-    <w:abstractNumId w:val="11"/>
+    <w:abstractNumId w:val="12"/>
   </w:num>
   <w:num w:numId="4" w16cid:durableId="1373382629">
-    <w:abstractNumId w:val="76"/>
+    <w:abstractNumId w:val="80"/>
   </w:num>
   <w:num w:numId="5" w16cid:durableId="1915696360">
+    <w:abstractNumId w:val="54"/>
+  </w:num>
+  <w:num w:numId="6" w16cid:durableId="44070181">
+    <w:abstractNumId w:val="22"/>
+  </w:num>
+  <w:num w:numId="7" w16cid:durableId="493452589">
+    <w:abstractNumId w:val="87"/>
+  </w:num>
+  <w:num w:numId="8" w16cid:durableId="925652620">
+    <w:abstractNumId w:val="71"/>
+  </w:num>
+  <w:num w:numId="9" w16cid:durableId="2105029407">
+    <w:abstractNumId w:val="84"/>
+  </w:num>
+  <w:num w:numId="10" w16cid:durableId="1322386189">
+    <w:abstractNumId w:val="63"/>
+  </w:num>
+  <w:num w:numId="11" w16cid:durableId="1145046778">
+    <w:abstractNumId w:val="40"/>
+  </w:num>
+  <w:num w:numId="12" w16cid:durableId="886575476">
+    <w:abstractNumId w:val="73"/>
+  </w:num>
+  <w:num w:numId="13" w16cid:durableId="434445510">
+    <w:abstractNumId w:val="57"/>
+  </w:num>
+  <w:num w:numId="14" w16cid:durableId="1548566209">
+    <w:abstractNumId w:val="25"/>
+  </w:num>
+  <w:num w:numId="15" w16cid:durableId="981039911">
+    <w:abstractNumId w:val="7"/>
+  </w:num>
+  <w:num w:numId="16" w16cid:durableId="1081374075">
+    <w:abstractNumId w:val="45"/>
+  </w:num>
+  <w:num w:numId="17" w16cid:durableId="1595045529">
+    <w:abstractNumId w:val="14"/>
+  </w:num>
+  <w:num w:numId="18" w16cid:durableId="2018923113">
+    <w:abstractNumId w:val="16"/>
+  </w:num>
+  <w:num w:numId="19" w16cid:durableId="113258773">
     <w:abstractNumId w:val="51"/>
   </w:num>
-  <w:num w:numId="6" w16cid:durableId="44070181">
-    <w:abstractNumId w:val="20"/>
+  <w:num w:numId="20" w16cid:durableId="965312005">
+    <w:abstractNumId w:val="53"/>
   </w:num>
-  <w:num w:numId="7" w16cid:durableId="493452589">
+  <w:num w:numId="21" w16cid:durableId="343359711">
+    <w:abstractNumId w:val="89"/>
+  </w:num>
+  <w:num w:numId="22" w16cid:durableId="547838144">
     <w:abstractNumId w:val="82"/>
   </w:num>
-  <w:num w:numId="8" w16cid:durableId="925652620">
-    <w:abstractNumId w:val="68"/>
+  <w:num w:numId="23" w16cid:durableId="1031033420">
+    <w:abstractNumId w:val="69"/>
   </w:num>
-  <w:num w:numId="9" w16cid:durableId="2105029407">
-    <w:abstractNumId w:val="80"/>
+  <w:num w:numId="24" w16cid:durableId="519204185">
+    <w:abstractNumId w:val="33"/>
   </w:num>
-  <w:num w:numId="10" w16cid:durableId="1322386189">
-    <w:abstractNumId w:val="60"/>
+  <w:num w:numId="25" w16cid:durableId="1706559306">
+    <w:abstractNumId w:val="59"/>
   </w:num>
-  <w:num w:numId="11" w16cid:durableId="1145046778">
+  <w:num w:numId="26" w16cid:durableId="1050305727">
+    <w:abstractNumId w:val="42"/>
+  </w:num>
+  <w:num w:numId="27" w16cid:durableId="1439444620">
+    <w:abstractNumId w:val="52"/>
+  </w:num>
+  <w:num w:numId="28" w16cid:durableId="1831407804">
+    <w:abstractNumId w:val="9"/>
+  </w:num>
+  <w:num w:numId="29" w16cid:durableId="1777367443">
+    <w:abstractNumId w:val="35"/>
+  </w:num>
+  <w:num w:numId="30" w16cid:durableId="479158040">
+    <w:abstractNumId w:val="77"/>
+  </w:num>
+  <w:num w:numId="31" w16cid:durableId="2026666882">
+    <w:abstractNumId w:val="70"/>
+  </w:num>
+  <w:num w:numId="32" w16cid:durableId="1640843127">
+    <w:abstractNumId w:val="78"/>
+  </w:num>
+  <w:num w:numId="33" w16cid:durableId="83958067">
+    <w:abstractNumId w:val="39"/>
+  </w:num>
+  <w:num w:numId="34" w16cid:durableId="1831871160">
+    <w:abstractNumId w:val="75"/>
+  </w:num>
+  <w:num w:numId="35" w16cid:durableId="727649376">
     <w:abstractNumId w:val="37"/>
   </w:num>
-  <w:num w:numId="12" w16cid:durableId="886575476">
-    <w:abstractNumId w:val="70"/>
+  <w:num w:numId="36" w16cid:durableId="804392417">
+    <w:abstractNumId w:val="28"/>
   </w:num>
-  <w:num w:numId="13" w16cid:durableId="434445510">
-    <w:abstractNumId w:val="54"/>
-  </w:num>
-  <w:num w:numId="14" w16cid:durableId="1548566209">
-    <w:abstractNumId w:val="23"/>
-  </w:num>
-  <w:num w:numId="15" w16cid:durableId="981039911">
-    <w:abstractNumId w:val="6"/>
-  </w:num>
-  <w:num w:numId="16" w16cid:durableId="1081374075">
-    <w:abstractNumId w:val="42"/>
-  </w:num>
-  <w:num w:numId="17" w16cid:durableId="1595045529">
-    <w:abstractNumId w:val="13"/>
-  </w:num>
-  <w:num w:numId="18" w16cid:durableId="2018923113">
-    <w:abstractNumId w:val="14"/>
-  </w:num>
-  <w:num w:numId="19" w16cid:durableId="113258773">
-    <w:abstractNumId w:val="48"/>
-  </w:num>
-  <w:num w:numId="20" w16cid:durableId="965312005">
-    <w:abstractNumId w:val="50"/>
-  </w:num>
-  <w:num w:numId="21" w16cid:durableId="343359711">
-    <w:abstractNumId w:val="84"/>
-  </w:num>
-  <w:num w:numId="22" w16cid:durableId="547838144">
-    <w:abstractNumId w:val="78"/>
-  </w:num>
-  <w:num w:numId="23" w16cid:durableId="1031033420">
-    <w:abstractNumId w:val="66"/>
-  </w:num>
-  <w:num w:numId="24" w16cid:durableId="519204185">
-    <w:abstractNumId w:val="30"/>
-  </w:num>
-  <w:num w:numId="25" w16cid:durableId="1706559306">
+  <w:num w:numId="37" w16cid:durableId="2016688023">
     <w:abstractNumId w:val="56"/>
   </w:num>
-  <w:num w:numId="26" w16cid:durableId="1050305727">
-    <w:abstractNumId w:val="39"/>
-  </w:num>
-  <w:num w:numId="27" w16cid:durableId="1439444620">
-    <w:abstractNumId w:val="49"/>
-  </w:num>
-  <w:num w:numId="28" w16cid:durableId="1831407804">
-    <w:abstractNumId w:val="8"/>
-  </w:num>
-  <w:num w:numId="29" w16cid:durableId="1777367443">
-    <w:abstractNumId w:val="32"/>
-  </w:num>
-  <w:num w:numId="30" w16cid:durableId="479158040">
-    <w:abstractNumId w:val="74"/>
-  </w:num>
-  <w:num w:numId="31" w16cid:durableId="2026666882">
-    <w:abstractNumId w:val="67"/>
-  </w:num>
-  <w:num w:numId="32" w16cid:durableId="1640843127">
-    <w:abstractNumId w:val="75"/>
-  </w:num>
-  <w:num w:numId="33" w16cid:durableId="83958067">
-    <w:abstractNumId w:val="36"/>
-  </w:num>
-  <w:num w:numId="34" w16cid:durableId="1831871160">
-    <w:abstractNumId w:val="72"/>
-  </w:num>
-  <w:num w:numId="35" w16cid:durableId="727649376">
-    <w:abstractNumId w:val="34"/>
-  </w:num>
-  <w:num w:numId="36" w16cid:durableId="804392417">
-    <w:abstractNumId w:val="26"/>
-  </w:num>
-  <w:num w:numId="37" w16cid:durableId="2016688023">
-    <w:abstractNumId w:val="53"/>
-  </w:num>
   <w:num w:numId="38" w16cid:durableId="174225593">
-    <w:abstractNumId w:val="28"/>
+    <w:abstractNumId w:val="31"/>
   </w:num>
   <w:num w:numId="39" w16cid:durableId="1416510578">
-    <w:abstractNumId w:val="25"/>
+    <w:abstractNumId w:val="27"/>
   </w:num>
   <w:num w:numId="40" w16cid:durableId="1484666075">
-    <w:abstractNumId w:val="17"/>
+    <w:abstractNumId w:val="19"/>
   </w:num>
   <w:num w:numId="41" w16cid:durableId="844246322">
     <w:abstractNumId w:val="3"/>
   </w:num>
   <w:num w:numId="42" w16cid:durableId="937179671">
-    <w:abstractNumId w:val="10"/>
+    <w:abstractNumId w:val="11"/>
   </w:num>
   <w:num w:numId="43" w16cid:durableId="1671104138">
+    <w:abstractNumId w:val="41"/>
+  </w:num>
+  <w:num w:numId="44" w16cid:durableId="991250543">
+    <w:abstractNumId w:val="18"/>
+  </w:num>
+  <w:num w:numId="45" w16cid:durableId="57870292">
+    <w:abstractNumId w:val="58"/>
+  </w:num>
+  <w:num w:numId="46" w16cid:durableId="1132557770">
+    <w:abstractNumId w:val="90"/>
+  </w:num>
+  <w:num w:numId="47" w16cid:durableId="536357828">
+    <w:abstractNumId w:val="46"/>
+  </w:num>
+  <w:num w:numId="48" w16cid:durableId="604652666">
     <w:abstractNumId w:val="38"/>
   </w:num>
-  <w:num w:numId="44" w16cid:durableId="991250543">
-    <w:abstractNumId w:val="16"/>
+  <w:num w:numId="49" w16cid:durableId="1565608183">
+    <w:abstractNumId w:val="64"/>
   </w:num>
-  <w:num w:numId="45" w16cid:durableId="57870292">
+  <w:num w:numId="50" w16cid:durableId="1160925032">
+    <w:abstractNumId w:val="21"/>
+  </w:num>
+  <w:num w:numId="51" w16cid:durableId="1074083402">
+    <w:abstractNumId w:val="48"/>
+  </w:num>
+  <w:num w:numId="52" w16cid:durableId="505705463">
+    <w:abstractNumId w:val="30"/>
+  </w:num>
+  <w:num w:numId="53" w16cid:durableId="1442798831">
+    <w:abstractNumId w:val="8"/>
+  </w:num>
+  <w:num w:numId="54" w16cid:durableId="1059288088">
+    <w:abstractNumId w:val="47"/>
+  </w:num>
+  <w:num w:numId="55" w16cid:durableId="1800486562">
+    <w:abstractNumId w:val="32"/>
+  </w:num>
+  <w:num w:numId="56" w16cid:durableId="145174008">
+    <w:abstractNumId w:val="20"/>
+  </w:num>
+  <w:num w:numId="57" w16cid:durableId="572786032">
+    <w:abstractNumId w:val="26"/>
+  </w:num>
+  <w:num w:numId="58" w16cid:durableId="1153330480">
     <w:abstractNumId w:val="55"/>
   </w:num>
-  <w:num w:numId="46" w16cid:durableId="1132557770">
-    <w:abstractNumId w:val="85"/>
-  </w:num>
-  <w:num w:numId="47" w16cid:durableId="536357828">
-    <w:abstractNumId w:val="43"/>
-  </w:num>
-  <w:num w:numId="48" w16cid:durableId="604652666">
-    <w:abstractNumId w:val="35"/>
-  </w:num>
-  <w:num w:numId="49" w16cid:durableId="1565608183">
-    <w:abstractNumId w:val="61"/>
-  </w:num>
-  <w:num w:numId="50" w16cid:durableId="1160925032">
-    <w:abstractNumId w:val="19"/>
-  </w:num>
-  <w:num w:numId="51" w16cid:durableId="1074083402">
-    <w:abstractNumId w:val="45"/>
-  </w:num>
-  <w:num w:numId="52" w16cid:durableId="505705463">
-    <w:abstractNumId w:val="27"/>
-  </w:num>
-  <w:num w:numId="53" w16cid:durableId="1442798831">
-    <w:abstractNumId w:val="7"/>
-  </w:num>
-  <w:num w:numId="54" w16cid:durableId="1059288088">
-    <w:abstractNumId w:val="44"/>
-  </w:num>
-  <w:num w:numId="55" w16cid:durableId="1800486562">
-    <w:abstractNumId w:val="29"/>
-  </w:num>
-  <w:num w:numId="56" w16cid:durableId="145174008">
-    <w:abstractNumId w:val="18"/>
-  </w:num>
-  <w:num w:numId="57" w16cid:durableId="572786032">
-    <w:abstractNumId w:val="24"/>
-  </w:num>
-  <w:num w:numId="58" w16cid:durableId="1153330480">
-    <w:abstractNumId w:val="52"/>
-  </w:num>
   <w:num w:numId="59" w16cid:durableId="1571041670">
-    <w:abstractNumId w:val="12"/>
+    <w:abstractNumId w:val="13"/>
   </w:num>
   <w:num w:numId="60" w16cid:durableId="1139416074">
-    <w:abstractNumId w:val="33"/>
+    <w:abstractNumId w:val="36"/>
   </w:num>
   <w:num w:numId="61" w16cid:durableId="95058015">
-    <w:abstractNumId w:val="81"/>
+    <w:abstractNumId w:val="86"/>
   </w:num>
   <w:num w:numId="62" w16cid:durableId="326058897">
     <w:abstractNumId w:val="2"/>
   </w:num>
   <w:num w:numId="63" w16cid:durableId="1822691731">
-    <w:abstractNumId w:val="57"/>
+    <w:abstractNumId w:val="60"/>
   </w:num>
   <w:num w:numId="64" w16cid:durableId="491482094">
-    <w:abstractNumId w:val="40"/>
+    <w:abstractNumId w:val="43"/>
   </w:num>
   <w:num w:numId="65" w16cid:durableId="624000986">
     <w:abstractNumId w:val="1"/>
   </w:num>
   <w:num w:numId="66" w16cid:durableId="1185247772">
-    <w:abstractNumId w:val="21"/>
+    <w:abstractNumId w:val="23"/>
   </w:num>
   <w:num w:numId="67" w16cid:durableId="1462265845">
-    <w:abstractNumId w:val="22"/>
+    <w:abstractNumId w:val="24"/>
   </w:num>
   <w:num w:numId="68" w16cid:durableId="39746174">
     <w:abstractNumId w:val="0"/>
   </w:num>
   <w:num w:numId="69" w16cid:durableId="842819424">
-    <w:abstractNumId w:val="71"/>
+    <w:abstractNumId w:val="74"/>
   </w:num>
   <w:num w:numId="70" w16cid:durableId="2118792854">
+    <w:abstractNumId w:val="65"/>
+  </w:num>
+  <w:num w:numId="71" w16cid:durableId="1506017899">
+    <w:abstractNumId w:val="81"/>
+  </w:num>
+  <w:num w:numId="72" w16cid:durableId="1922787855">
+    <w:abstractNumId w:val="66"/>
+  </w:num>
+  <w:num w:numId="73" w16cid:durableId="240912039">
+    <w:abstractNumId w:val="10"/>
+  </w:num>
+  <w:num w:numId="74" w16cid:durableId="2005474240">
+    <w:abstractNumId w:val="49"/>
+  </w:num>
+  <w:num w:numId="75" w16cid:durableId="297106655">
+    <w:abstractNumId w:val="50"/>
+  </w:num>
+  <w:num w:numId="76" w16cid:durableId="1263805218">
+    <w:abstractNumId w:val="68"/>
+  </w:num>
+  <w:num w:numId="77" w16cid:durableId="336930133">
+    <w:abstractNumId w:val="83"/>
+  </w:num>
+  <w:num w:numId="78" w16cid:durableId="1358193180">
+    <w:abstractNumId w:val="67"/>
+  </w:num>
+  <w:num w:numId="79" w16cid:durableId="611593919">
+    <w:abstractNumId w:val="17"/>
+  </w:num>
+  <w:num w:numId="80" w16cid:durableId="968242157">
+    <w:abstractNumId w:val="6"/>
+  </w:num>
+  <w:num w:numId="81" w16cid:durableId="1669598111">
+    <w:abstractNumId w:val="61"/>
+  </w:num>
+  <w:num w:numId="82" w16cid:durableId="729501046">
+    <w:abstractNumId w:val="88"/>
+  </w:num>
+  <w:num w:numId="83" w16cid:durableId="1432243327">
+    <w:abstractNumId w:val="72"/>
+  </w:num>
+  <w:num w:numId="84" w16cid:durableId="1673410959">
     <w:abstractNumId w:val="62"/>
   </w:num>
-  <w:num w:numId="71" w16cid:durableId="1506017899">
-    <w:abstractNumId w:val="77"/>
+  <w:num w:numId="85" w16cid:durableId="946810640">
+    <w:abstractNumId w:val="34"/>
   </w:num>
-  <w:num w:numId="72" w16cid:durableId="1922787855">
-    <w:abstractNumId w:val="63"/>
+  <w:num w:numId="86" w16cid:durableId="1698191965">
+    <w:abstractNumId w:val="76"/>
   </w:num>
-  <w:num w:numId="73" w16cid:durableId="240912039">
-    <w:abstractNumId w:val="9"/>
+  <w:num w:numId="87" w16cid:durableId="1235510775">
+    <w:abstractNumId w:val="85"/>
   </w:num>
-  <w:num w:numId="74" w16cid:durableId="2005474240">
-    <w:abstractNumId w:val="46"/>
-  </w:num>
-  <w:num w:numId="75" w16cid:durableId="297106655">
-    <w:abstractNumId w:val="47"/>
-  </w:num>
-  <w:num w:numId="76" w16cid:durableId="1263805218">
-    <w:abstractNumId w:val="65"/>
-  </w:num>
-  <w:num w:numId="77" w16cid:durableId="336930133">
-    <w:abstractNumId w:val="79"/>
-  </w:num>
-  <w:num w:numId="78" w16cid:durableId="1358193180">
-    <w:abstractNumId w:val="64"/>
-  </w:num>
-  <w:num w:numId="79" w16cid:durableId="611593919">
+  <w:num w:numId="88" w16cid:durableId="653341763">
     <w:abstractNumId w:val="15"/>
   </w:num>
-  <w:num w:numId="80" w16cid:durableId="968242157">
+  <w:num w:numId="89" w16cid:durableId="42798808">
+    <w:abstractNumId w:val="29"/>
+  </w:num>
+  <w:num w:numId="90" w16cid:durableId="942416611">
     <w:abstractNumId w:val="5"/>
   </w:num>
-  <w:num w:numId="81" w16cid:durableId="1669598111">
-    <w:abstractNumId w:val="58"/>
-  </w:num>
-  <w:num w:numId="82" w16cid:durableId="729501046">
-    <w:abstractNumId w:val="83"/>
-  </w:num>
-  <w:num w:numId="83" w16cid:durableId="1432243327">
-    <w:abstractNumId w:val="69"/>
-  </w:num>
-  <w:num w:numId="84" w16cid:durableId="1673410959">
-    <w:abstractNumId w:val="59"/>
-  </w:num>
-  <w:num w:numId="85" w16cid:durableId="946810640">
-    <w:abstractNumId w:val="31"/>
-  </w:num>
-  <w:num w:numId="86" w16cid:durableId="1698191965">
-    <w:abstractNumId w:val="73"/>
+  <w:num w:numId="91" w16cid:durableId="820850216">
+    <w:abstractNumId w:val="79"/>
   </w:num>
   <w:numIdMacAtCleanup w:val="82"/>
 </w:numbering>
@@ -26560,7 +27572,7 @@
   <w:style w:type="paragraph" w:default="1" w:styleId="Normal">
     <w:name w:val="Normal"/>
     <w:qFormat/>
-    <w:rsid w:val="0051731B"/>
+    <w:rsid w:val="00F57AEB"/>
   </w:style>
   <w:style w:type="paragraph" w:styleId="Heading1">
     <w:name w:val="heading 1"/>
@@ -26764,7 +27776,6 @@
   <w:style w:type="character" w:default="1" w:styleId="DefaultParagraphFont">
     <w:name w:val="Default Paragraph Font"/>
     <w:uiPriority w:val="1"/>
-    <w:semiHidden/>
     <w:unhideWhenUsed/>
   </w:style>
   <w:style w:type="table" w:default="1" w:styleId="TableNormal">

</xml_diff>

<commit_message>
added july 6 eod
</commit_message>
<xml_diff>
--- a/EOD update daily.docx
+++ b/EOD update daily.docx
@@ -13029,6 +13029,128 @@
         <w:t>.</w:t>
       </w:r>
     </w:p>
+    <w:p>
+      <w:r>
+        <w:br w:type="page"/>
+      </w:r>
+    </w:p>
+    <w:p>
+      <w:pPr>
+        <w:pStyle w:val="Heading1"/>
+      </w:pPr>
+      <w:r>
+        <w:rPr>
+          <w:highlight w:val="yellow"/>
+        </w:rPr>
+        <w:lastRenderedPageBreak/>
+        <w:t>July 6 2026 Monday login: 9:07 AM logout: 5:00 PM</w:t>
+      </w:r>
+    </w:p>
+    <w:p>
+      <w:pPr>
+        <w:rPr>
+          <w:b/>
+          <w:bCs/>
+        </w:rPr>
+      </w:pPr>
+      <w:r>
+        <w:rPr>
+          <w:b/>
+          <w:bCs/>
+        </w:rPr>
+        <w:t>Team update:</w:t>
+      </w:r>
+    </w:p>
+    <w:p>
+      <w:pPr>
+        <w:pStyle w:val="ListParagraph"/>
+        <w:numPr>
+          <w:ilvl w:val="0"/>
+          <w:numId w:val="89"/>
+        </w:numPr>
+      </w:pPr>
+      <w:r>
+        <w:t xml:space="preserve">Checked the responsiveness of the Mayou Tech pages and verified they are responsive. </w:t>
+      </w:r>
+    </w:p>
+    <w:p>
+      <w:pPr>
+        <w:pStyle w:val="ListParagraph"/>
+        <w:numPr>
+          <w:ilvl w:val="0"/>
+          <w:numId w:val="89"/>
+        </w:numPr>
+      </w:pPr>
+      <w:r>
+        <w:t xml:space="preserve">Improved responsiveness for the Macstore Overview and Checkout pages. </w:t>
+      </w:r>
+    </w:p>
+    <w:p>
+      <w:pPr>
+        <w:pStyle w:val="ListParagraph"/>
+        <w:numPr>
+          <w:ilvl w:val="0"/>
+          <w:numId w:val="89"/>
+        </w:numPr>
+      </w:pPr>
+      <w:r>
+        <w:t xml:space="preserve">Investigated the Mayou Tech Admin Panel domain not found issue and documented it. </w:t>
+      </w:r>
+    </w:p>
+    <w:p>
+      <w:pPr>
+        <w:pStyle w:val="ListParagraph"/>
+        <w:numPr>
+          <w:ilvl w:val="0"/>
+          <w:numId w:val="89"/>
+        </w:numPr>
+      </w:pPr>
+      <w:r>
+        <w:t xml:space="preserve">Discussed the Blog UI and Get Comments implementation with the team. </w:t>
+      </w:r>
+    </w:p>
+    <w:p>
+      <w:pPr>
+        <w:pStyle w:val="ListParagraph"/>
+        <w:numPr>
+          <w:ilvl w:val="0"/>
+          <w:numId w:val="89"/>
+        </w:numPr>
+      </w:pPr>
+      <w:r>
+        <w:t>Completed the Get Comments UI;</w:t>
+      </w:r>
+      <w:r>
+        <w:t xml:space="preserve"> Post comment</w:t>
+      </w:r>
+      <w:r>
+        <w:t xml:space="preserve"> it still requires testing and bug fixes. </w:t>
+      </w:r>
+    </w:p>
+    <w:p>
+      <w:pPr>
+        <w:pStyle w:val="ListParagraph"/>
+        <w:numPr>
+          <w:ilvl w:val="0"/>
+          <w:numId w:val="89"/>
+        </w:numPr>
+      </w:pPr>
+      <w:r>
+        <w:t xml:space="preserve">Documented identified issues and discussed the next steps with the senior team member for further implementation. </w:t>
+      </w:r>
+    </w:p>
+    <w:p>
+      <w:pPr>
+        <w:pStyle w:val="ListParagraph"/>
+        <w:numPr>
+          <w:ilvl w:val="0"/>
+          <w:numId w:val="89"/>
+        </w:numPr>
+      </w:pPr>
+      <w:r>
+        <w:t>Created and submitted a pull request.</w:t>
+      </w:r>
+    </w:p>
     <w:sectPr>
       <w:pgSz w:w="12240" w:h="15840"/>
       <w:pgMar w:top="1440" w:right="1440" w:bottom="1440" w:left="1440" w:header="720" w:footer="720" w:gutter="0"/>
@@ -22335,6 +22457,119 @@
     </w:lvl>
   </w:abstractNum>
   <w:abstractNum w:abstractNumId="66" w15:restartNumberingAfterBreak="0">
+    <w:nsid w:val="5F5C0D48"/>
+    <w:multiLevelType w:val="hybridMultilevel"/>
+    <w:tmpl w:val="57C8007E"/>
+    <w:lvl w:ilvl="0" w:tplc="04090001">
+      <w:start w:val="1"/>
+      <w:numFmt w:val="bullet"/>
+      <w:lvlText w:val=""/>
+      <w:lvlJc w:val="left"/>
+      <w:pPr>
+        <w:ind w:left="720" w:hanging="360"/>
+      </w:pPr>
+      <w:rPr>
+        <w:rFonts w:ascii="Symbol" w:hAnsi="Symbol" w:hint="default"/>
+      </w:rPr>
+    </w:lvl>
+    <w:lvl w:ilvl="1" w:tplc="04090003" w:tentative="1">
+      <w:start w:val="1"/>
+      <w:numFmt w:val="bullet"/>
+      <w:lvlText w:val="o"/>
+      <w:lvlJc w:val="left"/>
+      <w:pPr>
+        <w:ind w:left="1440" w:hanging="360"/>
+      </w:pPr>
+      <w:rPr>
+        <w:rFonts w:ascii="Courier New" w:hAnsi="Courier New" w:cs="Courier New" w:hint="default"/>
+      </w:rPr>
+    </w:lvl>
+    <w:lvl w:ilvl="2" w:tplc="04090005" w:tentative="1">
+      <w:start w:val="1"/>
+      <w:numFmt w:val="bullet"/>
+      <w:lvlText w:val=""/>
+      <w:lvlJc w:val="left"/>
+      <w:pPr>
+        <w:ind w:left="2160" w:hanging="360"/>
+      </w:pPr>
+      <w:rPr>
+        <w:rFonts w:ascii="Wingdings" w:hAnsi="Wingdings" w:hint="default"/>
+      </w:rPr>
+    </w:lvl>
+    <w:lvl w:ilvl="3" w:tplc="04090001" w:tentative="1">
+      <w:start w:val="1"/>
+      <w:numFmt w:val="bullet"/>
+      <w:lvlText w:val=""/>
+      <w:lvlJc w:val="left"/>
+      <w:pPr>
+        <w:ind w:left="2880" w:hanging="360"/>
+      </w:pPr>
+      <w:rPr>
+        <w:rFonts w:ascii="Symbol" w:hAnsi="Symbol" w:hint="default"/>
+      </w:rPr>
+    </w:lvl>
+    <w:lvl w:ilvl="4" w:tplc="04090003" w:tentative="1">
+      <w:start w:val="1"/>
+      <w:numFmt w:val="bullet"/>
+      <w:lvlText w:val="o"/>
+      <w:lvlJc w:val="left"/>
+      <w:pPr>
+        <w:ind w:left="3600" w:hanging="360"/>
+      </w:pPr>
+      <w:rPr>
+        <w:rFonts w:ascii="Courier New" w:hAnsi="Courier New" w:cs="Courier New" w:hint="default"/>
+      </w:rPr>
+    </w:lvl>
+    <w:lvl w:ilvl="5" w:tplc="04090005" w:tentative="1">
+      <w:start w:val="1"/>
+      <w:numFmt w:val="bullet"/>
+      <w:lvlText w:val=""/>
+      <w:lvlJc w:val="left"/>
+      <w:pPr>
+        <w:ind w:left="4320" w:hanging="360"/>
+      </w:pPr>
+      <w:rPr>
+        <w:rFonts w:ascii="Wingdings" w:hAnsi="Wingdings" w:hint="default"/>
+      </w:rPr>
+    </w:lvl>
+    <w:lvl w:ilvl="6" w:tplc="04090001" w:tentative="1">
+      <w:start w:val="1"/>
+      <w:numFmt w:val="bullet"/>
+      <w:lvlText w:val=""/>
+      <w:lvlJc w:val="left"/>
+      <w:pPr>
+        <w:ind w:left="5040" w:hanging="360"/>
+      </w:pPr>
+      <w:rPr>
+        <w:rFonts w:ascii="Symbol" w:hAnsi="Symbol" w:hint="default"/>
+      </w:rPr>
+    </w:lvl>
+    <w:lvl w:ilvl="7" w:tplc="04090003" w:tentative="1">
+      <w:start w:val="1"/>
+      <w:numFmt w:val="bullet"/>
+      <w:lvlText w:val="o"/>
+      <w:lvlJc w:val="left"/>
+      <w:pPr>
+        <w:ind w:left="5760" w:hanging="360"/>
+      </w:pPr>
+      <w:rPr>
+        <w:rFonts w:ascii="Courier New" w:hAnsi="Courier New" w:cs="Courier New" w:hint="default"/>
+      </w:rPr>
+    </w:lvl>
+    <w:lvl w:ilvl="8" w:tplc="04090005" w:tentative="1">
+      <w:start w:val="1"/>
+      <w:numFmt w:val="bullet"/>
+      <w:lvlText w:val=""/>
+      <w:lvlJc w:val="left"/>
+      <w:pPr>
+        <w:ind w:left="6480" w:hanging="360"/>
+      </w:pPr>
+      <w:rPr>
+        <w:rFonts w:ascii="Wingdings" w:hAnsi="Wingdings" w:hint="default"/>
+      </w:rPr>
+    </w:lvl>
+  </w:abstractNum>
+  <w:abstractNum w:abstractNumId="67" w15:restartNumberingAfterBreak="0">
     <w:nsid w:val="628566FA"/>
     <w:multiLevelType w:val="multilevel"/>
     <w:tmpl w:val="C576D23C"/>
@@ -22483,7 +22718,7 @@
       </w:rPr>
     </w:lvl>
   </w:abstractNum>
-  <w:abstractNum w:abstractNumId="67" w15:restartNumberingAfterBreak="0">
+  <w:abstractNum w:abstractNumId="68" w15:restartNumberingAfterBreak="0">
     <w:nsid w:val="628F4BF2"/>
     <w:multiLevelType w:val="multilevel"/>
     <w:tmpl w:val="A680F95C"/>
@@ -22632,7 +22867,7 @@
       </w:rPr>
     </w:lvl>
   </w:abstractNum>
-  <w:abstractNum w:abstractNumId="68" w15:restartNumberingAfterBreak="0">
+  <w:abstractNum w:abstractNumId="69" w15:restartNumberingAfterBreak="0">
     <w:nsid w:val="65C91593"/>
     <w:multiLevelType w:val="multilevel"/>
     <w:tmpl w:val="B8C27B96"/>
@@ -22781,7 +23016,7 @@
       </w:rPr>
     </w:lvl>
   </w:abstractNum>
-  <w:abstractNum w:abstractNumId="69" w15:restartNumberingAfterBreak="0">
+  <w:abstractNum w:abstractNumId="70" w15:restartNumberingAfterBreak="0">
     <w:nsid w:val="667B593B"/>
     <w:multiLevelType w:val="multilevel"/>
     <w:tmpl w:val="CE58BC76"/>
@@ -22930,7 +23165,7 @@
       </w:rPr>
     </w:lvl>
   </w:abstractNum>
-  <w:abstractNum w:abstractNumId="70" w15:restartNumberingAfterBreak="0">
+  <w:abstractNum w:abstractNumId="71" w15:restartNumberingAfterBreak="0">
     <w:nsid w:val="69F3676B"/>
     <w:multiLevelType w:val="multilevel"/>
     <w:tmpl w:val="6F324960"/>
@@ -23079,7 +23314,7 @@
       </w:rPr>
     </w:lvl>
   </w:abstractNum>
-  <w:abstractNum w:abstractNumId="71" w15:restartNumberingAfterBreak="0">
+  <w:abstractNum w:abstractNumId="72" w15:restartNumberingAfterBreak="0">
     <w:nsid w:val="6EBE3AC0"/>
     <w:multiLevelType w:val="multilevel"/>
     <w:tmpl w:val="1FFA36AC"/>
@@ -23228,7 +23463,7 @@
       </w:rPr>
     </w:lvl>
   </w:abstractNum>
-  <w:abstractNum w:abstractNumId="72" w15:restartNumberingAfterBreak="0">
+  <w:abstractNum w:abstractNumId="73" w15:restartNumberingAfterBreak="0">
     <w:nsid w:val="6EFD3537"/>
     <w:multiLevelType w:val="multilevel"/>
     <w:tmpl w:val="97C84188"/>
@@ -23377,7 +23612,7 @@
       </w:rPr>
     </w:lvl>
   </w:abstractNum>
-  <w:abstractNum w:abstractNumId="73" w15:restartNumberingAfterBreak="0">
+  <w:abstractNum w:abstractNumId="74" w15:restartNumberingAfterBreak="0">
     <w:nsid w:val="6F322895"/>
     <w:multiLevelType w:val="hybridMultilevel"/>
     <w:tmpl w:val="0E2649FC"/>
@@ -23490,7 +23725,7 @@
       </w:rPr>
     </w:lvl>
   </w:abstractNum>
-  <w:abstractNum w:abstractNumId="74" w15:restartNumberingAfterBreak="0">
+  <w:abstractNum w:abstractNumId="75" w15:restartNumberingAfterBreak="0">
     <w:nsid w:val="6F4737A3"/>
     <w:multiLevelType w:val="multilevel"/>
     <w:tmpl w:val="6EC638F4"/>
@@ -23639,7 +23874,7 @@
       </w:rPr>
     </w:lvl>
   </w:abstractNum>
-  <w:abstractNum w:abstractNumId="75" w15:restartNumberingAfterBreak="0">
+  <w:abstractNum w:abstractNumId="76" w15:restartNumberingAfterBreak="0">
     <w:nsid w:val="71B866B8"/>
     <w:multiLevelType w:val="multilevel"/>
     <w:tmpl w:val="D6A61A68"/>
@@ -23788,7 +24023,7 @@
       </w:rPr>
     </w:lvl>
   </w:abstractNum>
-  <w:abstractNum w:abstractNumId="76" w15:restartNumberingAfterBreak="0">
+  <w:abstractNum w:abstractNumId="77" w15:restartNumberingAfterBreak="0">
     <w:nsid w:val="71FE7096"/>
     <w:multiLevelType w:val="multilevel"/>
     <w:tmpl w:val="DB9A52BE"/>
@@ -23937,7 +24172,7 @@
       </w:rPr>
     </w:lvl>
   </w:abstractNum>
-  <w:abstractNum w:abstractNumId="77" w15:restartNumberingAfterBreak="0">
+  <w:abstractNum w:abstractNumId="78" w15:restartNumberingAfterBreak="0">
     <w:nsid w:val="72601284"/>
     <w:multiLevelType w:val="hybridMultilevel"/>
     <w:tmpl w:val="19AC3094"/>
@@ -24050,7 +24285,7 @@
       </w:rPr>
     </w:lvl>
   </w:abstractNum>
-  <w:abstractNum w:abstractNumId="78" w15:restartNumberingAfterBreak="0">
+  <w:abstractNum w:abstractNumId="79" w15:restartNumberingAfterBreak="0">
     <w:nsid w:val="74D4408F"/>
     <w:multiLevelType w:val="multilevel"/>
     <w:tmpl w:val="C854DE4A"/>
@@ -24199,7 +24434,7 @@
       </w:rPr>
     </w:lvl>
   </w:abstractNum>
-  <w:abstractNum w:abstractNumId="79" w15:restartNumberingAfterBreak="0">
+  <w:abstractNum w:abstractNumId="80" w15:restartNumberingAfterBreak="0">
     <w:nsid w:val="75854F38"/>
     <w:multiLevelType w:val="multilevel"/>
     <w:tmpl w:val="D5CED040"/>
@@ -24348,7 +24583,7 @@
       </w:rPr>
     </w:lvl>
   </w:abstractNum>
-  <w:abstractNum w:abstractNumId="80" w15:restartNumberingAfterBreak="0">
+  <w:abstractNum w:abstractNumId="81" w15:restartNumberingAfterBreak="0">
     <w:nsid w:val="758D06DE"/>
     <w:multiLevelType w:val="multilevel"/>
     <w:tmpl w:val="E59ACD4A"/>
@@ -24497,7 +24732,7 @@
       </w:rPr>
     </w:lvl>
   </w:abstractNum>
-  <w:abstractNum w:abstractNumId="81" w15:restartNumberingAfterBreak="0">
+  <w:abstractNum w:abstractNumId="82" w15:restartNumberingAfterBreak="0">
     <w:nsid w:val="761A133C"/>
     <w:multiLevelType w:val="multilevel"/>
     <w:tmpl w:val="0F382862"/>
@@ -24646,7 +24881,7 @@
       </w:rPr>
     </w:lvl>
   </w:abstractNum>
-  <w:abstractNum w:abstractNumId="82" w15:restartNumberingAfterBreak="0">
+  <w:abstractNum w:abstractNumId="83" w15:restartNumberingAfterBreak="0">
     <w:nsid w:val="76A27D4F"/>
     <w:multiLevelType w:val="multilevel"/>
     <w:tmpl w:val="1D745170"/>
@@ -24795,7 +25030,7 @@
       </w:rPr>
     </w:lvl>
   </w:abstractNum>
-  <w:abstractNum w:abstractNumId="83" w15:restartNumberingAfterBreak="0">
+  <w:abstractNum w:abstractNumId="84" w15:restartNumberingAfterBreak="0">
     <w:nsid w:val="796D1793"/>
     <w:multiLevelType w:val="hybridMultilevel"/>
     <w:tmpl w:val="2938CC24"/>
@@ -24908,7 +25143,7 @@
       </w:rPr>
     </w:lvl>
   </w:abstractNum>
-  <w:abstractNum w:abstractNumId="84" w15:restartNumberingAfterBreak="0">
+  <w:abstractNum w:abstractNumId="85" w15:restartNumberingAfterBreak="0">
     <w:nsid w:val="7A0A2BF8"/>
     <w:multiLevelType w:val="multilevel"/>
     <w:tmpl w:val="139229D4"/>
@@ -25057,7 +25292,7 @@
       </w:rPr>
     </w:lvl>
   </w:abstractNum>
-  <w:abstractNum w:abstractNumId="85" w15:restartNumberingAfterBreak="0">
+  <w:abstractNum w:abstractNumId="86" w15:restartNumberingAfterBreak="0">
     <w:nsid w:val="7A251DB5"/>
     <w:multiLevelType w:val="multilevel"/>
     <w:tmpl w:val="A60243AE"/>
@@ -25206,7 +25441,7 @@
       </w:rPr>
     </w:lvl>
   </w:abstractNum>
-  <w:abstractNum w:abstractNumId="86" w15:restartNumberingAfterBreak="0">
+  <w:abstractNum w:abstractNumId="87" w15:restartNumberingAfterBreak="0">
     <w:nsid w:val="7A2B27BF"/>
     <w:multiLevelType w:val="hybridMultilevel"/>
     <w:tmpl w:val="1B6C6C7E"/>
@@ -25319,7 +25554,7 @@
       </w:rPr>
     </w:lvl>
   </w:abstractNum>
-  <w:abstractNum w:abstractNumId="87" w15:restartNumberingAfterBreak="0">
+  <w:abstractNum w:abstractNumId="88" w15:restartNumberingAfterBreak="0">
     <w:nsid w:val="7C6F0D89"/>
     <w:multiLevelType w:val="multilevel"/>
     <w:tmpl w:val="F3E8C6DA"/>
@@ -25468,7 +25703,7 @@
       </w:rPr>
     </w:lvl>
   </w:abstractNum>
-  <w:abstractNum w:abstractNumId="88" w15:restartNumberingAfterBreak="0">
+  <w:abstractNum w:abstractNumId="89" w15:restartNumberingAfterBreak="0">
     <w:nsid w:val="7CC447D5"/>
     <w:multiLevelType w:val="multilevel"/>
     <w:tmpl w:val="F53EFE4C"/>
@@ -25617,7 +25852,7 @@
       </w:rPr>
     </w:lvl>
   </w:abstractNum>
-  <w:abstractNum w:abstractNumId="89" w15:restartNumberingAfterBreak="0">
+  <w:abstractNum w:abstractNumId="90" w15:restartNumberingAfterBreak="0">
     <w:nsid w:val="7DB559E2"/>
     <w:multiLevelType w:val="hybridMultilevel"/>
     <w:tmpl w:val="7780024C"/>
@@ -25730,7 +25965,7 @@
       </w:rPr>
     </w:lvl>
   </w:abstractNum>
-  <w:abstractNum w:abstractNumId="90" w15:restartNumberingAfterBreak="0">
+  <w:abstractNum w:abstractNumId="91" w15:restartNumberingAfterBreak="0">
     <w:nsid w:val="7E1B2E64"/>
     <w:multiLevelType w:val="hybridMultilevel"/>
     <w:tmpl w:val="E276480E"/>
@@ -25843,7 +26078,7 @@
       </w:rPr>
     </w:lvl>
   </w:abstractNum>
-  <w:abstractNum w:abstractNumId="91" w15:restartNumberingAfterBreak="0">
+  <w:abstractNum w:abstractNumId="92" w15:restartNumberingAfterBreak="0">
     <w:nsid w:val="7F007273"/>
     <w:multiLevelType w:val="multilevel"/>
     <w:tmpl w:val="F4D2AA58"/>
@@ -26002,7 +26237,7 @@
     <w:abstractNumId w:val="13"/>
   </w:num>
   <w:num w:numId="4" w16cid:durableId="1373382629">
-    <w:abstractNumId w:val="81"/>
+    <w:abstractNumId w:val="82"/>
   </w:num>
   <w:num w:numId="5" w16cid:durableId="1915696360">
     <w:abstractNumId w:val="55"/>
@@ -26011,13 +26246,13 @@
     <w:abstractNumId w:val="23"/>
   </w:num>
   <w:num w:numId="7" w16cid:durableId="493452589">
-    <w:abstractNumId w:val="88"/>
+    <w:abstractNumId w:val="89"/>
   </w:num>
   <w:num w:numId="8" w16cid:durableId="925652620">
-    <w:abstractNumId w:val="72"/>
+    <w:abstractNumId w:val="73"/>
   </w:num>
   <w:num w:numId="9" w16cid:durableId="2105029407">
-    <w:abstractNumId w:val="85"/>
+    <w:abstractNumId w:val="86"/>
   </w:num>
   <w:num w:numId="10" w16cid:durableId="1322386189">
     <w:abstractNumId w:val="64"/>
@@ -26026,7 +26261,7 @@
     <w:abstractNumId w:val="41"/>
   </w:num>
   <w:num w:numId="12" w16cid:durableId="886575476">
-    <w:abstractNumId w:val="74"/>
+    <w:abstractNumId w:val="75"/>
   </w:num>
   <w:num w:numId="13" w16cid:durableId="434445510">
     <w:abstractNumId w:val="58"/>
@@ -26053,13 +26288,13 @@
     <w:abstractNumId w:val="54"/>
   </w:num>
   <w:num w:numId="21" w16cid:durableId="343359711">
-    <w:abstractNumId w:val="90"/>
+    <w:abstractNumId w:val="91"/>
   </w:num>
   <w:num w:numId="22" w16cid:durableId="547838144">
-    <w:abstractNumId w:val="83"/>
+    <w:abstractNumId w:val="84"/>
   </w:num>
   <w:num w:numId="23" w16cid:durableId="1031033420">
-    <w:abstractNumId w:val="70"/>
+    <w:abstractNumId w:val="71"/>
   </w:num>
   <w:num w:numId="24" w16cid:durableId="519204185">
     <w:abstractNumId w:val="34"/>
@@ -26080,19 +26315,19 @@
     <w:abstractNumId w:val="36"/>
   </w:num>
   <w:num w:numId="30" w16cid:durableId="479158040">
-    <w:abstractNumId w:val="78"/>
+    <w:abstractNumId w:val="79"/>
   </w:num>
   <w:num w:numId="31" w16cid:durableId="2026666882">
-    <w:abstractNumId w:val="71"/>
+    <w:abstractNumId w:val="72"/>
   </w:num>
   <w:num w:numId="32" w16cid:durableId="1640843127">
-    <w:abstractNumId w:val="79"/>
+    <w:abstractNumId w:val="80"/>
   </w:num>
   <w:num w:numId="33" w16cid:durableId="83958067">
     <w:abstractNumId w:val="40"/>
   </w:num>
   <w:num w:numId="34" w16cid:durableId="1831871160">
-    <w:abstractNumId w:val="76"/>
+    <w:abstractNumId w:val="77"/>
   </w:num>
   <w:num w:numId="35" w16cid:durableId="727649376">
     <w:abstractNumId w:val="38"/>
@@ -26128,7 +26363,7 @@
     <w:abstractNumId w:val="59"/>
   </w:num>
   <w:num w:numId="46" w16cid:durableId="1132557770">
-    <w:abstractNumId w:val="91"/>
+    <w:abstractNumId w:val="92"/>
   </w:num>
   <w:num w:numId="47" w16cid:durableId="536357828">
     <w:abstractNumId w:val="47"/>
@@ -26173,7 +26408,7 @@
     <w:abstractNumId w:val="37"/>
   </w:num>
   <w:num w:numId="61" w16cid:durableId="95058015">
-    <w:abstractNumId w:val="87"/>
+    <w:abstractNumId w:val="88"/>
   </w:num>
   <w:num w:numId="62" w16cid:durableId="326058897">
     <w:abstractNumId w:val="2"/>
@@ -26197,16 +26432,16 @@
     <w:abstractNumId w:val="0"/>
   </w:num>
   <w:num w:numId="69" w16cid:durableId="842819424">
-    <w:abstractNumId w:val="75"/>
+    <w:abstractNumId w:val="76"/>
   </w:num>
   <w:num w:numId="70" w16cid:durableId="2118792854">
-    <w:abstractNumId w:val="66"/>
+    <w:abstractNumId w:val="67"/>
   </w:num>
   <w:num w:numId="71" w16cid:durableId="1506017899">
-    <w:abstractNumId w:val="82"/>
+    <w:abstractNumId w:val="83"/>
   </w:num>
   <w:num w:numId="72" w16cid:durableId="1922787855">
-    <w:abstractNumId w:val="67"/>
+    <w:abstractNumId w:val="68"/>
   </w:num>
   <w:num w:numId="73" w16cid:durableId="240912039">
     <w:abstractNumId w:val="11"/>
@@ -26218,13 +26453,13 @@
     <w:abstractNumId w:val="51"/>
   </w:num>
   <w:num w:numId="76" w16cid:durableId="1263805218">
-    <w:abstractNumId w:val="69"/>
+    <w:abstractNumId w:val="70"/>
   </w:num>
   <w:num w:numId="77" w16cid:durableId="336930133">
-    <w:abstractNumId w:val="84"/>
+    <w:abstractNumId w:val="85"/>
   </w:num>
   <w:num w:numId="78" w16cid:durableId="1358193180">
-    <w:abstractNumId w:val="68"/>
+    <w:abstractNumId w:val="69"/>
   </w:num>
   <w:num w:numId="79" w16cid:durableId="611593919">
     <w:abstractNumId w:val="18"/>
@@ -26236,10 +26471,10 @@
     <w:abstractNumId w:val="62"/>
   </w:num>
   <w:num w:numId="82" w16cid:durableId="729501046">
-    <w:abstractNumId w:val="89"/>
+    <w:abstractNumId w:val="90"/>
   </w:num>
   <w:num w:numId="83" w16cid:durableId="1432243327">
-    <w:abstractNumId w:val="73"/>
+    <w:abstractNumId w:val="74"/>
   </w:num>
   <w:num w:numId="84" w16cid:durableId="1673410959">
     <w:abstractNumId w:val="63"/>
@@ -26248,10 +26483,10 @@
     <w:abstractNumId w:val="35"/>
   </w:num>
   <w:num w:numId="86" w16cid:durableId="1698191965">
-    <w:abstractNumId w:val="77"/>
+    <w:abstractNumId w:val="78"/>
   </w:num>
   <w:num w:numId="87" w16cid:durableId="1235510775">
-    <w:abstractNumId w:val="86"/>
+    <w:abstractNumId w:val="87"/>
   </w:num>
   <w:num w:numId="88" w16cid:durableId="653341763">
     <w:abstractNumId w:val="16"/>
@@ -26263,10 +26498,13 @@
     <w:abstractNumId w:val="5"/>
   </w:num>
   <w:num w:numId="91" w16cid:durableId="820850216">
-    <w:abstractNumId w:val="80"/>
+    <w:abstractNumId w:val="81"/>
   </w:num>
   <w:num w:numId="92" w16cid:durableId="689570362">
     <w:abstractNumId w:val="7"/>
+  </w:num>
+  <w:num w:numId="93" w16cid:durableId="1318530843">
+    <w:abstractNumId w:val="66"/>
   </w:num>
   <w:numIdMacAtCleanup w:val="82"/>
 </w:numbering>

</xml_diff>

<commit_message>
july 7 eod added
</commit_message>
<xml_diff>
--- a/EOD update daily.docx
+++ b/EOD update daily.docx
@@ -13151,6 +13151,269 @@
         <w:t>Created and submitted a pull request.</w:t>
       </w:r>
     </w:p>
+    <w:p>
+      <w:r>
+        <w:br w:type="page"/>
+      </w:r>
+    </w:p>
+    <w:p>
+      <w:pPr>
+        <w:pStyle w:val="Heading1"/>
+      </w:pPr>
+      <w:r>
+        <w:rPr>
+          <w:highlight w:val="yellow"/>
+        </w:rPr>
+        <w:lastRenderedPageBreak/>
+        <w:t xml:space="preserve">July </w:t>
+      </w:r>
+      <w:r>
+        <w:rPr>
+          <w:highlight w:val="yellow"/>
+        </w:rPr>
+        <w:t>7</w:t>
+      </w:r>
+      <w:r>
+        <w:rPr>
+          <w:highlight w:val="yellow"/>
+        </w:rPr>
+        <w:t xml:space="preserve"> 2026 </w:t>
+      </w:r>
+      <w:r>
+        <w:rPr>
+          <w:highlight w:val="yellow"/>
+        </w:rPr>
+        <w:t>Tuesday</w:t>
+      </w:r>
+      <w:r>
+        <w:rPr>
+          <w:highlight w:val="yellow"/>
+        </w:rPr>
+        <w:t xml:space="preserve"> login: </w:t>
+      </w:r>
+      <w:r>
+        <w:rPr>
+          <w:highlight w:val="yellow"/>
+        </w:rPr>
+        <w:t>8</w:t>
+      </w:r>
+      <w:r>
+        <w:rPr>
+          <w:highlight w:val="yellow"/>
+        </w:rPr>
+        <w:t>:</w:t>
+      </w:r>
+      <w:r>
+        <w:rPr>
+          <w:highlight w:val="yellow"/>
+        </w:rPr>
+        <w:t>52</w:t>
+      </w:r>
+      <w:r>
+        <w:rPr>
+          <w:highlight w:val="yellow"/>
+        </w:rPr>
+        <w:t xml:space="preserve"> AM logout: 5:</w:t>
+      </w:r>
+      <w:r>
+        <w:rPr>
+          <w:highlight w:val="yellow"/>
+        </w:rPr>
+        <w:t>40</w:t>
+      </w:r>
+      <w:r>
+        <w:rPr>
+          <w:highlight w:val="yellow"/>
+        </w:rPr>
+        <w:t xml:space="preserve"> PM</w:t>
+      </w:r>
+    </w:p>
+    <w:p>
+      <w:pPr>
+        <w:pStyle w:val="ListParagraph"/>
+        <w:numPr>
+          <w:ilvl w:val="0"/>
+          <w:numId w:val="89"/>
+        </w:numPr>
+      </w:pPr>
+      <w:r>
+        <w:t xml:space="preserve">Attended and listened to the QA </w:t>
+      </w:r>
+      <w:r>
+        <w:t xml:space="preserve">intern </w:t>
+      </w:r>
+      <w:r>
+        <w:t>presentation.</w:t>
+      </w:r>
+    </w:p>
+    <w:p>
+      <w:pPr>
+        <w:pStyle w:val="ListParagraph"/>
+        <w:numPr>
+          <w:ilvl w:val="0"/>
+          <w:numId w:val="89"/>
+        </w:numPr>
+      </w:pPr>
+      <w:r>
+        <w:t>Tested and validated the Blog API. Verified that all API endpoints are functioning correctly.</w:t>
+      </w:r>
+    </w:p>
+    <w:p>
+      <w:pPr>
+        <w:pStyle w:val="ListParagraph"/>
+        <w:numPr>
+          <w:ilvl w:val="0"/>
+          <w:numId w:val="89"/>
+        </w:numPr>
+      </w:pPr>
+      <w:r>
+        <w:t>Discussed the current progress with the senior and provided updates on the system status and identified issues.</w:t>
+      </w:r>
+    </w:p>
+    <w:p>
+      <w:pPr>
+        <w:pStyle w:val="ListParagraph"/>
+        <w:numPr>
+          <w:ilvl w:val="0"/>
+          <w:numId w:val="89"/>
+        </w:numPr>
+      </w:pPr>
+      <w:r>
+        <w:t>Told senior about the current big issue about offer product order and why the issue occur and where might be the problem.</w:t>
+      </w:r>
+    </w:p>
+    <w:p>
+      <w:pPr>
+        <w:pStyle w:val="ListParagraph"/>
+        <w:numPr>
+          <w:ilvl w:val="0"/>
+          <w:numId w:val="89"/>
+        </w:numPr>
+      </w:pPr>
+      <w:r>
+        <w:t>Do Planning the Blog integration system.</w:t>
+      </w:r>
+    </w:p>
+    <w:p>
+      <w:pPr>
+        <w:pStyle w:val="ListParagraph"/>
+        <w:numPr>
+          <w:ilvl w:val="0"/>
+          <w:numId w:val="89"/>
+        </w:numPr>
+      </w:pPr>
+      <w:r>
+        <w:t>Set up and integrated the Blog system into the application.</w:t>
+      </w:r>
+    </w:p>
+    <w:p>
+      <w:pPr>
+        <w:pStyle w:val="ListParagraph"/>
+        <w:numPr>
+          <w:ilvl w:val="0"/>
+          <w:numId w:val="89"/>
+        </w:numPr>
+      </w:pPr>
+      <w:r>
+        <w:t>Verified that blog posts are displaying correctly and that comments can be successfully posted and displayed.</w:t>
+      </w:r>
+    </w:p>
+    <w:p>
+      <w:pPr>
+        <w:pStyle w:val="ListParagraph"/>
+        <w:numPr>
+          <w:ilvl w:val="0"/>
+          <w:numId w:val="89"/>
+        </w:numPr>
+      </w:pPr>
+      <w:r>
+        <w:t>Performed initial cleanup of the implementation. Additional code review and refinement are still required before raising a pull request to the GitHub main branch.</w:t>
+      </w:r>
+    </w:p>
+    <w:p>
+      <w:r>
+        <w:br w:type="page"/>
+      </w:r>
+    </w:p>
+    <w:p>
+      <w:pPr>
+        <w:pStyle w:val="Heading1"/>
+      </w:pPr>
+      <w:r>
+        <w:rPr>
+          <w:highlight w:val="yellow"/>
+        </w:rPr>
+        <w:lastRenderedPageBreak/>
+        <w:t xml:space="preserve">July </w:t>
+      </w:r>
+      <w:r>
+        <w:rPr>
+          <w:highlight w:val="yellow"/>
+        </w:rPr>
+        <w:t>8</w:t>
+      </w:r>
+      <w:r>
+        <w:rPr>
+          <w:highlight w:val="yellow"/>
+        </w:rPr>
+        <w:t xml:space="preserve"> 2026 </w:t>
+      </w:r>
+      <w:r>
+        <w:rPr>
+          <w:highlight w:val="yellow"/>
+        </w:rPr>
+        <w:t>Wednesday</w:t>
+      </w:r>
+      <w:r>
+        <w:rPr>
+          <w:highlight w:val="yellow"/>
+        </w:rPr>
+        <w:t xml:space="preserve"> login:</w:t>
+      </w:r>
+      <w:r>
+        <w:rPr>
+          <w:highlight w:val="yellow"/>
+        </w:rPr>
+        <w:t>9</w:t>
+      </w:r>
+      <w:r>
+        <w:rPr>
+          <w:highlight w:val="yellow"/>
+        </w:rPr>
+        <w:t>:</w:t>
+      </w:r>
+      <w:r>
+        <w:rPr>
+          <w:highlight w:val="yellow"/>
+        </w:rPr>
+        <w:t>09</w:t>
+      </w:r>
+      <w:r>
+        <w:rPr>
+          <w:highlight w:val="yellow"/>
+        </w:rPr>
+        <w:t xml:space="preserve"> AM logout: 5:</w:t>
+      </w:r>
+      <w:r>
+        <w:rPr>
+          <w:highlight w:val="yellow"/>
+        </w:rPr>
+        <w:t>0</w:t>
+      </w:r>
+      <w:r>
+        <w:rPr>
+          <w:highlight w:val="yellow"/>
+        </w:rPr>
+        <w:t>0</w:t>
+      </w:r>
+      <w:r>
+        <w:rPr>
+          <w:highlight w:val="yellow"/>
+        </w:rPr>
+        <w:t xml:space="preserve"> PM</w:t>
+      </w:r>
+    </w:p>
+    <w:p/>
     <w:sectPr>
       <w:pgSz w:w="12240" w:h="15840"/>
       <w:pgMar w:top="1440" w:right="1440" w:bottom="1440" w:left="1440" w:header="720" w:footer="720" w:gutter="0"/>
@@ -17829,6 +18092,119 @@
     </w:lvl>
   </w:abstractNum>
   <w:abstractNum w:abstractNumId="33" w15:restartNumberingAfterBreak="0">
+    <w:nsid w:val="30520254"/>
+    <w:multiLevelType w:val="hybridMultilevel"/>
+    <w:tmpl w:val="20828A9C"/>
+    <w:lvl w:ilvl="0" w:tplc="04090001">
+      <w:start w:val="1"/>
+      <w:numFmt w:val="bullet"/>
+      <w:lvlText w:val=""/>
+      <w:lvlJc w:val="left"/>
+      <w:pPr>
+        <w:ind w:left="720" w:hanging="360"/>
+      </w:pPr>
+      <w:rPr>
+        <w:rFonts w:ascii="Symbol" w:hAnsi="Symbol" w:hint="default"/>
+      </w:rPr>
+    </w:lvl>
+    <w:lvl w:ilvl="1" w:tplc="04090003" w:tentative="1">
+      <w:start w:val="1"/>
+      <w:numFmt w:val="bullet"/>
+      <w:lvlText w:val="o"/>
+      <w:lvlJc w:val="left"/>
+      <w:pPr>
+        <w:ind w:left="1440" w:hanging="360"/>
+      </w:pPr>
+      <w:rPr>
+        <w:rFonts w:ascii="Courier New" w:hAnsi="Courier New" w:cs="Courier New" w:hint="default"/>
+      </w:rPr>
+    </w:lvl>
+    <w:lvl w:ilvl="2" w:tplc="04090005" w:tentative="1">
+      <w:start w:val="1"/>
+      <w:numFmt w:val="bullet"/>
+      <w:lvlText w:val=""/>
+      <w:lvlJc w:val="left"/>
+      <w:pPr>
+        <w:ind w:left="2160" w:hanging="360"/>
+      </w:pPr>
+      <w:rPr>
+        <w:rFonts w:ascii="Wingdings" w:hAnsi="Wingdings" w:hint="default"/>
+      </w:rPr>
+    </w:lvl>
+    <w:lvl w:ilvl="3" w:tplc="04090001" w:tentative="1">
+      <w:start w:val="1"/>
+      <w:numFmt w:val="bullet"/>
+      <w:lvlText w:val=""/>
+      <w:lvlJc w:val="left"/>
+      <w:pPr>
+        <w:ind w:left="2880" w:hanging="360"/>
+      </w:pPr>
+      <w:rPr>
+        <w:rFonts w:ascii="Symbol" w:hAnsi="Symbol" w:hint="default"/>
+      </w:rPr>
+    </w:lvl>
+    <w:lvl w:ilvl="4" w:tplc="04090003" w:tentative="1">
+      <w:start w:val="1"/>
+      <w:numFmt w:val="bullet"/>
+      <w:lvlText w:val="o"/>
+      <w:lvlJc w:val="left"/>
+      <w:pPr>
+        <w:ind w:left="3600" w:hanging="360"/>
+      </w:pPr>
+      <w:rPr>
+        <w:rFonts w:ascii="Courier New" w:hAnsi="Courier New" w:cs="Courier New" w:hint="default"/>
+      </w:rPr>
+    </w:lvl>
+    <w:lvl w:ilvl="5" w:tplc="04090005" w:tentative="1">
+      <w:start w:val="1"/>
+      <w:numFmt w:val="bullet"/>
+      <w:lvlText w:val=""/>
+      <w:lvlJc w:val="left"/>
+      <w:pPr>
+        <w:ind w:left="4320" w:hanging="360"/>
+      </w:pPr>
+      <w:rPr>
+        <w:rFonts w:ascii="Wingdings" w:hAnsi="Wingdings" w:hint="default"/>
+      </w:rPr>
+    </w:lvl>
+    <w:lvl w:ilvl="6" w:tplc="04090001" w:tentative="1">
+      <w:start w:val="1"/>
+      <w:numFmt w:val="bullet"/>
+      <w:lvlText w:val=""/>
+      <w:lvlJc w:val="left"/>
+      <w:pPr>
+        <w:ind w:left="5040" w:hanging="360"/>
+      </w:pPr>
+      <w:rPr>
+        <w:rFonts w:ascii="Symbol" w:hAnsi="Symbol" w:hint="default"/>
+      </w:rPr>
+    </w:lvl>
+    <w:lvl w:ilvl="7" w:tplc="04090003" w:tentative="1">
+      <w:start w:val="1"/>
+      <w:numFmt w:val="bullet"/>
+      <w:lvlText w:val="o"/>
+      <w:lvlJc w:val="left"/>
+      <w:pPr>
+        <w:ind w:left="5760" w:hanging="360"/>
+      </w:pPr>
+      <w:rPr>
+        <w:rFonts w:ascii="Courier New" w:hAnsi="Courier New" w:cs="Courier New" w:hint="default"/>
+      </w:rPr>
+    </w:lvl>
+    <w:lvl w:ilvl="8" w:tplc="04090005" w:tentative="1">
+      <w:start w:val="1"/>
+      <w:numFmt w:val="bullet"/>
+      <w:lvlText w:val=""/>
+      <w:lvlJc w:val="left"/>
+      <w:pPr>
+        <w:ind w:left="6480" w:hanging="360"/>
+      </w:pPr>
+      <w:rPr>
+        <w:rFonts w:ascii="Wingdings" w:hAnsi="Wingdings" w:hint="default"/>
+      </w:rPr>
+    </w:lvl>
+  </w:abstractNum>
+  <w:abstractNum w:abstractNumId="34" w15:restartNumberingAfterBreak="0">
     <w:nsid w:val="30863A82"/>
     <w:multiLevelType w:val="multilevel"/>
     <w:tmpl w:val="7A7664C8"/>
@@ -17977,7 +18353,7 @@
       </w:rPr>
     </w:lvl>
   </w:abstractNum>
-  <w:abstractNum w:abstractNumId="34" w15:restartNumberingAfterBreak="0">
+  <w:abstractNum w:abstractNumId="35" w15:restartNumberingAfterBreak="0">
     <w:nsid w:val="30C41755"/>
     <w:multiLevelType w:val="multilevel"/>
     <w:tmpl w:val="812C0BF0"/>
@@ -18126,7 +18502,7 @@
       </w:rPr>
     </w:lvl>
   </w:abstractNum>
-  <w:abstractNum w:abstractNumId="35" w15:restartNumberingAfterBreak="0">
+  <w:abstractNum w:abstractNumId="36" w15:restartNumberingAfterBreak="0">
     <w:nsid w:val="31B76C7C"/>
     <w:multiLevelType w:val="hybridMultilevel"/>
     <w:tmpl w:val="533CBDFC"/>
@@ -18239,7 +18615,7 @@
       </w:rPr>
     </w:lvl>
   </w:abstractNum>
-  <w:abstractNum w:abstractNumId="36" w15:restartNumberingAfterBreak="0">
+  <w:abstractNum w:abstractNumId="37" w15:restartNumberingAfterBreak="0">
     <w:nsid w:val="329A797C"/>
     <w:multiLevelType w:val="multilevel"/>
     <w:tmpl w:val="DA8EF3C0"/>
@@ -18388,7 +18764,7 @@
       </w:rPr>
     </w:lvl>
   </w:abstractNum>
-  <w:abstractNum w:abstractNumId="37" w15:restartNumberingAfterBreak="0">
+  <w:abstractNum w:abstractNumId="38" w15:restartNumberingAfterBreak="0">
     <w:nsid w:val="33FB5ACC"/>
     <w:multiLevelType w:val="multilevel"/>
     <w:tmpl w:val="1770922E"/>
@@ -18537,7 +18913,7 @@
       </w:rPr>
     </w:lvl>
   </w:abstractNum>
-  <w:abstractNum w:abstractNumId="38" w15:restartNumberingAfterBreak="0">
+  <w:abstractNum w:abstractNumId="39" w15:restartNumberingAfterBreak="0">
     <w:nsid w:val="34B53B68"/>
     <w:multiLevelType w:val="multilevel"/>
     <w:tmpl w:val="75F4A9D8"/>
@@ -18686,7 +19062,7 @@
       </w:rPr>
     </w:lvl>
   </w:abstractNum>
-  <w:abstractNum w:abstractNumId="39" w15:restartNumberingAfterBreak="0">
+  <w:abstractNum w:abstractNumId="40" w15:restartNumberingAfterBreak="0">
     <w:nsid w:val="35082C2D"/>
     <w:multiLevelType w:val="multilevel"/>
     <w:tmpl w:val="00C280E4"/>
@@ -18835,7 +19211,7 @@
       </w:rPr>
     </w:lvl>
   </w:abstractNum>
-  <w:abstractNum w:abstractNumId="40" w15:restartNumberingAfterBreak="0">
+  <w:abstractNum w:abstractNumId="41" w15:restartNumberingAfterBreak="0">
     <w:nsid w:val="351A58D3"/>
     <w:multiLevelType w:val="multilevel"/>
     <w:tmpl w:val="DDA83992"/>
@@ -18984,7 +19360,7 @@
       </w:rPr>
     </w:lvl>
   </w:abstractNum>
-  <w:abstractNum w:abstractNumId="41" w15:restartNumberingAfterBreak="0">
+  <w:abstractNum w:abstractNumId="42" w15:restartNumberingAfterBreak="0">
     <w:nsid w:val="3780706F"/>
     <w:multiLevelType w:val="multilevel"/>
     <w:tmpl w:val="381CDEA8"/>
@@ -19133,7 +19509,7 @@
       </w:rPr>
     </w:lvl>
   </w:abstractNum>
-  <w:abstractNum w:abstractNumId="42" w15:restartNumberingAfterBreak="0">
+  <w:abstractNum w:abstractNumId="43" w15:restartNumberingAfterBreak="0">
     <w:nsid w:val="38F414DA"/>
     <w:multiLevelType w:val="multilevel"/>
     <w:tmpl w:val="2DEAE2BC"/>
@@ -19282,7 +19658,7 @@
       </w:rPr>
     </w:lvl>
   </w:abstractNum>
-  <w:abstractNum w:abstractNumId="43" w15:restartNumberingAfterBreak="0">
+  <w:abstractNum w:abstractNumId="44" w15:restartNumberingAfterBreak="0">
     <w:nsid w:val="392457FE"/>
     <w:multiLevelType w:val="multilevel"/>
     <w:tmpl w:val="DB469F6C"/>
@@ -19431,7 +19807,7 @@
       </w:rPr>
     </w:lvl>
   </w:abstractNum>
-  <w:abstractNum w:abstractNumId="44" w15:restartNumberingAfterBreak="0">
+  <w:abstractNum w:abstractNumId="45" w15:restartNumberingAfterBreak="0">
     <w:nsid w:val="3A923EFF"/>
     <w:multiLevelType w:val="multilevel"/>
     <w:tmpl w:val="F4004242"/>
@@ -19580,7 +19956,7 @@
       </w:rPr>
     </w:lvl>
   </w:abstractNum>
-  <w:abstractNum w:abstractNumId="45" w15:restartNumberingAfterBreak="0">
+  <w:abstractNum w:abstractNumId="46" w15:restartNumberingAfterBreak="0">
     <w:nsid w:val="40460948"/>
     <w:multiLevelType w:val="multilevel"/>
     <w:tmpl w:val="62C49374"/>
@@ -19729,7 +20105,7 @@
       </w:rPr>
     </w:lvl>
   </w:abstractNum>
-  <w:abstractNum w:abstractNumId="46" w15:restartNumberingAfterBreak="0">
+  <w:abstractNum w:abstractNumId="47" w15:restartNumberingAfterBreak="0">
     <w:nsid w:val="413E1D27"/>
     <w:multiLevelType w:val="hybridMultilevel"/>
     <w:tmpl w:val="4F060846"/>
@@ -19842,7 +20218,7 @@
       </w:rPr>
     </w:lvl>
   </w:abstractNum>
-  <w:abstractNum w:abstractNumId="47" w15:restartNumberingAfterBreak="0">
+  <w:abstractNum w:abstractNumId="48" w15:restartNumberingAfterBreak="0">
     <w:nsid w:val="421C74CE"/>
     <w:multiLevelType w:val="multilevel"/>
     <w:tmpl w:val="A6045D7E"/>
@@ -19991,7 +20367,7 @@
       </w:rPr>
     </w:lvl>
   </w:abstractNum>
-  <w:abstractNum w:abstractNumId="48" w15:restartNumberingAfterBreak="0">
+  <w:abstractNum w:abstractNumId="49" w15:restartNumberingAfterBreak="0">
     <w:nsid w:val="42696F10"/>
     <w:multiLevelType w:val="multilevel"/>
     <w:tmpl w:val="27506A40"/>
@@ -20140,7 +20516,7 @@
       </w:rPr>
     </w:lvl>
   </w:abstractNum>
-  <w:abstractNum w:abstractNumId="49" w15:restartNumberingAfterBreak="0">
+  <w:abstractNum w:abstractNumId="50" w15:restartNumberingAfterBreak="0">
     <w:nsid w:val="42AB5966"/>
     <w:multiLevelType w:val="multilevel"/>
     <w:tmpl w:val="CE088554"/>
@@ -20289,7 +20665,7 @@
       </w:rPr>
     </w:lvl>
   </w:abstractNum>
-  <w:abstractNum w:abstractNumId="50" w15:restartNumberingAfterBreak="0">
+  <w:abstractNum w:abstractNumId="51" w15:restartNumberingAfterBreak="0">
     <w:nsid w:val="4529096C"/>
     <w:multiLevelType w:val="hybridMultilevel"/>
     <w:tmpl w:val="FFF85C74"/>
@@ -20401,7 +20777,7 @@
       </w:rPr>
     </w:lvl>
   </w:abstractNum>
-  <w:abstractNum w:abstractNumId="51" w15:restartNumberingAfterBreak="0">
+  <w:abstractNum w:abstractNumId="52" w15:restartNumberingAfterBreak="0">
     <w:nsid w:val="46236874"/>
     <w:multiLevelType w:val="hybridMultilevel"/>
     <w:tmpl w:val="CF56BA42"/>
@@ -20514,7 +20890,7 @@
       </w:rPr>
     </w:lvl>
   </w:abstractNum>
-  <w:abstractNum w:abstractNumId="52" w15:restartNumberingAfterBreak="0">
+  <w:abstractNum w:abstractNumId="53" w15:restartNumberingAfterBreak="0">
     <w:nsid w:val="470C52B7"/>
     <w:multiLevelType w:val="multilevel"/>
     <w:tmpl w:val="DDBACCE6"/>
@@ -20663,7 +21039,7 @@
       </w:rPr>
     </w:lvl>
   </w:abstractNum>
-  <w:abstractNum w:abstractNumId="53" w15:restartNumberingAfterBreak="0">
+  <w:abstractNum w:abstractNumId="54" w15:restartNumberingAfterBreak="0">
     <w:nsid w:val="471B09B3"/>
     <w:multiLevelType w:val="multilevel"/>
     <w:tmpl w:val="A1B2CB16"/>
@@ -20812,7 +21188,7 @@
       </w:rPr>
     </w:lvl>
   </w:abstractNum>
-  <w:abstractNum w:abstractNumId="54" w15:restartNumberingAfterBreak="0">
+  <w:abstractNum w:abstractNumId="55" w15:restartNumberingAfterBreak="0">
     <w:nsid w:val="486B038C"/>
     <w:multiLevelType w:val="hybridMultilevel"/>
     <w:tmpl w:val="8C4A79DA"/>
@@ -20925,7 +21301,7 @@
       </w:rPr>
     </w:lvl>
   </w:abstractNum>
-  <w:abstractNum w:abstractNumId="55" w15:restartNumberingAfterBreak="0">
+  <w:abstractNum w:abstractNumId="56" w15:restartNumberingAfterBreak="0">
     <w:nsid w:val="4888582A"/>
     <w:multiLevelType w:val="multilevel"/>
     <w:tmpl w:val="2A22B8AA"/>
@@ -21074,7 +21450,7 @@
       </w:rPr>
     </w:lvl>
   </w:abstractNum>
-  <w:abstractNum w:abstractNumId="56" w15:restartNumberingAfterBreak="0">
+  <w:abstractNum w:abstractNumId="57" w15:restartNumberingAfterBreak="0">
     <w:nsid w:val="48E0701C"/>
     <w:multiLevelType w:val="multilevel"/>
     <w:tmpl w:val="4FB6510C"/>
@@ -21223,7 +21599,7 @@
       </w:rPr>
     </w:lvl>
   </w:abstractNum>
-  <w:abstractNum w:abstractNumId="57" w15:restartNumberingAfterBreak="0">
+  <w:abstractNum w:abstractNumId="58" w15:restartNumberingAfterBreak="0">
     <w:nsid w:val="4A8D35E4"/>
     <w:multiLevelType w:val="hybridMultilevel"/>
     <w:tmpl w:val="35A2089C"/>
@@ -21336,7 +21712,7 @@
       </w:rPr>
     </w:lvl>
   </w:abstractNum>
-  <w:abstractNum w:abstractNumId="58" w15:restartNumberingAfterBreak="0">
+  <w:abstractNum w:abstractNumId="59" w15:restartNumberingAfterBreak="0">
     <w:nsid w:val="4B8865D9"/>
     <w:multiLevelType w:val="multilevel"/>
     <w:tmpl w:val="238E69C6"/>
@@ -21485,7 +21861,7 @@
       </w:rPr>
     </w:lvl>
   </w:abstractNum>
-  <w:abstractNum w:abstractNumId="59" w15:restartNumberingAfterBreak="0">
+  <w:abstractNum w:abstractNumId="60" w15:restartNumberingAfterBreak="0">
     <w:nsid w:val="4D161459"/>
     <w:multiLevelType w:val="multilevel"/>
     <w:tmpl w:val="C10436FE"/>
@@ -21634,7 +22010,7 @@
       </w:rPr>
     </w:lvl>
   </w:abstractNum>
-  <w:abstractNum w:abstractNumId="60" w15:restartNumberingAfterBreak="0">
+  <w:abstractNum w:abstractNumId="61" w15:restartNumberingAfterBreak="0">
     <w:nsid w:val="4DA44DE1"/>
     <w:multiLevelType w:val="multilevel"/>
     <w:tmpl w:val="EA649872"/>
@@ -21783,7 +22159,7 @@
       </w:rPr>
     </w:lvl>
   </w:abstractNum>
-  <w:abstractNum w:abstractNumId="61" w15:restartNumberingAfterBreak="0">
+  <w:abstractNum w:abstractNumId="62" w15:restartNumberingAfterBreak="0">
     <w:nsid w:val="507F6DDB"/>
     <w:multiLevelType w:val="multilevel"/>
     <w:tmpl w:val="644671D8"/>
@@ -21932,7 +22308,7 @@
       </w:rPr>
     </w:lvl>
   </w:abstractNum>
-  <w:abstractNum w:abstractNumId="62" w15:restartNumberingAfterBreak="0">
+  <w:abstractNum w:abstractNumId="63" w15:restartNumberingAfterBreak="0">
     <w:nsid w:val="5232184E"/>
     <w:multiLevelType w:val="multilevel"/>
     <w:tmpl w:val="16B80DA4"/>
@@ -22081,7 +22457,7 @@
       </w:rPr>
     </w:lvl>
   </w:abstractNum>
-  <w:abstractNum w:abstractNumId="63" w15:restartNumberingAfterBreak="0">
+  <w:abstractNum w:abstractNumId="64" w15:restartNumberingAfterBreak="0">
     <w:nsid w:val="53C03E13"/>
     <w:multiLevelType w:val="hybridMultilevel"/>
     <w:tmpl w:val="83FCBC06"/>
@@ -22194,7 +22570,7 @@
       </w:rPr>
     </w:lvl>
   </w:abstractNum>
-  <w:abstractNum w:abstractNumId="64" w15:restartNumberingAfterBreak="0">
+  <w:abstractNum w:abstractNumId="65" w15:restartNumberingAfterBreak="0">
     <w:nsid w:val="5A897983"/>
     <w:multiLevelType w:val="multilevel"/>
     <w:tmpl w:val="F05C9280"/>
@@ -22343,7 +22719,7 @@
       </w:rPr>
     </w:lvl>
   </w:abstractNum>
-  <w:abstractNum w:abstractNumId="65" w15:restartNumberingAfterBreak="0">
+  <w:abstractNum w:abstractNumId="66" w15:restartNumberingAfterBreak="0">
     <w:nsid w:val="5DD73975"/>
     <w:multiLevelType w:val="hybridMultilevel"/>
     <w:tmpl w:val="F3C8F606"/>
@@ -22456,7 +22832,7 @@
       </w:rPr>
     </w:lvl>
   </w:abstractNum>
-  <w:abstractNum w:abstractNumId="66" w15:restartNumberingAfterBreak="0">
+  <w:abstractNum w:abstractNumId="67" w15:restartNumberingAfterBreak="0">
     <w:nsid w:val="5F5C0D48"/>
     <w:multiLevelType w:val="hybridMultilevel"/>
     <w:tmpl w:val="57C8007E"/>
@@ -22569,7 +22945,7 @@
       </w:rPr>
     </w:lvl>
   </w:abstractNum>
-  <w:abstractNum w:abstractNumId="67" w15:restartNumberingAfterBreak="0">
+  <w:abstractNum w:abstractNumId="68" w15:restartNumberingAfterBreak="0">
     <w:nsid w:val="628566FA"/>
     <w:multiLevelType w:val="multilevel"/>
     <w:tmpl w:val="C576D23C"/>
@@ -22718,7 +23094,7 @@
       </w:rPr>
     </w:lvl>
   </w:abstractNum>
-  <w:abstractNum w:abstractNumId="68" w15:restartNumberingAfterBreak="0">
+  <w:abstractNum w:abstractNumId="69" w15:restartNumberingAfterBreak="0">
     <w:nsid w:val="628F4BF2"/>
     <w:multiLevelType w:val="multilevel"/>
     <w:tmpl w:val="A680F95C"/>
@@ -22867,7 +23243,7 @@
       </w:rPr>
     </w:lvl>
   </w:abstractNum>
-  <w:abstractNum w:abstractNumId="69" w15:restartNumberingAfterBreak="0">
+  <w:abstractNum w:abstractNumId="70" w15:restartNumberingAfterBreak="0">
     <w:nsid w:val="65C91593"/>
     <w:multiLevelType w:val="multilevel"/>
     <w:tmpl w:val="B8C27B96"/>
@@ -23016,7 +23392,7 @@
       </w:rPr>
     </w:lvl>
   </w:abstractNum>
-  <w:abstractNum w:abstractNumId="70" w15:restartNumberingAfterBreak="0">
+  <w:abstractNum w:abstractNumId="71" w15:restartNumberingAfterBreak="0">
     <w:nsid w:val="667B593B"/>
     <w:multiLevelType w:val="multilevel"/>
     <w:tmpl w:val="CE58BC76"/>
@@ -23165,7 +23541,7 @@
       </w:rPr>
     </w:lvl>
   </w:abstractNum>
-  <w:abstractNum w:abstractNumId="71" w15:restartNumberingAfterBreak="0">
+  <w:abstractNum w:abstractNumId="72" w15:restartNumberingAfterBreak="0">
     <w:nsid w:val="69F3676B"/>
     <w:multiLevelType w:val="multilevel"/>
     <w:tmpl w:val="6F324960"/>
@@ -23314,7 +23690,7 @@
       </w:rPr>
     </w:lvl>
   </w:abstractNum>
-  <w:abstractNum w:abstractNumId="72" w15:restartNumberingAfterBreak="0">
+  <w:abstractNum w:abstractNumId="73" w15:restartNumberingAfterBreak="0">
     <w:nsid w:val="6EBE3AC0"/>
     <w:multiLevelType w:val="multilevel"/>
     <w:tmpl w:val="1FFA36AC"/>
@@ -23463,7 +23839,7 @@
       </w:rPr>
     </w:lvl>
   </w:abstractNum>
-  <w:abstractNum w:abstractNumId="73" w15:restartNumberingAfterBreak="0">
+  <w:abstractNum w:abstractNumId="74" w15:restartNumberingAfterBreak="0">
     <w:nsid w:val="6EFD3537"/>
     <w:multiLevelType w:val="multilevel"/>
     <w:tmpl w:val="97C84188"/>
@@ -23612,7 +23988,7 @@
       </w:rPr>
     </w:lvl>
   </w:abstractNum>
-  <w:abstractNum w:abstractNumId="74" w15:restartNumberingAfterBreak="0">
+  <w:abstractNum w:abstractNumId="75" w15:restartNumberingAfterBreak="0">
     <w:nsid w:val="6F322895"/>
     <w:multiLevelType w:val="hybridMultilevel"/>
     <w:tmpl w:val="0E2649FC"/>
@@ -23725,7 +24101,7 @@
       </w:rPr>
     </w:lvl>
   </w:abstractNum>
-  <w:abstractNum w:abstractNumId="75" w15:restartNumberingAfterBreak="0">
+  <w:abstractNum w:abstractNumId="76" w15:restartNumberingAfterBreak="0">
     <w:nsid w:val="6F4737A3"/>
     <w:multiLevelType w:val="multilevel"/>
     <w:tmpl w:val="6EC638F4"/>
@@ -23874,7 +24250,7 @@
       </w:rPr>
     </w:lvl>
   </w:abstractNum>
-  <w:abstractNum w:abstractNumId="76" w15:restartNumberingAfterBreak="0">
+  <w:abstractNum w:abstractNumId="77" w15:restartNumberingAfterBreak="0">
     <w:nsid w:val="71B866B8"/>
     <w:multiLevelType w:val="multilevel"/>
     <w:tmpl w:val="D6A61A68"/>
@@ -24023,7 +24399,7 @@
       </w:rPr>
     </w:lvl>
   </w:abstractNum>
-  <w:abstractNum w:abstractNumId="77" w15:restartNumberingAfterBreak="0">
+  <w:abstractNum w:abstractNumId="78" w15:restartNumberingAfterBreak="0">
     <w:nsid w:val="71FE7096"/>
     <w:multiLevelType w:val="multilevel"/>
     <w:tmpl w:val="DB9A52BE"/>
@@ -24172,7 +24548,7 @@
       </w:rPr>
     </w:lvl>
   </w:abstractNum>
-  <w:abstractNum w:abstractNumId="78" w15:restartNumberingAfterBreak="0">
+  <w:abstractNum w:abstractNumId="79" w15:restartNumberingAfterBreak="0">
     <w:nsid w:val="72601284"/>
     <w:multiLevelType w:val="hybridMultilevel"/>
     <w:tmpl w:val="19AC3094"/>
@@ -24285,7 +24661,7 @@
       </w:rPr>
     </w:lvl>
   </w:abstractNum>
-  <w:abstractNum w:abstractNumId="79" w15:restartNumberingAfterBreak="0">
+  <w:abstractNum w:abstractNumId="80" w15:restartNumberingAfterBreak="0">
     <w:nsid w:val="74D4408F"/>
     <w:multiLevelType w:val="multilevel"/>
     <w:tmpl w:val="C854DE4A"/>
@@ -24434,7 +24810,7 @@
       </w:rPr>
     </w:lvl>
   </w:abstractNum>
-  <w:abstractNum w:abstractNumId="80" w15:restartNumberingAfterBreak="0">
+  <w:abstractNum w:abstractNumId="81" w15:restartNumberingAfterBreak="0">
     <w:nsid w:val="75854F38"/>
     <w:multiLevelType w:val="multilevel"/>
     <w:tmpl w:val="D5CED040"/>
@@ -24583,7 +24959,7 @@
       </w:rPr>
     </w:lvl>
   </w:abstractNum>
-  <w:abstractNum w:abstractNumId="81" w15:restartNumberingAfterBreak="0">
+  <w:abstractNum w:abstractNumId="82" w15:restartNumberingAfterBreak="0">
     <w:nsid w:val="758D06DE"/>
     <w:multiLevelType w:val="multilevel"/>
     <w:tmpl w:val="E59ACD4A"/>
@@ -24732,7 +25108,7 @@
       </w:rPr>
     </w:lvl>
   </w:abstractNum>
-  <w:abstractNum w:abstractNumId="82" w15:restartNumberingAfterBreak="0">
+  <w:abstractNum w:abstractNumId="83" w15:restartNumberingAfterBreak="0">
     <w:nsid w:val="761A133C"/>
     <w:multiLevelType w:val="multilevel"/>
     <w:tmpl w:val="0F382862"/>
@@ -24881,7 +25257,7 @@
       </w:rPr>
     </w:lvl>
   </w:abstractNum>
-  <w:abstractNum w:abstractNumId="83" w15:restartNumberingAfterBreak="0">
+  <w:abstractNum w:abstractNumId="84" w15:restartNumberingAfterBreak="0">
     <w:nsid w:val="76A27D4F"/>
     <w:multiLevelType w:val="multilevel"/>
     <w:tmpl w:val="1D745170"/>
@@ -25030,7 +25406,7 @@
       </w:rPr>
     </w:lvl>
   </w:abstractNum>
-  <w:abstractNum w:abstractNumId="84" w15:restartNumberingAfterBreak="0">
+  <w:abstractNum w:abstractNumId="85" w15:restartNumberingAfterBreak="0">
     <w:nsid w:val="796D1793"/>
     <w:multiLevelType w:val="hybridMultilevel"/>
     <w:tmpl w:val="2938CC24"/>
@@ -25143,7 +25519,7 @@
       </w:rPr>
     </w:lvl>
   </w:abstractNum>
-  <w:abstractNum w:abstractNumId="85" w15:restartNumberingAfterBreak="0">
+  <w:abstractNum w:abstractNumId="86" w15:restartNumberingAfterBreak="0">
     <w:nsid w:val="7A0A2BF8"/>
     <w:multiLevelType w:val="multilevel"/>
     <w:tmpl w:val="139229D4"/>
@@ -25292,7 +25668,7 @@
       </w:rPr>
     </w:lvl>
   </w:abstractNum>
-  <w:abstractNum w:abstractNumId="86" w15:restartNumberingAfterBreak="0">
+  <w:abstractNum w:abstractNumId="87" w15:restartNumberingAfterBreak="0">
     <w:nsid w:val="7A251DB5"/>
     <w:multiLevelType w:val="multilevel"/>
     <w:tmpl w:val="A60243AE"/>
@@ -25441,7 +25817,7 @@
       </w:rPr>
     </w:lvl>
   </w:abstractNum>
-  <w:abstractNum w:abstractNumId="87" w15:restartNumberingAfterBreak="0">
+  <w:abstractNum w:abstractNumId="88" w15:restartNumberingAfterBreak="0">
     <w:nsid w:val="7A2B27BF"/>
     <w:multiLevelType w:val="hybridMultilevel"/>
     <w:tmpl w:val="1B6C6C7E"/>
@@ -25554,7 +25930,7 @@
       </w:rPr>
     </w:lvl>
   </w:abstractNum>
-  <w:abstractNum w:abstractNumId="88" w15:restartNumberingAfterBreak="0">
+  <w:abstractNum w:abstractNumId="89" w15:restartNumberingAfterBreak="0">
     <w:nsid w:val="7C6F0D89"/>
     <w:multiLevelType w:val="multilevel"/>
     <w:tmpl w:val="F3E8C6DA"/>
@@ -25703,7 +26079,7 @@
       </w:rPr>
     </w:lvl>
   </w:abstractNum>
-  <w:abstractNum w:abstractNumId="89" w15:restartNumberingAfterBreak="0">
+  <w:abstractNum w:abstractNumId="90" w15:restartNumberingAfterBreak="0">
     <w:nsid w:val="7CC447D5"/>
     <w:multiLevelType w:val="multilevel"/>
     <w:tmpl w:val="F53EFE4C"/>
@@ -25852,7 +26228,7 @@
       </w:rPr>
     </w:lvl>
   </w:abstractNum>
-  <w:abstractNum w:abstractNumId="90" w15:restartNumberingAfterBreak="0">
+  <w:abstractNum w:abstractNumId="91" w15:restartNumberingAfterBreak="0">
     <w:nsid w:val="7DB559E2"/>
     <w:multiLevelType w:val="hybridMultilevel"/>
     <w:tmpl w:val="7780024C"/>
@@ -25965,7 +26341,7 @@
       </w:rPr>
     </w:lvl>
   </w:abstractNum>
-  <w:abstractNum w:abstractNumId="91" w15:restartNumberingAfterBreak="0">
+  <w:abstractNum w:abstractNumId="92" w15:restartNumberingAfterBreak="0">
     <w:nsid w:val="7E1B2E64"/>
     <w:multiLevelType w:val="hybridMultilevel"/>
     <w:tmpl w:val="E276480E"/>
@@ -26078,7 +26454,7 @@
       </w:rPr>
     </w:lvl>
   </w:abstractNum>
-  <w:abstractNum w:abstractNumId="92" w15:restartNumberingAfterBreak="0">
+  <w:abstractNum w:abstractNumId="93" w15:restartNumberingAfterBreak="0">
     <w:nsid w:val="7F007273"/>
     <w:multiLevelType w:val="multilevel"/>
     <w:tmpl w:val="F4D2AA58"/>
@@ -26228,7 +26604,7 @@
     </w:lvl>
   </w:abstractNum>
   <w:num w:numId="1" w16cid:durableId="448354519">
-    <w:abstractNumId w:val="45"/>
+    <w:abstractNumId w:val="46"/>
   </w:num>
   <w:num w:numId="2" w16cid:durableId="267277991">
     <w:abstractNumId w:val="4"/>
@@ -26237,34 +26613,34 @@
     <w:abstractNumId w:val="13"/>
   </w:num>
   <w:num w:numId="4" w16cid:durableId="1373382629">
-    <w:abstractNumId w:val="82"/>
+    <w:abstractNumId w:val="83"/>
   </w:num>
   <w:num w:numId="5" w16cid:durableId="1915696360">
-    <w:abstractNumId w:val="55"/>
+    <w:abstractNumId w:val="56"/>
   </w:num>
   <w:num w:numId="6" w16cid:durableId="44070181">
     <w:abstractNumId w:val="23"/>
   </w:num>
   <w:num w:numId="7" w16cid:durableId="493452589">
-    <w:abstractNumId w:val="89"/>
+    <w:abstractNumId w:val="90"/>
   </w:num>
   <w:num w:numId="8" w16cid:durableId="925652620">
-    <w:abstractNumId w:val="73"/>
+    <w:abstractNumId w:val="74"/>
   </w:num>
   <w:num w:numId="9" w16cid:durableId="2105029407">
-    <w:abstractNumId w:val="86"/>
+    <w:abstractNumId w:val="87"/>
   </w:num>
   <w:num w:numId="10" w16cid:durableId="1322386189">
-    <w:abstractNumId w:val="64"/>
+    <w:abstractNumId w:val="65"/>
   </w:num>
   <w:num w:numId="11" w16cid:durableId="1145046778">
-    <w:abstractNumId w:val="41"/>
+    <w:abstractNumId w:val="42"/>
   </w:num>
   <w:num w:numId="12" w16cid:durableId="886575476">
-    <w:abstractNumId w:val="75"/>
+    <w:abstractNumId w:val="76"/>
   </w:num>
   <w:num w:numId="13" w16cid:durableId="434445510">
-    <w:abstractNumId w:val="58"/>
+    <w:abstractNumId w:val="59"/>
   </w:num>
   <w:num w:numId="14" w16cid:durableId="1548566209">
     <w:abstractNumId w:val="26"/>
@@ -26273,7 +26649,7 @@
     <w:abstractNumId w:val="8"/>
   </w:num>
   <w:num w:numId="16" w16cid:durableId="1081374075">
-    <w:abstractNumId w:val="46"/>
+    <w:abstractNumId w:val="47"/>
   </w:num>
   <w:num w:numId="17" w16cid:durableId="1595045529">
     <w:abstractNumId w:val="15"/>
@@ -26282,61 +26658,61 @@
     <w:abstractNumId w:val="17"/>
   </w:num>
   <w:num w:numId="19" w16cid:durableId="113258773">
-    <w:abstractNumId w:val="52"/>
+    <w:abstractNumId w:val="53"/>
   </w:num>
   <w:num w:numId="20" w16cid:durableId="965312005">
-    <w:abstractNumId w:val="54"/>
+    <w:abstractNumId w:val="55"/>
   </w:num>
   <w:num w:numId="21" w16cid:durableId="343359711">
-    <w:abstractNumId w:val="91"/>
+    <w:abstractNumId w:val="92"/>
   </w:num>
   <w:num w:numId="22" w16cid:durableId="547838144">
-    <w:abstractNumId w:val="84"/>
+    <w:abstractNumId w:val="85"/>
   </w:num>
   <w:num w:numId="23" w16cid:durableId="1031033420">
-    <w:abstractNumId w:val="71"/>
+    <w:abstractNumId w:val="72"/>
   </w:num>
   <w:num w:numId="24" w16cid:durableId="519204185">
-    <w:abstractNumId w:val="34"/>
+    <w:abstractNumId w:val="35"/>
   </w:num>
   <w:num w:numId="25" w16cid:durableId="1706559306">
-    <w:abstractNumId w:val="60"/>
+    <w:abstractNumId w:val="61"/>
   </w:num>
   <w:num w:numId="26" w16cid:durableId="1050305727">
-    <w:abstractNumId w:val="43"/>
+    <w:abstractNumId w:val="44"/>
   </w:num>
   <w:num w:numId="27" w16cid:durableId="1439444620">
-    <w:abstractNumId w:val="53"/>
+    <w:abstractNumId w:val="54"/>
   </w:num>
   <w:num w:numId="28" w16cid:durableId="1831407804">
     <w:abstractNumId w:val="10"/>
   </w:num>
   <w:num w:numId="29" w16cid:durableId="1777367443">
-    <w:abstractNumId w:val="36"/>
+    <w:abstractNumId w:val="37"/>
   </w:num>
   <w:num w:numId="30" w16cid:durableId="479158040">
-    <w:abstractNumId w:val="79"/>
+    <w:abstractNumId w:val="80"/>
   </w:num>
   <w:num w:numId="31" w16cid:durableId="2026666882">
-    <w:abstractNumId w:val="72"/>
+    <w:abstractNumId w:val="73"/>
   </w:num>
   <w:num w:numId="32" w16cid:durableId="1640843127">
-    <w:abstractNumId w:val="80"/>
+    <w:abstractNumId w:val="81"/>
   </w:num>
   <w:num w:numId="33" w16cid:durableId="83958067">
-    <w:abstractNumId w:val="40"/>
+    <w:abstractNumId w:val="41"/>
   </w:num>
   <w:num w:numId="34" w16cid:durableId="1831871160">
-    <w:abstractNumId w:val="77"/>
+    <w:abstractNumId w:val="78"/>
   </w:num>
   <w:num w:numId="35" w16cid:durableId="727649376">
-    <w:abstractNumId w:val="38"/>
+    <w:abstractNumId w:val="39"/>
   </w:num>
   <w:num w:numId="36" w16cid:durableId="804392417">
     <w:abstractNumId w:val="29"/>
   </w:num>
   <w:num w:numId="37" w16cid:durableId="2016688023">
-    <w:abstractNumId w:val="57"/>
+    <w:abstractNumId w:val="58"/>
   </w:num>
   <w:num w:numId="38" w16cid:durableId="174225593">
     <w:abstractNumId w:val="32"/>
@@ -26354,31 +26730,31 @@
     <w:abstractNumId w:val="12"/>
   </w:num>
   <w:num w:numId="43" w16cid:durableId="1671104138">
-    <w:abstractNumId w:val="42"/>
+    <w:abstractNumId w:val="43"/>
   </w:num>
   <w:num w:numId="44" w16cid:durableId="991250543">
     <w:abstractNumId w:val="19"/>
   </w:num>
   <w:num w:numId="45" w16cid:durableId="57870292">
-    <w:abstractNumId w:val="59"/>
+    <w:abstractNumId w:val="60"/>
   </w:num>
   <w:num w:numId="46" w16cid:durableId="1132557770">
-    <w:abstractNumId w:val="92"/>
+    <w:abstractNumId w:val="93"/>
   </w:num>
   <w:num w:numId="47" w16cid:durableId="536357828">
-    <w:abstractNumId w:val="47"/>
+    <w:abstractNumId w:val="48"/>
   </w:num>
   <w:num w:numId="48" w16cid:durableId="604652666">
-    <w:abstractNumId w:val="39"/>
+    <w:abstractNumId w:val="40"/>
   </w:num>
   <w:num w:numId="49" w16cid:durableId="1565608183">
-    <w:abstractNumId w:val="65"/>
+    <w:abstractNumId w:val="66"/>
   </w:num>
   <w:num w:numId="50" w16cid:durableId="1160925032">
     <w:abstractNumId w:val="22"/>
   </w:num>
   <w:num w:numId="51" w16cid:durableId="1074083402">
-    <w:abstractNumId w:val="49"/>
+    <w:abstractNumId w:val="50"/>
   </w:num>
   <w:num w:numId="52" w16cid:durableId="505705463">
     <w:abstractNumId w:val="31"/>
@@ -26387,10 +26763,10 @@
     <w:abstractNumId w:val="9"/>
   </w:num>
   <w:num w:numId="54" w16cid:durableId="1059288088">
-    <w:abstractNumId w:val="48"/>
+    <w:abstractNumId w:val="49"/>
   </w:num>
   <w:num w:numId="55" w16cid:durableId="1800486562">
-    <w:abstractNumId w:val="33"/>
+    <w:abstractNumId w:val="34"/>
   </w:num>
   <w:num w:numId="56" w16cid:durableId="145174008">
     <w:abstractNumId w:val="21"/>
@@ -26399,25 +26775,25 @@
     <w:abstractNumId w:val="27"/>
   </w:num>
   <w:num w:numId="58" w16cid:durableId="1153330480">
-    <w:abstractNumId w:val="56"/>
+    <w:abstractNumId w:val="57"/>
   </w:num>
   <w:num w:numId="59" w16cid:durableId="1571041670">
     <w:abstractNumId w:val="14"/>
   </w:num>
   <w:num w:numId="60" w16cid:durableId="1139416074">
-    <w:abstractNumId w:val="37"/>
+    <w:abstractNumId w:val="38"/>
   </w:num>
   <w:num w:numId="61" w16cid:durableId="95058015">
-    <w:abstractNumId w:val="88"/>
+    <w:abstractNumId w:val="89"/>
   </w:num>
   <w:num w:numId="62" w16cid:durableId="326058897">
     <w:abstractNumId w:val="2"/>
   </w:num>
   <w:num w:numId="63" w16cid:durableId="1822691731">
-    <w:abstractNumId w:val="61"/>
+    <w:abstractNumId w:val="62"/>
   </w:num>
   <w:num w:numId="64" w16cid:durableId="491482094">
-    <w:abstractNumId w:val="44"/>
+    <w:abstractNumId w:val="45"/>
   </w:num>
   <w:num w:numId="65" w16cid:durableId="624000986">
     <w:abstractNumId w:val="1"/>
@@ -26432,34 +26808,34 @@
     <w:abstractNumId w:val="0"/>
   </w:num>
   <w:num w:numId="69" w16cid:durableId="842819424">
-    <w:abstractNumId w:val="76"/>
+    <w:abstractNumId w:val="77"/>
   </w:num>
   <w:num w:numId="70" w16cid:durableId="2118792854">
-    <w:abstractNumId w:val="67"/>
+    <w:abstractNumId w:val="68"/>
   </w:num>
   <w:num w:numId="71" w16cid:durableId="1506017899">
-    <w:abstractNumId w:val="83"/>
+    <w:abstractNumId w:val="84"/>
   </w:num>
   <w:num w:numId="72" w16cid:durableId="1922787855">
-    <w:abstractNumId w:val="68"/>
+    <w:abstractNumId w:val="69"/>
   </w:num>
   <w:num w:numId="73" w16cid:durableId="240912039">
     <w:abstractNumId w:val="11"/>
   </w:num>
   <w:num w:numId="74" w16cid:durableId="2005474240">
-    <w:abstractNumId w:val="50"/>
+    <w:abstractNumId w:val="51"/>
   </w:num>
   <w:num w:numId="75" w16cid:durableId="297106655">
-    <w:abstractNumId w:val="51"/>
+    <w:abstractNumId w:val="52"/>
   </w:num>
   <w:num w:numId="76" w16cid:durableId="1263805218">
-    <w:abstractNumId w:val="70"/>
+    <w:abstractNumId w:val="71"/>
   </w:num>
   <w:num w:numId="77" w16cid:durableId="336930133">
-    <w:abstractNumId w:val="85"/>
+    <w:abstractNumId w:val="86"/>
   </w:num>
   <w:num w:numId="78" w16cid:durableId="1358193180">
-    <w:abstractNumId w:val="69"/>
+    <w:abstractNumId w:val="70"/>
   </w:num>
   <w:num w:numId="79" w16cid:durableId="611593919">
     <w:abstractNumId w:val="18"/>
@@ -26468,25 +26844,25 @@
     <w:abstractNumId w:val="6"/>
   </w:num>
   <w:num w:numId="81" w16cid:durableId="1669598111">
-    <w:abstractNumId w:val="62"/>
+    <w:abstractNumId w:val="63"/>
   </w:num>
   <w:num w:numId="82" w16cid:durableId="729501046">
-    <w:abstractNumId w:val="90"/>
+    <w:abstractNumId w:val="91"/>
   </w:num>
   <w:num w:numId="83" w16cid:durableId="1432243327">
-    <w:abstractNumId w:val="74"/>
+    <w:abstractNumId w:val="75"/>
   </w:num>
   <w:num w:numId="84" w16cid:durableId="1673410959">
-    <w:abstractNumId w:val="63"/>
+    <w:abstractNumId w:val="64"/>
   </w:num>
   <w:num w:numId="85" w16cid:durableId="946810640">
-    <w:abstractNumId w:val="35"/>
+    <w:abstractNumId w:val="36"/>
   </w:num>
   <w:num w:numId="86" w16cid:durableId="1698191965">
-    <w:abstractNumId w:val="78"/>
+    <w:abstractNumId w:val="79"/>
   </w:num>
   <w:num w:numId="87" w16cid:durableId="1235510775">
-    <w:abstractNumId w:val="87"/>
+    <w:abstractNumId w:val="88"/>
   </w:num>
   <w:num w:numId="88" w16cid:durableId="653341763">
     <w:abstractNumId w:val="16"/>
@@ -26498,13 +26874,16 @@
     <w:abstractNumId w:val="5"/>
   </w:num>
   <w:num w:numId="91" w16cid:durableId="820850216">
-    <w:abstractNumId w:val="81"/>
+    <w:abstractNumId w:val="82"/>
   </w:num>
   <w:num w:numId="92" w16cid:durableId="689570362">
     <w:abstractNumId w:val="7"/>
   </w:num>
   <w:num w:numId="93" w16cid:durableId="1318530843">
-    <w:abstractNumId w:val="66"/>
+    <w:abstractNumId w:val="67"/>
+  </w:num>
+  <w:num w:numId="94" w16cid:durableId="912815289">
+    <w:abstractNumId w:val="33"/>
   </w:num>
   <w:numIdMacAtCleanup w:val="82"/>
 </w:numbering>

</xml_diff>